<commit_message>
La empresa pasa a llamarse Burglar King (antes La Plancha)
Memoria, Reto 1 (fuentes + docx/pdf/pptx/html regenerados), figura de red y
comentarios/semillas SQL. La estación de cocina sigue llamándose «plancha»
(es la clave de la estación, no la marca). Migración 28: correo de facturas,
solo si sigue con el valor de fábrica.

Co-Authored-By: Claude Sonnet 5.5 <noreply@anthropic.com>
</commit_message>
<xml_diff>
--- a/docs/reto1/reto1_contexto_tecnologico.docx
+++ b/docs/reto1/reto1_contexto_tecnologico.docx
@@ -27,7 +27,7 @@
           <w:sz w:val="32"/>
           <w:szCs w:val="32"/>
         </w:rPr>
-        <w:t>Análisis del contexto tecnológico de La Plancha</w:t>
+        <w:t>Análisis del contexto tecnológico de Burglar King</w:t>
       </w:r>
     </w:p>
     <w:p>
@@ -170,7 +170,7 @@
         <w:pStyle w:val="Heading1"/>
         <w:rPr/>
       </w:pPr>
-      <w:bookmarkStart w:id="0" w:name="__RefHeading___Toc1589_3898207833"/>
+      <w:bookmarkStart w:id="0" w:name="__RefHeading___Toc1589_285727793"/>
       <w:bookmarkEnd w:id="0"/>
       <w:r>
         <w:rPr/>
@@ -185,7 +185,7 @@
       </w:pPr>
       <w:r>
         <w:rPr/>
-        <w:t>Este informe analiza el contexto tecnológico de La Plancha, una hamburguesería de barrio ficticia situada en Burjassot (València) con trece mesas y cuatro personas en plantilla, para sentar las bases de un proyecto que mejore su infraestructura de sistemas y redes. Se describen la empresa, su organización y sus flujos de trabajo digitales; se inventarían el hardware, la red, los sistemas operativos, los servicios y la seguridad; y se estudian el macroentorno (análisis PESTEL) y el microentorno (clientes, proveedores y competencia). El diagnóstico identifica tres problemas de fondo: la información de la comanda no entra en ningún sistema hasta el cobro, el equipo de caja funciona con un sistema operativo sin soporte desde octubre de 2025 y toda la actividad comparte una única red plana con los móviles de los clientes. El informe termina con las necesidades priorizadas, las características que debe cumplir el proyecto, las obligaciones legales y las ayudas aplicables, y el guion de trabajo de los retos siguientes.</w:t>
+        <w:t>Este informe analiza el contexto tecnológico de Burglar King, una hamburguesería de barrio ficticia situada en Burjassot (València) con trece mesas y cuatro personas en plantilla, para sentar las bases de un proyecto que mejore su infraestructura de sistemas y redes. Se describen la empresa, su organización y sus flujos de trabajo digitales; se inventarían el hardware, la red, los sistemas operativos, los servicios y la seguridad; y se estudian el macroentorno (análisis PESTEL) y el microentorno (clientes, proveedores y competencia). El diagnóstico identifica tres problemas de fondo: la información de la comanda no entra en ningún sistema hasta el cobro, el equipo de caja funciona con un sistema operativo sin soporte desde octubre de 2025 y toda la actividad comparte una única red plana con los móviles de los clientes. El informe termina con las necesidades priorizadas, las características que debe cumplir el proyecto, las obligaciones legales y las ayudas aplicables, y el guion de trabajo de los retos siguientes.</w:t>
       </w:r>
     </w:p>
     <w:p>
@@ -193,7 +193,7 @@
         <w:pStyle w:val="Heading1"/>
         <w:rPr/>
       </w:pPr>
-      <w:bookmarkStart w:id="1" w:name="__RefHeading___Toc1591_3898207833"/>
+      <w:bookmarkStart w:id="1" w:name="__RefHeading___Toc1591_285727793"/>
       <w:bookmarkEnd w:id="1"/>
       <w:r>
         <w:rPr/>
@@ -208,7 +208,7 @@
       </w:pPr>
       <w:r>
         <w:rPr/>
-        <w:t>Aquest informe analitza el context tecnològic de La Plancha, una hamburgueseria de barri fictícia situada a Burjassot (València) amb tretze taules i quatre persones en plantilla, per a establir les bases d'un projecte que millore la seua infraestructura de sistemes i xarxes. Es descriuen l'empresa, la seua organització i els seus fluxos de treball digitals; s'inventarien el maquinari, la xarxa, els sistemes operatius, els serveis i la seguretat; i s'estudien el macroentorn (anàlisi PESTEL) i el microentorn (clients, proveïdors i competència). El diagnòstic identifica tres problemes de fons: la informació de la comanda no entra en cap sistema fins al cobrament, l'equip de caixa funciona amb un sistema operatiu sense suport des d'octubre de 2025 i tota l'activitat comparteix una única xarxa plana amb els mòbils dels clients. L'informe acaba amb les necessitats prioritzades, les característiques que ha de complir el projecte, les obligacions legals i les ajudes aplicables, i el guió de treball dels reptes següents.</w:t>
+        <w:t>Aquest informe analitza el context tecnològic de Burglar King, una hamburgueseria de barri fictícia situada a Burjassot (València) amb tretze taules i quatre persones en plantilla, per a establir les bases d'un projecte que millore la seua infraestructura de sistemes i xarxes. Es descriuen l'empresa, la seua organització i els seus fluxos de treball digitals; s'inventarien el maquinari, la xarxa, els sistemes operatius, els serveis i la seguretat; i s'estudien el macroentorn (anàlisi PESTEL) i el microentorn (clients, proveïdors i competència). El diagnòstic identifica tres problemes de fons: la informació de la comanda no entra en cap sistema fins al cobrament, l'equip de caixa funciona amb un sistema operatiu sense suport des d'octubre de 2025 i tota l'activitat comparteix una única xarxa plana amb els mòbils dels clients. L'informe acaba amb les necessitats prioritzades, les característiques que ha de complir el projecte, les obligacions legals i les ajudes aplicables, i el guió de treball dels reptes següents.</w:t>
       </w:r>
       <w:r>
         <w:br w:type="page"/>
@@ -261,7 +261,7 @@
             </w:rPr>
             <w:fldChar w:fldCharType="separate"/>
           </w:r>
-          <w:hyperlink w:anchor="__RefHeading___Toc1589_3898207833">
+          <w:hyperlink w:anchor="__RefHeading___Toc1589_285727793">
             <w:r>
               <w:rPr>
                 <w:rStyle w:val="IndexLink"/>
@@ -281,7 +281,7 @@
             </w:tabs>
             <w:rPr/>
           </w:pPr>
-          <w:hyperlink w:anchor="__RefHeading___Toc1591_3898207833">
+          <w:hyperlink w:anchor="__RefHeading___Toc1591_285727793">
             <w:r>
               <w:rPr>
                 <w:rStyle w:val="IndexLink"/>
@@ -301,7 +301,7 @@
             </w:tabs>
             <w:rPr/>
           </w:pPr>
-          <w:hyperlink w:anchor="__RefHeading___Toc1593_3898207833">
+          <w:hyperlink w:anchor="__RefHeading___Toc1593_285727793">
             <w:r>
               <w:rPr>
                 <w:rStyle w:val="IndexLink"/>
@@ -321,7 +321,7 @@
             </w:tabs>
             <w:rPr/>
           </w:pPr>
-          <w:hyperlink w:anchor="__RefHeading___Toc1595_3898207833">
+          <w:hyperlink w:anchor="__RefHeading___Toc1595_285727793">
             <w:r>
               <w:rPr>
                 <w:rStyle w:val="IndexLink"/>
@@ -341,7 +341,7 @@
             </w:tabs>
             <w:rPr/>
           </w:pPr>
-          <w:hyperlink w:anchor="__RefHeading___Toc1597_3898207833">
+          <w:hyperlink w:anchor="__RefHeading___Toc1597_285727793">
             <w:r>
               <w:rPr>
                 <w:rStyle w:val="IndexLink"/>
@@ -361,7 +361,7 @@
             </w:tabs>
             <w:rPr/>
           </w:pPr>
-          <w:hyperlink w:anchor="__RefHeading___Toc1599_3898207833">
+          <w:hyperlink w:anchor="__RefHeading___Toc1599_285727793">
             <w:r>
               <w:rPr>
                 <w:rStyle w:val="IndexLink"/>
@@ -381,7 +381,7 @@
             </w:tabs>
             <w:rPr/>
           </w:pPr>
-          <w:hyperlink w:anchor="__RefHeading___Toc1601_3898207833">
+          <w:hyperlink w:anchor="__RefHeading___Toc1601_285727793">
             <w:r>
               <w:rPr>
                 <w:rStyle w:val="IndexLink"/>
@@ -401,7 +401,7 @@
             </w:tabs>
             <w:rPr/>
           </w:pPr>
-          <w:hyperlink w:anchor="__RefHeading___Toc1603_3898207833">
+          <w:hyperlink w:anchor="__RefHeading___Toc1603_285727793">
             <w:r>
               <w:rPr>
                 <w:rStyle w:val="IndexLink"/>
@@ -421,7 +421,7 @@
             </w:tabs>
             <w:rPr/>
           </w:pPr>
-          <w:hyperlink w:anchor="__RefHeading___Toc1605_3898207833">
+          <w:hyperlink w:anchor="__RefHeading___Toc1605_285727793">
             <w:r>
               <w:rPr>
                 <w:rStyle w:val="IndexLink"/>
@@ -441,7 +441,7 @@
             </w:tabs>
             <w:rPr/>
           </w:pPr>
-          <w:hyperlink w:anchor="__RefHeading___Toc1607_3898207833">
+          <w:hyperlink w:anchor="__RefHeading___Toc1607_285727793">
             <w:r>
               <w:rPr>
                 <w:rStyle w:val="IndexLink"/>
@@ -461,7 +461,7 @@
             </w:tabs>
             <w:rPr/>
           </w:pPr>
-          <w:hyperlink w:anchor="__RefHeading___Toc1609_3898207833">
+          <w:hyperlink w:anchor="__RefHeading___Toc1609_285727793">
             <w:r>
               <w:rPr>
                 <w:rStyle w:val="IndexLink"/>
@@ -481,7 +481,7 @@
             </w:tabs>
             <w:rPr/>
           </w:pPr>
-          <w:hyperlink w:anchor="__RefHeading___Toc1611_3898207833">
+          <w:hyperlink w:anchor="__RefHeading___Toc1611_285727793">
             <w:r>
               <w:rPr>
                 <w:rStyle w:val="IndexLink"/>
@@ -501,7 +501,7 @@
             </w:tabs>
             <w:rPr/>
           </w:pPr>
-          <w:hyperlink w:anchor="__RefHeading___Toc1613_3898207833">
+          <w:hyperlink w:anchor="__RefHeading___Toc1613_285727793">
             <w:r>
               <w:rPr>
                 <w:rStyle w:val="IndexLink"/>
@@ -521,7 +521,7 @@
             </w:tabs>
             <w:rPr/>
           </w:pPr>
-          <w:hyperlink w:anchor="__RefHeading___Toc1615_3898207833">
+          <w:hyperlink w:anchor="__RefHeading___Toc1615_285727793">
             <w:r>
               <w:rPr>
                 <w:rStyle w:val="IndexLink"/>
@@ -541,7 +541,7 @@
             </w:tabs>
             <w:rPr/>
           </w:pPr>
-          <w:hyperlink w:anchor="__RefHeading___Toc1617_3898207833">
+          <w:hyperlink w:anchor="__RefHeading___Toc1617_285727793">
             <w:r>
               <w:rPr>
                 <w:rStyle w:val="IndexLink"/>
@@ -561,7 +561,7 @@
             </w:tabs>
             <w:rPr/>
           </w:pPr>
-          <w:hyperlink w:anchor="__RefHeading___Toc1619_3898207833">
+          <w:hyperlink w:anchor="__RefHeading___Toc1619_285727793">
             <w:r>
               <w:rPr>
                 <w:rStyle w:val="IndexLink"/>
@@ -581,7 +581,7 @@
             </w:tabs>
             <w:rPr/>
           </w:pPr>
-          <w:hyperlink w:anchor="__RefHeading___Toc1621_3898207833">
+          <w:hyperlink w:anchor="__RefHeading___Toc1621_285727793">
             <w:r>
               <w:rPr>
                 <w:rStyle w:val="IndexLink"/>
@@ -601,7 +601,7 @@
             </w:tabs>
             <w:rPr/>
           </w:pPr>
-          <w:hyperlink w:anchor="__RefHeading___Toc1623_3898207833">
+          <w:hyperlink w:anchor="__RefHeading___Toc1623_285727793">
             <w:r>
               <w:rPr>
                 <w:rStyle w:val="IndexLink"/>
@@ -621,7 +621,7 @@
             </w:tabs>
             <w:rPr/>
           </w:pPr>
-          <w:hyperlink w:anchor="__RefHeading___Toc1625_3898207833">
+          <w:hyperlink w:anchor="__RefHeading___Toc1625_285727793">
             <w:r>
               <w:rPr>
                 <w:rStyle w:val="IndexLink"/>
@@ -641,7 +641,7 @@
             </w:tabs>
             <w:rPr/>
           </w:pPr>
-          <w:hyperlink w:anchor="__RefHeading___Toc1627_3898207833">
+          <w:hyperlink w:anchor="__RefHeading___Toc1627_285727793">
             <w:r>
               <w:rPr>
                 <w:rStyle w:val="IndexLink"/>
@@ -661,7 +661,7 @@
             </w:tabs>
             <w:rPr/>
           </w:pPr>
-          <w:hyperlink w:anchor="__RefHeading___Toc1629_3898207833">
+          <w:hyperlink w:anchor="__RefHeading___Toc1629_285727793">
             <w:r>
               <w:rPr>
                 <w:rStyle w:val="IndexLink"/>
@@ -681,7 +681,7 @@
             </w:tabs>
             <w:rPr/>
           </w:pPr>
-          <w:hyperlink w:anchor="__RefHeading___Toc1631_3898207833">
+          <w:hyperlink w:anchor="__RefHeading___Toc1631_285727793">
             <w:r>
               <w:rPr>
                 <w:rStyle w:val="IndexLink"/>
@@ -701,7 +701,7 @@
             </w:tabs>
             <w:rPr/>
           </w:pPr>
-          <w:hyperlink w:anchor="__RefHeading___Toc1633_3898207833">
+          <w:hyperlink w:anchor="__RefHeading___Toc1633_285727793">
             <w:r>
               <w:rPr>
                 <w:rStyle w:val="IndexLink"/>
@@ -721,7 +721,7 @@
             </w:tabs>
             <w:rPr/>
           </w:pPr>
-          <w:hyperlink w:anchor="__RefHeading___Toc1635_3898207833">
+          <w:hyperlink w:anchor="__RefHeading___Toc1635_285727793">
             <w:r>
               <w:rPr>
                 <w:rStyle w:val="IndexLink"/>
@@ -741,7 +741,7 @@
             </w:tabs>
             <w:rPr/>
           </w:pPr>
-          <w:hyperlink w:anchor="__RefHeading___Toc1637_3898207833">
+          <w:hyperlink w:anchor="__RefHeading___Toc1637_285727793">
             <w:r>
               <w:rPr>
                 <w:rStyle w:val="IndexLink"/>
@@ -761,7 +761,7 @@
             </w:tabs>
             <w:rPr/>
           </w:pPr>
-          <w:hyperlink w:anchor="__RefHeading___Toc1639_3898207833">
+          <w:hyperlink w:anchor="__RefHeading___Toc1639_285727793">
             <w:r>
               <w:rPr>
                 <w:rStyle w:val="IndexLink"/>
@@ -781,7 +781,7 @@
             </w:tabs>
             <w:rPr/>
           </w:pPr>
-          <w:hyperlink w:anchor="__RefHeading___Toc1641_3898207833">
+          <w:hyperlink w:anchor="__RefHeading___Toc1641_285727793">
             <w:r>
               <w:rPr>
                 <w:rStyle w:val="IndexLink"/>
@@ -801,7 +801,7 @@
             </w:tabs>
             <w:rPr/>
           </w:pPr>
-          <w:hyperlink w:anchor="__RefHeading___Toc1643_3898207833">
+          <w:hyperlink w:anchor="__RefHeading___Toc1643_285727793">
             <w:r>
               <w:rPr>
                 <w:rStyle w:val="IndexLink"/>
@@ -821,7 +821,7 @@
             </w:tabs>
             <w:rPr/>
           </w:pPr>
-          <w:hyperlink w:anchor="__RefHeading___Toc1645_3898207833">
+          <w:hyperlink w:anchor="__RefHeading___Toc1645_285727793">
             <w:r>
               <w:rPr>
                 <w:rStyle w:val="IndexLink"/>
@@ -841,7 +841,7 @@
             </w:tabs>
             <w:rPr/>
           </w:pPr>
-          <w:hyperlink w:anchor="__RefHeading___Toc1647_3898207833">
+          <w:hyperlink w:anchor="__RefHeading___Toc1647_285727793">
             <w:r>
               <w:rPr>
                 <w:rStyle w:val="IndexLink"/>
@@ -861,7 +861,7 @@
             </w:tabs>
             <w:rPr/>
           </w:pPr>
-          <w:hyperlink w:anchor="__RefHeading___Toc1649_3898207833">
+          <w:hyperlink w:anchor="__RefHeading___Toc1649_285727793">
             <w:r>
               <w:rPr>
                 <w:rStyle w:val="IndexLink"/>
@@ -881,7 +881,7 @@
             </w:tabs>
             <w:rPr/>
           </w:pPr>
-          <w:hyperlink w:anchor="__RefHeading___Toc1651_3898207833">
+          <w:hyperlink w:anchor="__RefHeading___Toc1651_285727793">
             <w:r>
               <w:rPr>
                 <w:rStyle w:val="IndexLink"/>
@@ -901,7 +901,7 @@
             </w:tabs>
             <w:rPr/>
           </w:pPr>
-          <w:hyperlink w:anchor="__RefHeading___Toc1653_3898207833">
+          <w:hyperlink w:anchor="__RefHeading___Toc1653_285727793">
             <w:r>
               <w:rPr>
                 <w:rStyle w:val="IndexLink"/>
@@ -921,7 +921,7 @@
             </w:tabs>
             <w:rPr/>
           </w:pPr>
-          <w:hyperlink w:anchor="__RefHeading___Toc1655_3898207833">
+          <w:hyperlink w:anchor="__RefHeading___Toc1655_285727793">
             <w:r>
               <w:rPr>
                 <w:rStyle w:val="IndexLink"/>
@@ -941,7 +941,7 @@
             </w:tabs>
             <w:rPr/>
           </w:pPr>
-          <w:hyperlink w:anchor="__RefHeading___Toc1657_3898207833">
+          <w:hyperlink w:anchor="__RefHeading___Toc1657_285727793">
             <w:r>
               <w:rPr>
                 <w:rStyle w:val="IndexLink"/>
@@ -961,7 +961,7 @@
             </w:tabs>
             <w:rPr/>
           </w:pPr>
-          <w:hyperlink w:anchor="__RefHeading___Toc1659_3898207833">
+          <w:hyperlink w:anchor="__RefHeading___Toc1659_285727793">
             <w:r>
               <w:rPr>
                 <w:rStyle w:val="IndexLink"/>
@@ -1002,7 +1002,7 @@
         <w:pStyle w:val="Heading1"/>
         <w:rPr/>
       </w:pPr>
-      <w:bookmarkStart w:id="2" w:name="__RefHeading___Toc1593_3898207833"/>
+      <w:bookmarkStart w:id="2" w:name="__RefHeading___Toc1593_285727793"/>
       <w:bookmarkEnd w:id="2"/>
       <w:r>
         <w:rPr/>
@@ -1026,7 +1026,7 @@
       </w:pPr>
       <w:r>
         <w:rPr/>
-        <w:t xml:space="preserve">Este informe responde al Reto 1 del Proyecto Intermodular I: analizar el contexto tecnológico de una empresa para identificar sus necesidades y establecer las bases de un proyecto de intervención que mejore su infraestructura de sistemas y redes. La empresa elegida es La Plancha, el local para el que el equipo está desarrollando un sistema de punto de venta (TPV) con pantallas de cocina (KDS, </w:t>
+        <w:t xml:space="preserve">Este informe responde al Reto 1 del Proyecto Intermodular I: analizar el contexto tecnológico de una empresa para identificar sus necesidades y establecer las bases de un proyecto de intervención que mejore su infraestructura de sistemas y redes. La empresa elegida es Burglar King, el local para el que el equipo está desarrollando un sistema de punto de venta (TPV) con pantallas de cocina (KDS, </w:t>
       </w:r>
       <w:r>
         <w:rPr>
@@ -1045,7 +1045,7 @@
         <w:pStyle w:val="Heading2"/>
         <w:rPr/>
       </w:pPr>
-      <w:bookmarkStart w:id="3" w:name="__RefHeading___Toc1595_3898207833"/>
+      <w:bookmarkStart w:id="3" w:name="__RefHeading___Toc1595_285727793"/>
       <w:bookmarkEnd w:id="3"/>
       <w:r>
         <w:rPr/>
@@ -1077,7 +1077,7 @@
         <w:pStyle w:val="Heading2"/>
         <w:rPr/>
       </w:pPr>
-      <w:bookmarkStart w:id="4" w:name="__RefHeading___Toc1597_3898207833"/>
+      <w:bookmarkStart w:id="4" w:name="__RefHeading___Toc1597_285727793"/>
       <w:bookmarkEnd w:id="4"/>
       <w:r>
         <w:rPr/>
@@ -1174,7 +1174,7 @@
         <w:pStyle w:val="Heading2"/>
         <w:rPr/>
       </w:pPr>
-      <w:bookmarkStart w:id="5" w:name="__RefHeading___Toc1599_3898207833"/>
+      <w:bookmarkStart w:id="5" w:name="__RefHeading___Toc1599_285727793"/>
       <w:bookmarkEnd w:id="5"/>
       <w:r>
         <w:rPr/>
@@ -1199,7 +1199,7 @@
         <w:pStyle w:val="Heading1"/>
         <w:rPr/>
       </w:pPr>
-      <w:bookmarkStart w:id="6" w:name="__RefHeading___Toc1601_3898207833"/>
+      <w:bookmarkStart w:id="6" w:name="__RefHeading___Toc1601_285727793"/>
       <w:bookmarkEnd w:id="6"/>
       <w:r>
         <w:rPr/>
@@ -1244,7 +1244,7 @@
         <w:pStyle w:val="Heading1"/>
         <w:rPr/>
       </w:pPr>
-      <w:bookmarkStart w:id="7" w:name="__RefHeading___Toc1603_3898207833"/>
+      <w:bookmarkStart w:id="7" w:name="__RefHeading___Toc1603_285727793"/>
       <w:bookmarkEnd w:id="7"/>
       <w:r>
         <w:rPr/>
@@ -1256,7 +1256,7 @@
         <w:pStyle w:val="Heading2"/>
         <w:rPr/>
       </w:pPr>
-      <w:bookmarkStart w:id="8" w:name="__RefHeading___Toc1605_3898207833"/>
+      <w:bookmarkStart w:id="8" w:name="__RefHeading___Toc1605_285727793"/>
       <w:bookmarkEnd w:id="8"/>
       <w:r>
         <w:rPr/>
@@ -1270,7 +1270,7 @@
       </w:pPr>
       <w:r>
         <w:rPr/>
-        <w:t>La Plancha es una hamburguesería de barrio situada en Burjassot, municipio del área metropolitana de València que acoge el campus de Burjassot-Paterna de la Universitat de València. Esa ubicación determina el negocio: hay mucha población joven y universitaria, la demanda se concentra en franjas cortas a mediodía y por la noche, y una parte importante de los pedidos es para llevar o a domicilio. La tabla 1 resume sus datos básicos.</w:t>
+        <w:t>Burglar King es una hamburguesería de barrio situada en Burjassot, municipio del área metropolitana de València que acoge el campus de Burjassot-Paterna de la Universitat de València. Esa ubicación determina el negocio: hay mucha población joven y universitaria, la demanda se concentra en franjas cortas a mediodía y por la noche, y una parte importante de los pedidos es para llevar o a domicilio. La tabla 1 resume sus datos básicos.</w:t>
       </w:r>
     </w:p>
     <w:p>
@@ -1428,7 +1428,7 @@
                 <w:sz w:val="19"/>
                 <w:szCs w:val="19"/>
               </w:rPr>
-              <w:t>La Plancha Burjassot, S.L. (sociedad limitada ficticia)</w:t>
+              <w:t>Burglar King Burjassot, S.L. (sociedad limitada ficticia)</w:t>
             </w:r>
           </w:p>
         </w:tc>
@@ -1830,7 +1830,7 @@
         <w:pStyle w:val="Heading2"/>
         <w:rPr/>
       </w:pPr>
-      <w:bookmarkStart w:id="9" w:name="__RefHeading___Toc1607_3898207833"/>
+      <w:bookmarkStart w:id="9" w:name="__RefHeading___Toc1607_285727793"/>
       <w:bookmarkEnd w:id="9"/>
       <w:r>
         <w:rPr/>
@@ -1876,7 +1876,7 @@
           <w:i/>
           <w:iCs/>
         </w:rPr>
-        <w:t>Organigrama de La Plancha</w:t>
+        <w:t>Organigrama de Burglar King</w:t>
       </w:r>
     </w:p>
     <w:p>
@@ -1894,7 +1894,7 @@
           <wp:inline distT="0" distB="0" distL="0" distR="0">
             <wp:extent cx="4286250" cy="2038350"/>
             <wp:effectExtent l="0" t="0" r="0" b="0"/>
-            <wp:docPr id="1" name="organigrama.png" descr="Organigrama de La Plancha&#10;Organigrama de La Plancha"/>
+            <wp:docPr id="1" name="organigrama.png" descr="Organigrama de Burglar King&#10;Organigrama de Burglar King"/>
             <wp:cNvGraphicFramePr>
               <a:graphicFrameLocks xmlns:a="http://schemas.openxmlformats.org/drawingml/2006/main" noChangeAspect="1"/>
             </wp:cNvGraphicFramePr>
@@ -1902,7 +1902,7 @@
               <a:graphicData uri="http://schemas.openxmlformats.org/drawingml/2006/picture">
                 <pic:pic xmlns:pic="http://schemas.openxmlformats.org/drawingml/2006/picture">
                   <pic:nvPicPr>
-                    <pic:cNvPr id="1" name="organigrama.png" descr="Organigrama de La Plancha&#10;Organigrama de La Plancha"/>
+                    <pic:cNvPr id="1" name="organigrama.png" descr="Organigrama de Burglar King&#10;Organigrama de Burglar King"/>
                     <pic:cNvPicPr>
                       <a:picLocks noChangeAspect="1" noChangeArrowheads="1"/>
                     </pic:cNvPicPr>
@@ -2547,7 +2547,7 @@
         <w:pStyle w:val="Heading2"/>
         <w:rPr/>
       </w:pPr>
-      <w:bookmarkStart w:id="10" w:name="__RefHeading___Toc1609_3898207833"/>
+      <w:bookmarkStart w:id="10" w:name="__RefHeading___Toc1609_285727793"/>
       <w:bookmarkEnd w:id="10"/>
       <w:r>
         <w:rPr/>
@@ -3517,7 +3517,7 @@
         <w:pStyle w:val="Heading1"/>
         <w:rPr/>
       </w:pPr>
-      <w:bookmarkStart w:id="11" w:name="__RefHeading___Toc1611_3898207833"/>
+      <w:bookmarkStart w:id="11" w:name="__RefHeading___Toc1611_285727793"/>
       <w:bookmarkEnd w:id="11"/>
       <w:r>
         <w:rPr/>
@@ -3539,7 +3539,7 @@
         <w:pStyle w:val="Heading2"/>
         <w:rPr/>
       </w:pPr>
-      <w:bookmarkStart w:id="12" w:name="__RefHeading___Toc1613_3898207833"/>
+      <w:bookmarkStart w:id="12" w:name="__RefHeading___Toc1613_285727793"/>
       <w:bookmarkEnd w:id="12"/>
       <w:r>
         <w:rPr/>
@@ -4731,7 +4731,7 @@
         <w:pStyle w:val="Heading2"/>
         <w:rPr/>
       </w:pPr>
-      <w:bookmarkStart w:id="13" w:name="__RefHeading___Toc1615_3898207833"/>
+      <w:bookmarkStart w:id="13" w:name="__RefHeading___Toc1615_285727793"/>
       <w:bookmarkEnd w:id="13"/>
       <w:r>
         <w:rPr/>
@@ -5542,7 +5542,7 @@
       </w:pPr>
       <w:r>
         <w:rPr/>
-        <w:t>Desde el punto de vista de las redes, la red de La Plancha es una red de área local de topología en estrella con un único dispositivo de interconexión que trabaja a la vez en el nivel de enlace (conmutación y wifi) y en el de red (encaminamiento y traducción de direcciones). Es una arquitectura válida para una casa, pero no para un negocio que mezcla en el mismo dominio de difusión un terminal de cobro, un grabador de vídeo con imágenes de personas y los teléfonos de desconocidos.</w:t>
+        <w:t>Desde el punto de vista de las redes, la red de Burglar King es una red de área local de topología en estrella con un único dispositivo de interconexión que trabaja a la vez en el nivel de enlace (conmutación y wifi) y en el de red (encaminamiento y traducción de direcciones). Es una arquitectura válida para una casa, pero no para un negocio que mezcla en el mismo dominio de difusión un terminal de cobro, un grabador de vídeo con imágenes de personas y los teléfonos de desconocidos.</w:t>
       </w:r>
     </w:p>
     <w:p>
@@ -5550,7 +5550,7 @@
         <w:pStyle w:val="Heading2"/>
         <w:rPr/>
       </w:pPr>
-      <w:bookmarkStart w:id="14" w:name="__RefHeading___Toc1617_3898207833"/>
+      <w:bookmarkStart w:id="14" w:name="__RefHeading___Toc1617_285727793"/>
       <w:bookmarkEnd w:id="14"/>
       <w:r>
         <w:rPr/>
@@ -6354,7 +6354,7 @@
         <w:pStyle w:val="Heading2"/>
         <w:rPr/>
       </w:pPr>
-      <w:bookmarkStart w:id="15" w:name="__RefHeading___Toc1619_3898207833"/>
+      <w:bookmarkStart w:id="15" w:name="__RefHeading___Toc1619_285727793"/>
       <w:bookmarkEnd w:id="15"/>
       <w:r>
         <w:rPr/>
@@ -7245,7 +7245,7 @@
         <w:pStyle w:val="Heading2"/>
         <w:rPr/>
       </w:pPr>
-      <w:bookmarkStart w:id="16" w:name="__RefHeading___Toc1621_3898207833"/>
+      <w:bookmarkStart w:id="16" w:name="__RefHeading___Toc1621_285727793"/>
       <w:bookmarkEnd w:id="16"/>
       <w:r>
         <w:rPr/>
@@ -8698,7 +8698,7 @@
         <w:pStyle w:val="Heading1"/>
         <w:rPr/>
       </w:pPr>
-      <w:bookmarkStart w:id="17" w:name="__RefHeading___Toc1623_3898207833"/>
+      <w:bookmarkStart w:id="17" w:name="__RefHeading___Toc1623_285727793"/>
       <w:bookmarkEnd w:id="17"/>
       <w:r>
         <w:rPr/>
@@ -8744,7 +8744,7 @@
           <w:i/>
           <w:iCs/>
         </w:rPr>
-        <w:t>Análisis PESTEL de La Plancha</w:t>
+        <w:t>Análisis PESTEL de Burglar King</w:t>
       </w:r>
     </w:p>
     <w:tbl>
@@ -9326,7 +9326,7 @@
         <w:pStyle w:val="Heading2"/>
         <w:rPr/>
       </w:pPr>
-      <w:bookmarkStart w:id="18" w:name="__RefHeading___Toc1625_3898207833"/>
+      <w:bookmarkStart w:id="18" w:name="__RefHeading___Toc1625_285727793"/>
       <w:bookmarkEnd w:id="18"/>
       <w:r>
         <w:rPr/>
@@ -9340,7 +9340,7 @@
       </w:pPr>
       <w:r>
         <w:rPr/>
-        <w:t>Buena parte de la demanda de tecnología en la hostelería no nace del deseo de modernizarse, sino de obligaciones legales. La Ley 11/2021 prohíbe el software de facturación capaz de ocultar o alterar ventas, y el Real Decreto 1007/2023 (reglamento Verifactu) exige que cada factura quede registrada, encadenada y sea trazable. Su entrada en vigor se aplazó por el Real Decreto-ley 15/2025: será el 1 de enero de 2027 para las sociedades y el 1 de julio de 2027 para el resto de contribuyentes (Garrigues, 2025). Como La Plancha es una sociedad limitada, su plazo es el primero. El TPV actual, con una licencia de 2016 sin mantenimiento, no va a recibir esa adaptación, así que el cambio de sistema de facturación es una obligación con fecha y no una mejora opcional.</w:t>
+        <w:t>Buena parte de la demanda de tecnología en la hostelería no nace del deseo de modernizarse, sino de obligaciones legales. La Ley 11/2021 prohíbe el software de facturación capaz de ocultar o alterar ventas, y el Real Decreto 1007/2023 (reglamento Verifactu) exige que cada factura quede registrada, encadenada y sea trazable. Su entrada en vigor se aplazó por el Real Decreto-ley 15/2025: será el 1 de enero de 2027 para las sociedades y el 1 de julio de 2027 para el resto de contribuyentes (Garrigues, 2025). Como Burglar King es una sociedad limitada, su plazo es el primero. El TPV actual, con una licencia de 2016 sin mantenimiento, no va a recibir esa adaptación, así que el cambio de sistema de facturación es una obligación con fecha y no una mejora opcional.</w:t>
       </w:r>
     </w:p>
     <w:p>
@@ -9358,7 +9358,7 @@
         <w:pStyle w:val="Heading2"/>
         <w:rPr/>
       </w:pPr>
-      <w:bookmarkStart w:id="19" w:name="__RefHeading___Toc1627_3898207833"/>
+      <w:bookmarkStart w:id="19" w:name="__RefHeading___Toc1627_285727793"/>
       <w:bookmarkEnd w:id="19"/>
       <w:r>
         <w:rPr/>
@@ -9380,7 +9380,7 @@
         <w:pStyle w:val="Heading2"/>
         <w:rPr/>
       </w:pPr>
-      <w:bookmarkStart w:id="20" w:name="__RefHeading___Toc1629_3898207833"/>
+      <w:bookmarkStart w:id="20" w:name="__RefHeading___Toc1629_285727793"/>
       <w:bookmarkEnd w:id="20"/>
       <w:r>
         <w:rPr/>
@@ -9394,7 +9394,7 @@
       </w:pPr>
       <w:r>
         <w:rPr/>
-        <w:t>El cliente de La Plancha es joven, paga con tarjeta o con el móvil y espera conexión wifi. Un fabricante de TPV sitúa entre el 65 % y el 70 % los pagos digitales en la hostelería española, a partir de sus propios clientes (El Independiente, 2026). Es un indicio y no una estadística oficial, pero coincide con lo que se observa en el local. Las consecuencias técnicas son dos: el datáfono debe tener buena cobertura en toda la superficie, terraza incluida, y el wifi para clientes es un servicio esperado que, por eso mismo, debe estar separado de la red del negocio.</w:t>
+        <w:t>El cliente de Burglar King es joven, paga con tarjeta o con el móvil y espera conexión wifi. Un fabricante de TPV sitúa entre el 65 % y el 70 % los pagos digitales en la hostelería española, a partir de sus propios clientes (El Independiente, 2026). Es un indicio y no una estadística oficial, pero coincide con lo que se observa en el local. Las consecuencias técnicas son dos: el datáfono debe tener buena cobertura en toda la superficie, terraza incluida, y el wifi para clientes es un servicio esperado que, por eso mismo, debe estar separado de la red del negocio.</w:t>
       </w:r>
     </w:p>
     <w:p>
@@ -9402,7 +9402,7 @@
         <w:pStyle w:val="Heading2"/>
         <w:rPr/>
       </w:pPr>
-      <w:bookmarkStart w:id="21" w:name="__RefHeading___Toc1631_3898207833"/>
+      <w:bookmarkStart w:id="21" w:name="__RefHeading___Toc1631_285727793"/>
       <w:bookmarkEnd w:id="21"/>
       <w:r>
         <w:rPr/>
@@ -9424,7 +9424,7 @@
         <w:pStyle w:val="Heading2"/>
         <w:rPr/>
       </w:pPr>
-      <w:bookmarkStart w:id="22" w:name="__RefHeading___Toc1633_3898207833"/>
+      <w:bookmarkStart w:id="22" w:name="__RefHeading___Toc1633_285727793"/>
       <w:bookmarkEnd w:id="22"/>
       <w:r>
         <w:rPr/>
@@ -9449,7 +9449,7 @@
         <w:pStyle w:val="Heading1"/>
         <w:rPr/>
       </w:pPr>
-      <w:bookmarkStart w:id="23" w:name="__RefHeading___Toc1635_3898207833"/>
+      <w:bookmarkStart w:id="23" w:name="__RefHeading___Toc1635_285727793"/>
       <w:bookmarkEnd w:id="23"/>
       <w:r>
         <w:rPr/>
@@ -9471,7 +9471,7 @@
         <w:pStyle w:val="Heading2"/>
         <w:rPr/>
       </w:pPr>
-      <w:bookmarkStart w:id="24" w:name="__RefHeading___Toc1637_3898207833"/>
+      <w:bookmarkStart w:id="24" w:name="__RefHeading___Toc1637_285727793"/>
       <w:bookmarkEnd w:id="24"/>
       <w:r>
         <w:rPr/>
@@ -9951,7 +9951,7 @@
         <w:pStyle w:val="Heading2"/>
         <w:rPr/>
       </w:pPr>
-      <w:bookmarkStart w:id="25" w:name="__RefHeading___Toc1639_3898207833"/>
+      <w:bookmarkStart w:id="25" w:name="__RefHeading___Toc1639_285727793"/>
       <w:bookmarkEnd w:id="25"/>
       <w:r>
         <w:rPr/>
@@ -9965,7 +9965,7 @@
       </w:pPr>
       <w:r>
         <w:rPr/>
-        <w:t>La Plancha tiene dos tipos de proveedores: los de su actividad (alimentación y bebida) y los de su tecnología. Los primeros son, sobre todo, cash and carry como Makro o GM Cash, que dominan el abastecimiento de la hostelería independiente (Makro España, 2026; GM Cash, 2026). Los segundos son los que más importan para este informe, porque de ellos depende la infraestructura (tabla 11).</w:t>
+        <w:t>Burglar King tiene dos tipos de proveedores: los de su actividad (alimentación y bebida) y los de su tecnología. Los primeros son, sobre todo, cash and carry como Makro o GM Cash, que dominan el abastecimiento de la hostelería independiente (Makro España, 2026; GM Cash, 2026). Los segundos son los que más importan para este informe, porque de ellos depende la infraestructura (tabla 11).</w:t>
       </w:r>
     </w:p>
     <w:p>
@@ -10745,7 +10745,7 @@
         <w:pStyle w:val="Heading2"/>
         <w:rPr/>
       </w:pPr>
-      <w:bookmarkStart w:id="26" w:name="__RefHeading___Toc1641_3898207833"/>
+      <w:bookmarkStart w:id="26" w:name="__RefHeading___Toc1641_285727793"/>
       <w:bookmarkEnd w:id="26"/>
       <w:r>
         <w:rPr/>
@@ -10759,7 +10759,7 @@
       </w:pPr>
       <w:r>
         <w:rPr/>
-        <w:t>La competencia se puede mirar desde dos planos. En el plano del negocio, La Plancha compite con otras hamburgueserías y locales de comida rápida del barrio, con las cadenas de los centros comerciales cercanos y con las cocinas que solo venden por plataformas de reparto. Las cadenas tienen sistemas integrados en los que la comanda llega a la cocina en pantalla y el cliente ve en un monitor cuándo está listo su pedido. Esa es la experiencia con la que el cliente compara.</w:t>
+        <w:t>La competencia se puede mirar desde dos planos. En el plano del negocio, Burglar King compite con otras hamburgueserías y locales de comida rápida del barrio, con las cadenas de los centros comerciales cercanos y con las cocinas que solo venden por plataformas de reparto. Las cadenas tienen sistemas integrados en los que la comanda llega a la cocina en pantalla y el cliente ve en un monitor cuándo está listo su pedido. Esa es la experiencia con la que el cliente compara.</w:t>
       </w:r>
     </w:p>
     <w:p>
@@ -10780,7 +10780,7 @@
         <w:pStyle w:val="Heading1"/>
         <w:rPr/>
       </w:pPr>
-      <w:bookmarkStart w:id="27" w:name="__RefHeading___Toc1643_3898207833"/>
+      <w:bookmarkStart w:id="27" w:name="__RefHeading___Toc1643_285727793"/>
       <w:bookmarkEnd w:id="27"/>
       <w:r>
         <w:rPr/>
@@ -10794,7 +10794,7 @@
       </w:pPr>
       <w:r>
         <w:rPr/>
-        <w:t>Al cruzar el análisis interno con el del entorno, las necesidades de La Plancha se pueden agrupar y priorizar. La tabla 12 las ordena por urgencia, teniendo en cuenta el riesgo que cubren y las fechas legales que las condicionan.</w:t>
+        <w:t>Al cruzar el análisis interno con el del entorno, las necesidades de Burglar King se pueden agrupar y priorizar. La tabla 12 las ordena por urgencia, teniendo en cuenta el riesgo que cubren y las fechas legales que las condicionan.</w:t>
       </w:r>
     </w:p>
     <w:p>
@@ -11671,7 +11671,7 @@
         <w:pStyle w:val="Heading2"/>
         <w:rPr/>
       </w:pPr>
-      <w:bookmarkStart w:id="28" w:name="__RefHeading___Toc1645_3898207833"/>
+      <w:bookmarkStart w:id="28" w:name="__RefHeading___Toc1645_285727793"/>
       <w:bookmarkEnd w:id="28"/>
       <w:r>
         <w:rPr/>
@@ -11685,7 +11685,7 @@
       </w:pPr>
       <w:r>
         <w:rPr/>
-        <w:t>Más allá de La Plancha, el análisis muestra oportunidades claras para un técnico de sistemas en este sector. El calendario de Verifactu obligará a cientos de miles de locales a revisar su sistema de facturación antes de julio de 2027. El fin del soporte de Windows 10 deja sin actualizaciones a buena parte de los TPV instalados. Y la mayoría de los locales independientes tiene una red doméstica con los mismos riesgos que se han encontrado aquí. Son tres motivos para que un local pequeño invierta en tecnología en los próximos meses.</w:t>
+        <w:t>Más allá de Burglar King, el análisis muestra oportunidades claras para un técnico de sistemas en este sector. El calendario de Verifactu obligará a cientos de miles de locales a revisar su sistema de facturación antes de julio de 2027. El fin del soporte de Windows 10 deja sin actualizaciones a buena parte de los TPV instalados. Y la mayoría de los locales independientes tiene una red doméstica con los mismos riesgos que se han encontrado aquí. Son tres motivos para que un local pequeño invierta en tecnología en los próximos meses.</w:t>
       </w:r>
     </w:p>
     <w:p>
@@ -11693,7 +11693,7 @@
         <w:pStyle w:val="Heading2"/>
         <w:rPr/>
       </w:pPr>
-      <w:bookmarkStart w:id="29" w:name="__RefHeading___Toc1647_3898207833"/>
+      <w:bookmarkStart w:id="29" w:name="__RefHeading___Toc1647_285727793"/>
       <w:bookmarkEnd w:id="29"/>
       <w:r>
         <w:rPr/>
@@ -12257,7 +12257,7 @@
         <w:pStyle w:val="Heading2"/>
         <w:rPr/>
       </w:pPr>
-      <w:bookmarkStart w:id="30" w:name="__RefHeading___Toc1649_3898207833"/>
+      <w:bookmarkStart w:id="30" w:name="__RefHeading___Toc1649_285727793"/>
       <w:bookmarkEnd w:id="30"/>
       <w:r>
         <w:rPr/>
@@ -12801,7 +12801,7 @@
         <w:pStyle w:val="Heading2"/>
         <w:rPr/>
       </w:pPr>
-      <w:bookmarkStart w:id="31" w:name="__RefHeading___Toc1651_3898207833"/>
+      <w:bookmarkStart w:id="31" w:name="__RefHeading___Toc1651_285727793"/>
       <w:bookmarkEnd w:id="31"/>
       <w:r>
         <w:rPr/>
@@ -12815,7 +12815,7 @@
       </w:pPr>
       <w:r>
         <w:rPr/>
-        <w:t>La principal referencia para financiar la digitalización de una microempresa ha sido el programa Kit Digital, gestionado por Red.es con fondos europeos Next Generation EU. Ha ofrecido bonos para contratar soluciones de categorías como la gestión de procesos, la factura electrónica o la ciberseguridad, con importes según el número de empleados (Red.es, s.f.). Por su tamaño, La Plancha estaría en el tramo de entre 3 y 9 empleados. Las líneas de digitalización de pymes de la Generalitat Valenciana, que gestiona el IVACE+i, completan el panorama. Como todas estas ayudas dependen de convocatorias con plazos y fondos limitados, el proyecto no las dará por hechas: el presupuesto del Reto 4 se calculará sin ayudas, y la búsqueda de convocatorias abiertas en el momento de ejecutar el proyecto será una tarea más del plan.</w:t>
+        <w:t>La principal referencia para financiar la digitalización de una microempresa ha sido el programa Kit Digital, gestionado por Red.es con fondos europeos Next Generation EU. Ha ofrecido bonos para contratar soluciones de categorías como la gestión de procesos, la factura electrónica o la ciberseguridad, con importes según el número de empleados (Red.es, s.f.). Por su tamaño, Burglar King estaría en el tramo de entre 3 y 9 empleados. Las líneas de digitalización de pymes de la Generalitat Valenciana, que gestiona el IVACE+i, completan el panorama. Como todas estas ayudas dependen de convocatorias con plazos y fondos limitados, el proyecto no las dará por hechas: el presupuesto del Reto 4 se calculará sin ayudas, y la búsqueda de convocatorias abiertas en el momento de ejecutar el proyecto será una tarea más del plan.</w:t>
       </w:r>
       <w:r>
         <w:br w:type="page"/>
@@ -12826,7 +12826,7 @@
         <w:pStyle w:val="Heading1"/>
         <w:rPr/>
       </w:pPr>
-      <w:bookmarkStart w:id="32" w:name="__RefHeading___Toc1653_3898207833"/>
+      <w:bookmarkStart w:id="32" w:name="__RefHeading___Toc1653_285727793"/>
       <w:bookmarkEnd w:id="32"/>
       <w:r>
         <w:rPr/>
@@ -12840,7 +12840,7 @@
       </w:pPr>
       <w:r>
         <w:rPr/>
-        <w:t>La Plancha es un caso típico de la restauración independiente: un negocio sano en un sector con márgenes estrechos, con una tecnología que se ha ido acumulando sin diseño. El análisis muestra tres problemas de fondo. El primero es que la información de la comanda no entra en ningún sistema hasta el cobro, de modo que el local trabaja a ciegas durante el servicio. El segundo es que el único equipo que guarda datos del negocio funciona con un sistema operativo sin soporte, en un disco que falla y sin copias de seguridad. El tercero es que toda la actividad comparte una red plana con los teléfonos de los clientes y con un grabador expuesto en internet.</w:t>
+        <w:t>Burglar King es un caso típico de la restauración independiente: un negocio sano en un sector con márgenes estrechos, con una tecnología que se ha ido acumulando sin diseño. El análisis muestra tres problemas de fondo. El primero es que la información de la comanda no entra en ningún sistema hasta el cobro, de modo que el local trabaja a ciegas durante el servicio. El segundo es que el único equipo que guarda datos del negocio funciona con un sistema operativo sin soporte, en un disco que falla y sin copias de seguridad. El tercero es que toda la actividad comparte una red plana con los teléfonos de los clientes y con un grabador expuesto en internet.</w:t>
       </w:r>
     </w:p>
     <w:p>
@@ -13477,7 +13477,7 @@
         <w:pStyle w:val="Heading1"/>
         <w:rPr/>
       </w:pPr>
-      <w:bookmarkStart w:id="33" w:name="__RefHeading___Toc1655_3898207833"/>
+      <w:bookmarkStart w:id="33" w:name="__RefHeading___Toc1655_285727793"/>
       <w:bookmarkEnd w:id="33"/>
       <w:r>
         <w:rPr/>
@@ -13797,7 +13797,7 @@
         <w:pStyle w:val="Heading2"/>
         <w:rPr/>
       </w:pPr>
-      <w:bookmarkStart w:id="34" w:name="__RefHeading___Toc1657_3898207833"/>
+      <w:bookmarkStart w:id="34" w:name="__RefHeading___Toc1657_285727793"/>
       <w:bookmarkEnd w:id="34"/>
       <w:r>
         <w:rPr/>
@@ -14164,7 +14164,7 @@
         <w:pStyle w:val="Heading1"/>
         <w:rPr/>
       </w:pPr>
-      <w:bookmarkStart w:id="35" w:name="__RefHeading___Toc1659_3898207833"/>
+      <w:bookmarkStart w:id="35" w:name="__RefHeading___Toc1659_285727793"/>
       <w:bookmarkEnd w:id="35"/>
       <w:r>
         <w:rPr/>
@@ -14942,7 +14942,7 @@
         <w:sz w:val="18"/>
         <w:szCs w:val="18"/>
       </w:rPr>
-      <w:t>Contexto tecnológico de La Plancha · Reto 1</w:t>
+      <w:t>Contexto tecnológico de Burglar King · Reto 1</w:t>
       <w:tab/>
       <w:t>1.º ASIR · IES Conselleria</w:t>
     </w:r>

</xml_diff>

<commit_message>
Reto 1: guion hablado de 30 minutos (guion.json) y título de riesgos corregido
Las notas del orador pasan de ~770 a ~3.900 palabras (31 min a 125 ppm), en un único
guion.json que leen el HTML y el pptx (antes cada uno tenía su texto). Escrito sobre el
informe, con verificación de cifras y afirmaciones contra él. El HTML gana cabecera con
el tiempo por diapositiva y un cronómetro de ensayo (tecla T).

Corrección: el título de la diapositiva 8 y la frase del apartado 4.5 decían «la mitad»
de riesgos críticos; la tabla da seis de diez.

Co-Authored-By: Claude Sonnet 5.5 <noreply@anthropic.com>
</commit_message>
<xml_diff>
--- a/docs/reto1/reto1_contexto_tecnologico.docx
+++ b/docs/reto1/reto1_contexto_tecnologico.docx
@@ -170,7 +170,7 @@
         <w:pStyle w:val="Heading1"/>
         <w:rPr/>
       </w:pPr>
-      <w:bookmarkStart w:id="0" w:name="__RefHeading___Toc1589_285727793"/>
+      <w:bookmarkStart w:id="0" w:name="__RefHeading___Toc1589_254375717"/>
       <w:bookmarkEnd w:id="0"/>
       <w:r>
         <w:rPr/>
@@ -193,7 +193,7 @@
         <w:pStyle w:val="Heading1"/>
         <w:rPr/>
       </w:pPr>
-      <w:bookmarkStart w:id="1" w:name="__RefHeading___Toc1591_285727793"/>
+      <w:bookmarkStart w:id="1" w:name="__RefHeading___Toc1591_254375717"/>
       <w:bookmarkEnd w:id="1"/>
       <w:r>
         <w:rPr/>
@@ -261,7 +261,7 @@
             </w:rPr>
             <w:fldChar w:fldCharType="separate"/>
           </w:r>
-          <w:hyperlink w:anchor="__RefHeading___Toc1589_285727793">
+          <w:hyperlink w:anchor="__RefHeading___Toc1589_254375717">
             <w:r>
               <w:rPr>
                 <w:rStyle w:val="IndexLink"/>
@@ -281,7 +281,7 @@
             </w:tabs>
             <w:rPr/>
           </w:pPr>
-          <w:hyperlink w:anchor="__RefHeading___Toc1591_285727793">
+          <w:hyperlink w:anchor="__RefHeading___Toc1591_254375717">
             <w:r>
               <w:rPr>
                 <w:rStyle w:val="IndexLink"/>
@@ -301,7 +301,7 @@
             </w:tabs>
             <w:rPr/>
           </w:pPr>
-          <w:hyperlink w:anchor="__RefHeading___Toc1593_285727793">
+          <w:hyperlink w:anchor="__RefHeading___Toc1593_254375717">
             <w:r>
               <w:rPr>
                 <w:rStyle w:val="IndexLink"/>
@@ -321,7 +321,7 @@
             </w:tabs>
             <w:rPr/>
           </w:pPr>
-          <w:hyperlink w:anchor="__RefHeading___Toc1595_285727793">
+          <w:hyperlink w:anchor="__RefHeading___Toc1595_254375717">
             <w:r>
               <w:rPr>
                 <w:rStyle w:val="IndexLink"/>
@@ -341,7 +341,7 @@
             </w:tabs>
             <w:rPr/>
           </w:pPr>
-          <w:hyperlink w:anchor="__RefHeading___Toc1597_285727793">
+          <w:hyperlink w:anchor="__RefHeading___Toc1597_254375717">
             <w:r>
               <w:rPr>
                 <w:rStyle w:val="IndexLink"/>
@@ -361,7 +361,7 @@
             </w:tabs>
             <w:rPr/>
           </w:pPr>
-          <w:hyperlink w:anchor="__RefHeading___Toc1599_285727793">
+          <w:hyperlink w:anchor="__RefHeading___Toc1599_254375717">
             <w:r>
               <w:rPr>
                 <w:rStyle w:val="IndexLink"/>
@@ -381,7 +381,7 @@
             </w:tabs>
             <w:rPr/>
           </w:pPr>
-          <w:hyperlink w:anchor="__RefHeading___Toc1601_285727793">
+          <w:hyperlink w:anchor="__RefHeading___Toc1601_254375717">
             <w:r>
               <w:rPr>
                 <w:rStyle w:val="IndexLink"/>
@@ -401,7 +401,7 @@
             </w:tabs>
             <w:rPr/>
           </w:pPr>
-          <w:hyperlink w:anchor="__RefHeading___Toc1603_285727793">
+          <w:hyperlink w:anchor="__RefHeading___Toc1603_254375717">
             <w:r>
               <w:rPr>
                 <w:rStyle w:val="IndexLink"/>
@@ -421,7 +421,7 @@
             </w:tabs>
             <w:rPr/>
           </w:pPr>
-          <w:hyperlink w:anchor="__RefHeading___Toc1605_285727793">
+          <w:hyperlink w:anchor="__RefHeading___Toc1605_254375717">
             <w:r>
               <w:rPr>
                 <w:rStyle w:val="IndexLink"/>
@@ -441,7 +441,7 @@
             </w:tabs>
             <w:rPr/>
           </w:pPr>
-          <w:hyperlink w:anchor="__RefHeading___Toc1607_285727793">
+          <w:hyperlink w:anchor="__RefHeading___Toc1607_254375717">
             <w:r>
               <w:rPr>
                 <w:rStyle w:val="IndexLink"/>
@@ -461,7 +461,7 @@
             </w:tabs>
             <w:rPr/>
           </w:pPr>
-          <w:hyperlink w:anchor="__RefHeading___Toc1609_285727793">
+          <w:hyperlink w:anchor="__RefHeading___Toc1609_254375717">
             <w:r>
               <w:rPr>
                 <w:rStyle w:val="IndexLink"/>
@@ -481,7 +481,7 @@
             </w:tabs>
             <w:rPr/>
           </w:pPr>
-          <w:hyperlink w:anchor="__RefHeading___Toc1611_285727793">
+          <w:hyperlink w:anchor="__RefHeading___Toc1611_254375717">
             <w:r>
               <w:rPr>
                 <w:rStyle w:val="IndexLink"/>
@@ -501,7 +501,7 @@
             </w:tabs>
             <w:rPr/>
           </w:pPr>
-          <w:hyperlink w:anchor="__RefHeading___Toc1613_285727793">
+          <w:hyperlink w:anchor="__RefHeading___Toc1613_254375717">
             <w:r>
               <w:rPr>
                 <w:rStyle w:val="IndexLink"/>
@@ -521,7 +521,7 @@
             </w:tabs>
             <w:rPr/>
           </w:pPr>
-          <w:hyperlink w:anchor="__RefHeading___Toc1615_285727793">
+          <w:hyperlink w:anchor="__RefHeading___Toc1615_254375717">
             <w:r>
               <w:rPr>
                 <w:rStyle w:val="IndexLink"/>
@@ -541,7 +541,7 @@
             </w:tabs>
             <w:rPr/>
           </w:pPr>
-          <w:hyperlink w:anchor="__RefHeading___Toc1617_285727793">
+          <w:hyperlink w:anchor="__RefHeading___Toc1617_254375717">
             <w:r>
               <w:rPr>
                 <w:rStyle w:val="IndexLink"/>
@@ -561,7 +561,7 @@
             </w:tabs>
             <w:rPr/>
           </w:pPr>
-          <w:hyperlink w:anchor="__RefHeading___Toc1619_285727793">
+          <w:hyperlink w:anchor="__RefHeading___Toc1619_254375717">
             <w:r>
               <w:rPr>
                 <w:rStyle w:val="IndexLink"/>
@@ -581,7 +581,7 @@
             </w:tabs>
             <w:rPr/>
           </w:pPr>
-          <w:hyperlink w:anchor="__RefHeading___Toc1621_285727793">
+          <w:hyperlink w:anchor="__RefHeading___Toc1621_254375717">
             <w:r>
               <w:rPr>
                 <w:rStyle w:val="IndexLink"/>
@@ -601,7 +601,7 @@
             </w:tabs>
             <w:rPr/>
           </w:pPr>
-          <w:hyperlink w:anchor="__RefHeading___Toc1623_285727793">
+          <w:hyperlink w:anchor="__RefHeading___Toc1623_254375717">
             <w:r>
               <w:rPr>
                 <w:rStyle w:val="IndexLink"/>
@@ -621,7 +621,7 @@
             </w:tabs>
             <w:rPr/>
           </w:pPr>
-          <w:hyperlink w:anchor="__RefHeading___Toc1625_285727793">
+          <w:hyperlink w:anchor="__RefHeading___Toc1625_254375717">
             <w:r>
               <w:rPr>
                 <w:rStyle w:val="IndexLink"/>
@@ -641,7 +641,7 @@
             </w:tabs>
             <w:rPr/>
           </w:pPr>
-          <w:hyperlink w:anchor="__RefHeading___Toc1627_285727793">
+          <w:hyperlink w:anchor="__RefHeading___Toc1627_254375717">
             <w:r>
               <w:rPr>
                 <w:rStyle w:val="IndexLink"/>
@@ -661,7 +661,7 @@
             </w:tabs>
             <w:rPr/>
           </w:pPr>
-          <w:hyperlink w:anchor="__RefHeading___Toc1629_285727793">
+          <w:hyperlink w:anchor="__RefHeading___Toc1629_254375717">
             <w:r>
               <w:rPr>
                 <w:rStyle w:val="IndexLink"/>
@@ -681,7 +681,7 @@
             </w:tabs>
             <w:rPr/>
           </w:pPr>
-          <w:hyperlink w:anchor="__RefHeading___Toc1631_285727793">
+          <w:hyperlink w:anchor="__RefHeading___Toc1631_254375717">
             <w:r>
               <w:rPr>
                 <w:rStyle w:val="IndexLink"/>
@@ -701,7 +701,7 @@
             </w:tabs>
             <w:rPr/>
           </w:pPr>
-          <w:hyperlink w:anchor="__RefHeading___Toc1633_285727793">
+          <w:hyperlink w:anchor="__RefHeading___Toc1633_254375717">
             <w:r>
               <w:rPr>
                 <w:rStyle w:val="IndexLink"/>
@@ -721,7 +721,7 @@
             </w:tabs>
             <w:rPr/>
           </w:pPr>
-          <w:hyperlink w:anchor="__RefHeading___Toc1635_285727793">
+          <w:hyperlink w:anchor="__RefHeading___Toc1635_254375717">
             <w:r>
               <w:rPr>
                 <w:rStyle w:val="IndexLink"/>
@@ -741,7 +741,7 @@
             </w:tabs>
             <w:rPr/>
           </w:pPr>
-          <w:hyperlink w:anchor="__RefHeading___Toc1637_285727793">
+          <w:hyperlink w:anchor="__RefHeading___Toc1637_254375717">
             <w:r>
               <w:rPr>
                 <w:rStyle w:val="IndexLink"/>
@@ -761,7 +761,7 @@
             </w:tabs>
             <w:rPr/>
           </w:pPr>
-          <w:hyperlink w:anchor="__RefHeading___Toc1639_285727793">
+          <w:hyperlink w:anchor="__RefHeading___Toc1639_254375717">
             <w:r>
               <w:rPr>
                 <w:rStyle w:val="IndexLink"/>
@@ -781,7 +781,7 @@
             </w:tabs>
             <w:rPr/>
           </w:pPr>
-          <w:hyperlink w:anchor="__RefHeading___Toc1641_285727793">
+          <w:hyperlink w:anchor="__RefHeading___Toc1641_254375717">
             <w:r>
               <w:rPr>
                 <w:rStyle w:val="IndexLink"/>
@@ -801,7 +801,7 @@
             </w:tabs>
             <w:rPr/>
           </w:pPr>
-          <w:hyperlink w:anchor="__RefHeading___Toc1643_285727793">
+          <w:hyperlink w:anchor="__RefHeading___Toc1643_254375717">
             <w:r>
               <w:rPr>
                 <w:rStyle w:val="IndexLink"/>
@@ -821,7 +821,7 @@
             </w:tabs>
             <w:rPr/>
           </w:pPr>
-          <w:hyperlink w:anchor="__RefHeading___Toc1645_285727793">
+          <w:hyperlink w:anchor="__RefHeading___Toc1645_254375717">
             <w:r>
               <w:rPr>
                 <w:rStyle w:val="IndexLink"/>
@@ -841,7 +841,7 @@
             </w:tabs>
             <w:rPr/>
           </w:pPr>
-          <w:hyperlink w:anchor="__RefHeading___Toc1647_285727793">
+          <w:hyperlink w:anchor="__RefHeading___Toc1647_254375717">
             <w:r>
               <w:rPr>
                 <w:rStyle w:val="IndexLink"/>
@@ -861,7 +861,7 @@
             </w:tabs>
             <w:rPr/>
           </w:pPr>
-          <w:hyperlink w:anchor="__RefHeading___Toc1649_285727793">
+          <w:hyperlink w:anchor="__RefHeading___Toc1649_254375717">
             <w:r>
               <w:rPr>
                 <w:rStyle w:val="IndexLink"/>
@@ -881,7 +881,7 @@
             </w:tabs>
             <w:rPr/>
           </w:pPr>
-          <w:hyperlink w:anchor="__RefHeading___Toc1651_285727793">
+          <w:hyperlink w:anchor="__RefHeading___Toc1651_254375717">
             <w:r>
               <w:rPr>
                 <w:rStyle w:val="IndexLink"/>
@@ -901,7 +901,7 @@
             </w:tabs>
             <w:rPr/>
           </w:pPr>
-          <w:hyperlink w:anchor="__RefHeading___Toc1653_285727793">
+          <w:hyperlink w:anchor="__RefHeading___Toc1653_254375717">
             <w:r>
               <w:rPr>
                 <w:rStyle w:val="IndexLink"/>
@@ -921,7 +921,7 @@
             </w:tabs>
             <w:rPr/>
           </w:pPr>
-          <w:hyperlink w:anchor="__RefHeading___Toc1655_285727793">
+          <w:hyperlink w:anchor="__RefHeading___Toc1655_254375717">
             <w:r>
               <w:rPr>
                 <w:rStyle w:val="IndexLink"/>
@@ -941,7 +941,7 @@
             </w:tabs>
             <w:rPr/>
           </w:pPr>
-          <w:hyperlink w:anchor="__RefHeading___Toc1657_285727793">
+          <w:hyperlink w:anchor="__RefHeading___Toc1657_254375717">
             <w:r>
               <w:rPr>
                 <w:rStyle w:val="IndexLink"/>
@@ -961,7 +961,7 @@
             </w:tabs>
             <w:rPr/>
           </w:pPr>
-          <w:hyperlink w:anchor="__RefHeading___Toc1659_285727793">
+          <w:hyperlink w:anchor="__RefHeading___Toc1659_254375717">
             <w:r>
               <w:rPr>
                 <w:rStyle w:val="IndexLink"/>
@@ -1002,7 +1002,7 @@
         <w:pStyle w:val="Heading1"/>
         <w:rPr/>
       </w:pPr>
-      <w:bookmarkStart w:id="2" w:name="__RefHeading___Toc1593_285727793"/>
+      <w:bookmarkStart w:id="2" w:name="__RefHeading___Toc1593_254375717"/>
       <w:bookmarkEnd w:id="2"/>
       <w:r>
         <w:rPr/>
@@ -1045,7 +1045,7 @@
         <w:pStyle w:val="Heading2"/>
         <w:rPr/>
       </w:pPr>
-      <w:bookmarkStart w:id="3" w:name="__RefHeading___Toc1595_285727793"/>
+      <w:bookmarkStart w:id="3" w:name="__RefHeading___Toc1595_254375717"/>
       <w:bookmarkEnd w:id="3"/>
       <w:r>
         <w:rPr/>
@@ -1077,7 +1077,7 @@
         <w:pStyle w:val="Heading2"/>
         <w:rPr/>
       </w:pPr>
-      <w:bookmarkStart w:id="4" w:name="__RefHeading___Toc1597_285727793"/>
+      <w:bookmarkStart w:id="4" w:name="__RefHeading___Toc1597_254375717"/>
       <w:bookmarkEnd w:id="4"/>
       <w:r>
         <w:rPr/>
@@ -1174,7 +1174,7 @@
         <w:pStyle w:val="Heading2"/>
         <w:rPr/>
       </w:pPr>
-      <w:bookmarkStart w:id="5" w:name="__RefHeading___Toc1599_285727793"/>
+      <w:bookmarkStart w:id="5" w:name="__RefHeading___Toc1599_254375717"/>
       <w:bookmarkEnd w:id="5"/>
       <w:r>
         <w:rPr/>
@@ -1199,7 +1199,7 @@
         <w:pStyle w:val="Heading1"/>
         <w:rPr/>
       </w:pPr>
-      <w:bookmarkStart w:id="6" w:name="__RefHeading___Toc1601_285727793"/>
+      <w:bookmarkStart w:id="6" w:name="__RefHeading___Toc1601_254375717"/>
       <w:bookmarkEnd w:id="6"/>
       <w:r>
         <w:rPr/>
@@ -1244,7 +1244,7 @@
         <w:pStyle w:val="Heading1"/>
         <w:rPr/>
       </w:pPr>
-      <w:bookmarkStart w:id="7" w:name="__RefHeading___Toc1603_285727793"/>
+      <w:bookmarkStart w:id="7" w:name="__RefHeading___Toc1603_254375717"/>
       <w:bookmarkEnd w:id="7"/>
       <w:r>
         <w:rPr/>
@@ -1256,7 +1256,7 @@
         <w:pStyle w:val="Heading2"/>
         <w:rPr/>
       </w:pPr>
-      <w:bookmarkStart w:id="8" w:name="__RefHeading___Toc1605_285727793"/>
+      <w:bookmarkStart w:id="8" w:name="__RefHeading___Toc1605_254375717"/>
       <w:bookmarkEnd w:id="8"/>
       <w:r>
         <w:rPr/>
@@ -1830,7 +1830,7 @@
         <w:pStyle w:val="Heading2"/>
         <w:rPr/>
       </w:pPr>
-      <w:bookmarkStart w:id="9" w:name="__RefHeading___Toc1607_285727793"/>
+      <w:bookmarkStart w:id="9" w:name="__RefHeading___Toc1607_254375717"/>
       <w:bookmarkEnd w:id="9"/>
       <w:r>
         <w:rPr/>
@@ -2547,7 +2547,7 @@
         <w:pStyle w:val="Heading2"/>
         <w:rPr/>
       </w:pPr>
-      <w:bookmarkStart w:id="10" w:name="__RefHeading___Toc1609_285727793"/>
+      <w:bookmarkStart w:id="10" w:name="__RefHeading___Toc1609_254375717"/>
       <w:bookmarkEnd w:id="10"/>
       <w:r>
         <w:rPr/>
@@ -3517,7 +3517,7 @@
         <w:pStyle w:val="Heading1"/>
         <w:rPr/>
       </w:pPr>
-      <w:bookmarkStart w:id="11" w:name="__RefHeading___Toc1611_285727793"/>
+      <w:bookmarkStart w:id="11" w:name="__RefHeading___Toc1611_254375717"/>
       <w:bookmarkEnd w:id="11"/>
       <w:r>
         <w:rPr/>
@@ -3539,7 +3539,7 @@
         <w:pStyle w:val="Heading2"/>
         <w:rPr/>
       </w:pPr>
-      <w:bookmarkStart w:id="12" w:name="__RefHeading___Toc1613_285727793"/>
+      <w:bookmarkStart w:id="12" w:name="__RefHeading___Toc1613_254375717"/>
       <w:bookmarkEnd w:id="12"/>
       <w:r>
         <w:rPr/>
@@ -4731,7 +4731,7 @@
         <w:pStyle w:val="Heading2"/>
         <w:rPr/>
       </w:pPr>
-      <w:bookmarkStart w:id="13" w:name="__RefHeading___Toc1615_285727793"/>
+      <w:bookmarkStart w:id="13" w:name="__RefHeading___Toc1615_254375717"/>
       <w:bookmarkEnd w:id="13"/>
       <w:r>
         <w:rPr/>
@@ -5550,7 +5550,7 @@
         <w:pStyle w:val="Heading2"/>
         <w:rPr/>
       </w:pPr>
-      <w:bookmarkStart w:id="14" w:name="__RefHeading___Toc1617_285727793"/>
+      <w:bookmarkStart w:id="14" w:name="__RefHeading___Toc1617_254375717"/>
       <w:bookmarkEnd w:id="14"/>
       <w:r>
         <w:rPr/>
@@ -6354,7 +6354,7 @@
         <w:pStyle w:val="Heading2"/>
         <w:rPr/>
       </w:pPr>
-      <w:bookmarkStart w:id="15" w:name="__RefHeading___Toc1619_285727793"/>
+      <w:bookmarkStart w:id="15" w:name="__RefHeading___Toc1619_254375717"/>
       <w:bookmarkEnd w:id="15"/>
       <w:r>
         <w:rPr/>
@@ -7245,7 +7245,7 @@
         <w:pStyle w:val="Heading2"/>
         <w:rPr/>
       </w:pPr>
-      <w:bookmarkStart w:id="16" w:name="__RefHeading___Toc1621_285727793"/>
+      <w:bookmarkStart w:id="16" w:name="__RefHeading___Toc1621_254375717"/>
       <w:bookmarkEnd w:id="16"/>
       <w:r>
         <w:rPr/>
@@ -8687,7 +8687,7 @@
       </w:pPr>
       <w:r>
         <w:rPr/>
-        <w:t>La mitad de los riesgos son críticos, pero ninguno exige tecnología cara. Separar la red de los clientes de la del negocio, cambiar las credenciales de fábrica, cerrar el acceso remoto del grabador y empezar a hacer copias son medidas de coste casi nulo. Que no se hayan tomado no se debe a la falta de dinero, sino a que nadie en la empresa tiene el conocimiento ni el encargo de hacerlo. Esa es la necesidad de fondo que un técnico de sistemas puede cubrir.</w:t>
+        <w:t>Seis de los diez riesgos son críticos, pero ninguno exige tecnología cara. Separar la red de los clientes de la del negocio, cambiar las credenciales de fábrica, cerrar el acceso remoto del grabador y empezar a hacer copias son medidas de coste casi nulo. Que no se hayan tomado no se debe a la falta de dinero, sino a que nadie en la empresa tiene el conocimiento ni el encargo de hacerlo. Esa es la necesidad de fondo que un técnico de sistemas puede cubrir.</w:t>
       </w:r>
       <w:r>
         <w:br w:type="page"/>
@@ -8698,7 +8698,7 @@
         <w:pStyle w:val="Heading1"/>
         <w:rPr/>
       </w:pPr>
-      <w:bookmarkStart w:id="17" w:name="__RefHeading___Toc1623_285727793"/>
+      <w:bookmarkStart w:id="17" w:name="__RefHeading___Toc1623_254375717"/>
       <w:bookmarkEnd w:id="17"/>
       <w:r>
         <w:rPr/>
@@ -9326,7 +9326,7 @@
         <w:pStyle w:val="Heading2"/>
         <w:rPr/>
       </w:pPr>
-      <w:bookmarkStart w:id="18" w:name="__RefHeading___Toc1625_285727793"/>
+      <w:bookmarkStart w:id="18" w:name="__RefHeading___Toc1625_254375717"/>
       <w:bookmarkEnd w:id="18"/>
       <w:r>
         <w:rPr/>
@@ -9358,7 +9358,7 @@
         <w:pStyle w:val="Heading2"/>
         <w:rPr/>
       </w:pPr>
-      <w:bookmarkStart w:id="19" w:name="__RefHeading___Toc1627_285727793"/>
+      <w:bookmarkStart w:id="19" w:name="__RefHeading___Toc1627_254375717"/>
       <w:bookmarkEnd w:id="19"/>
       <w:r>
         <w:rPr/>
@@ -9380,7 +9380,7 @@
         <w:pStyle w:val="Heading2"/>
         <w:rPr/>
       </w:pPr>
-      <w:bookmarkStart w:id="20" w:name="__RefHeading___Toc1629_285727793"/>
+      <w:bookmarkStart w:id="20" w:name="__RefHeading___Toc1629_254375717"/>
       <w:bookmarkEnd w:id="20"/>
       <w:r>
         <w:rPr/>
@@ -9402,7 +9402,7 @@
         <w:pStyle w:val="Heading2"/>
         <w:rPr/>
       </w:pPr>
-      <w:bookmarkStart w:id="21" w:name="__RefHeading___Toc1631_285727793"/>
+      <w:bookmarkStart w:id="21" w:name="__RefHeading___Toc1631_254375717"/>
       <w:bookmarkEnd w:id="21"/>
       <w:r>
         <w:rPr/>
@@ -9424,7 +9424,7 @@
         <w:pStyle w:val="Heading2"/>
         <w:rPr/>
       </w:pPr>
-      <w:bookmarkStart w:id="22" w:name="__RefHeading___Toc1633_285727793"/>
+      <w:bookmarkStart w:id="22" w:name="__RefHeading___Toc1633_254375717"/>
       <w:bookmarkEnd w:id="22"/>
       <w:r>
         <w:rPr/>
@@ -9449,7 +9449,7 @@
         <w:pStyle w:val="Heading1"/>
         <w:rPr/>
       </w:pPr>
-      <w:bookmarkStart w:id="23" w:name="__RefHeading___Toc1635_285727793"/>
+      <w:bookmarkStart w:id="23" w:name="__RefHeading___Toc1635_254375717"/>
       <w:bookmarkEnd w:id="23"/>
       <w:r>
         <w:rPr/>
@@ -9471,7 +9471,7 @@
         <w:pStyle w:val="Heading2"/>
         <w:rPr/>
       </w:pPr>
-      <w:bookmarkStart w:id="24" w:name="__RefHeading___Toc1637_285727793"/>
+      <w:bookmarkStart w:id="24" w:name="__RefHeading___Toc1637_254375717"/>
       <w:bookmarkEnd w:id="24"/>
       <w:r>
         <w:rPr/>
@@ -9951,7 +9951,7 @@
         <w:pStyle w:val="Heading2"/>
         <w:rPr/>
       </w:pPr>
-      <w:bookmarkStart w:id="25" w:name="__RefHeading___Toc1639_285727793"/>
+      <w:bookmarkStart w:id="25" w:name="__RefHeading___Toc1639_254375717"/>
       <w:bookmarkEnd w:id="25"/>
       <w:r>
         <w:rPr/>
@@ -10745,7 +10745,7 @@
         <w:pStyle w:val="Heading2"/>
         <w:rPr/>
       </w:pPr>
-      <w:bookmarkStart w:id="26" w:name="__RefHeading___Toc1641_285727793"/>
+      <w:bookmarkStart w:id="26" w:name="__RefHeading___Toc1641_254375717"/>
       <w:bookmarkEnd w:id="26"/>
       <w:r>
         <w:rPr/>
@@ -10780,7 +10780,7 @@
         <w:pStyle w:val="Heading1"/>
         <w:rPr/>
       </w:pPr>
-      <w:bookmarkStart w:id="27" w:name="__RefHeading___Toc1643_285727793"/>
+      <w:bookmarkStart w:id="27" w:name="__RefHeading___Toc1643_254375717"/>
       <w:bookmarkEnd w:id="27"/>
       <w:r>
         <w:rPr/>
@@ -11671,7 +11671,7 @@
         <w:pStyle w:val="Heading2"/>
         <w:rPr/>
       </w:pPr>
-      <w:bookmarkStart w:id="28" w:name="__RefHeading___Toc1645_285727793"/>
+      <w:bookmarkStart w:id="28" w:name="__RefHeading___Toc1645_254375717"/>
       <w:bookmarkEnd w:id="28"/>
       <w:r>
         <w:rPr/>
@@ -11693,7 +11693,7 @@
         <w:pStyle w:val="Heading2"/>
         <w:rPr/>
       </w:pPr>
-      <w:bookmarkStart w:id="29" w:name="__RefHeading___Toc1647_285727793"/>
+      <w:bookmarkStart w:id="29" w:name="__RefHeading___Toc1647_254375717"/>
       <w:bookmarkEnd w:id="29"/>
       <w:r>
         <w:rPr/>
@@ -12257,7 +12257,7 @@
         <w:pStyle w:val="Heading2"/>
         <w:rPr/>
       </w:pPr>
-      <w:bookmarkStart w:id="30" w:name="__RefHeading___Toc1649_285727793"/>
+      <w:bookmarkStart w:id="30" w:name="__RefHeading___Toc1649_254375717"/>
       <w:bookmarkEnd w:id="30"/>
       <w:r>
         <w:rPr/>
@@ -12801,7 +12801,7 @@
         <w:pStyle w:val="Heading2"/>
         <w:rPr/>
       </w:pPr>
-      <w:bookmarkStart w:id="31" w:name="__RefHeading___Toc1651_285727793"/>
+      <w:bookmarkStart w:id="31" w:name="__RefHeading___Toc1651_254375717"/>
       <w:bookmarkEnd w:id="31"/>
       <w:r>
         <w:rPr/>
@@ -12826,7 +12826,7 @@
         <w:pStyle w:val="Heading1"/>
         <w:rPr/>
       </w:pPr>
-      <w:bookmarkStart w:id="32" w:name="__RefHeading___Toc1653_285727793"/>
+      <w:bookmarkStart w:id="32" w:name="__RefHeading___Toc1653_254375717"/>
       <w:bookmarkEnd w:id="32"/>
       <w:r>
         <w:rPr/>
@@ -13477,7 +13477,7 @@
         <w:pStyle w:val="Heading1"/>
         <w:rPr/>
       </w:pPr>
-      <w:bookmarkStart w:id="33" w:name="__RefHeading___Toc1655_285727793"/>
+      <w:bookmarkStart w:id="33" w:name="__RefHeading___Toc1655_254375717"/>
       <w:bookmarkEnd w:id="33"/>
       <w:r>
         <w:rPr/>
@@ -13797,7 +13797,7 @@
         <w:pStyle w:val="Heading2"/>
         <w:rPr/>
       </w:pPr>
-      <w:bookmarkStart w:id="34" w:name="__RefHeading___Toc1657_285727793"/>
+      <w:bookmarkStart w:id="34" w:name="__RefHeading___Toc1657_254375717"/>
       <w:bookmarkEnd w:id="34"/>
       <w:r>
         <w:rPr/>
@@ -14164,7 +14164,7 @@
         <w:pStyle w:val="Heading1"/>
         <w:rPr/>
       </w:pPr>
-      <w:bookmarkStart w:id="35" w:name="__RefHeading___Toc1659_285727793"/>
+      <w:bookmarkStart w:id="35" w:name="__RefHeading___Toc1659_254375717"/>
       <w:bookmarkEnd w:id="35"/>
       <w:r>
         <w:rPr/>

</xml_diff>

<commit_message>
Reto 1: arreglo de las incoherencias internas del informe
Informe: una sola tableta de reparto (tablas 3, 4.4 y 12); microempresa sin
afirmar que esté entre las de dos asalariados; el PC del TPV es el único equipo con
la base de datos de ventas, facturas y cierres, no con «los datos del negocio»;
segmentos de red = negocio, cocina, cámaras e invitados (tablas 12 y 13); PC de 2015
con más de diez años; el −0,9 % es de la restauración; las medidas más urgentes (no
todas) son de coste casi nulo; 93 % y 7,5 % marcados como cifras redondeadas de la
fuente (suman 100,5 por sí solas); título de 7.3 recoge protección de datos; pie de la
tabla 6 dice que es ficticio.
Diapositivas y guion alineados: «sectores reasignados», «invitados», y el cierre habla
de la base de datos de ventas. Verificado con una auditoría de 7 lentes y 2 verificadores
por hallazgo (29 hallazgos: 8 aplicados, el resto falsos positivos o decisiones de contenido).

Co-Authored-By: Claude Sonnet 5.5 <noreply@anthropic.com>
</commit_message>
<xml_diff>
--- a/docs/reto1/reto1_contexto_tecnologico.docx
+++ b/docs/reto1/reto1_contexto_tecnologico.docx
@@ -170,7 +170,7 @@
         <w:pStyle w:val="Heading1"/>
         <w:rPr/>
       </w:pPr>
-      <w:bookmarkStart w:id="0" w:name="__RefHeading___Toc1589_254375717"/>
+      <w:bookmarkStart w:id="0" w:name="__RefHeading___Toc1589_2009533110"/>
       <w:bookmarkEnd w:id="0"/>
       <w:r>
         <w:rPr/>
@@ -193,7 +193,7 @@
         <w:pStyle w:val="Heading1"/>
         <w:rPr/>
       </w:pPr>
-      <w:bookmarkStart w:id="1" w:name="__RefHeading___Toc1591_254375717"/>
+      <w:bookmarkStart w:id="1" w:name="__RefHeading___Toc1591_2009533110"/>
       <w:bookmarkEnd w:id="1"/>
       <w:r>
         <w:rPr/>
@@ -261,7 +261,7 @@
             </w:rPr>
             <w:fldChar w:fldCharType="separate"/>
           </w:r>
-          <w:hyperlink w:anchor="__RefHeading___Toc1589_254375717">
+          <w:hyperlink w:anchor="__RefHeading___Toc1589_2009533110">
             <w:r>
               <w:rPr>
                 <w:rStyle w:val="IndexLink"/>
@@ -281,7 +281,7 @@
             </w:tabs>
             <w:rPr/>
           </w:pPr>
-          <w:hyperlink w:anchor="__RefHeading___Toc1591_254375717">
+          <w:hyperlink w:anchor="__RefHeading___Toc1591_2009533110">
             <w:r>
               <w:rPr>
                 <w:rStyle w:val="IndexLink"/>
@@ -301,7 +301,7 @@
             </w:tabs>
             <w:rPr/>
           </w:pPr>
-          <w:hyperlink w:anchor="__RefHeading___Toc1593_254375717">
+          <w:hyperlink w:anchor="__RefHeading___Toc1593_2009533110">
             <w:r>
               <w:rPr>
                 <w:rStyle w:val="IndexLink"/>
@@ -321,7 +321,7 @@
             </w:tabs>
             <w:rPr/>
           </w:pPr>
-          <w:hyperlink w:anchor="__RefHeading___Toc1595_254375717">
+          <w:hyperlink w:anchor="__RefHeading___Toc1595_2009533110">
             <w:r>
               <w:rPr>
                 <w:rStyle w:val="IndexLink"/>
@@ -341,7 +341,7 @@
             </w:tabs>
             <w:rPr/>
           </w:pPr>
-          <w:hyperlink w:anchor="__RefHeading___Toc1597_254375717">
+          <w:hyperlink w:anchor="__RefHeading___Toc1597_2009533110">
             <w:r>
               <w:rPr>
                 <w:rStyle w:val="IndexLink"/>
@@ -361,7 +361,7 @@
             </w:tabs>
             <w:rPr/>
           </w:pPr>
-          <w:hyperlink w:anchor="__RefHeading___Toc1599_254375717">
+          <w:hyperlink w:anchor="__RefHeading___Toc1599_2009533110">
             <w:r>
               <w:rPr>
                 <w:rStyle w:val="IndexLink"/>
@@ -381,7 +381,7 @@
             </w:tabs>
             <w:rPr/>
           </w:pPr>
-          <w:hyperlink w:anchor="__RefHeading___Toc1601_254375717">
+          <w:hyperlink w:anchor="__RefHeading___Toc1601_2009533110">
             <w:r>
               <w:rPr>
                 <w:rStyle w:val="IndexLink"/>
@@ -401,7 +401,7 @@
             </w:tabs>
             <w:rPr/>
           </w:pPr>
-          <w:hyperlink w:anchor="__RefHeading___Toc1603_254375717">
+          <w:hyperlink w:anchor="__RefHeading___Toc1603_2009533110">
             <w:r>
               <w:rPr>
                 <w:rStyle w:val="IndexLink"/>
@@ -421,7 +421,7 @@
             </w:tabs>
             <w:rPr/>
           </w:pPr>
-          <w:hyperlink w:anchor="__RefHeading___Toc1605_254375717">
+          <w:hyperlink w:anchor="__RefHeading___Toc1605_2009533110">
             <w:r>
               <w:rPr>
                 <w:rStyle w:val="IndexLink"/>
@@ -441,7 +441,7 @@
             </w:tabs>
             <w:rPr/>
           </w:pPr>
-          <w:hyperlink w:anchor="__RefHeading___Toc1607_254375717">
+          <w:hyperlink w:anchor="__RefHeading___Toc1607_2009533110">
             <w:r>
               <w:rPr>
                 <w:rStyle w:val="IndexLink"/>
@@ -461,7 +461,7 @@
             </w:tabs>
             <w:rPr/>
           </w:pPr>
-          <w:hyperlink w:anchor="__RefHeading___Toc1609_254375717">
+          <w:hyperlink w:anchor="__RefHeading___Toc1609_2009533110">
             <w:r>
               <w:rPr>
                 <w:rStyle w:val="IndexLink"/>
@@ -481,7 +481,7 @@
             </w:tabs>
             <w:rPr/>
           </w:pPr>
-          <w:hyperlink w:anchor="__RefHeading___Toc1611_254375717">
+          <w:hyperlink w:anchor="__RefHeading___Toc1611_2009533110">
             <w:r>
               <w:rPr>
                 <w:rStyle w:val="IndexLink"/>
@@ -501,7 +501,7 @@
             </w:tabs>
             <w:rPr/>
           </w:pPr>
-          <w:hyperlink w:anchor="__RefHeading___Toc1613_254375717">
+          <w:hyperlink w:anchor="__RefHeading___Toc1613_2009533110">
             <w:r>
               <w:rPr>
                 <w:rStyle w:val="IndexLink"/>
@@ -521,7 +521,7 @@
             </w:tabs>
             <w:rPr/>
           </w:pPr>
-          <w:hyperlink w:anchor="__RefHeading___Toc1615_254375717">
+          <w:hyperlink w:anchor="__RefHeading___Toc1615_2009533110">
             <w:r>
               <w:rPr>
                 <w:rStyle w:val="IndexLink"/>
@@ -541,7 +541,7 @@
             </w:tabs>
             <w:rPr/>
           </w:pPr>
-          <w:hyperlink w:anchor="__RefHeading___Toc1617_254375717">
+          <w:hyperlink w:anchor="__RefHeading___Toc1617_2009533110">
             <w:r>
               <w:rPr>
                 <w:rStyle w:val="IndexLink"/>
@@ -561,7 +561,7 @@
             </w:tabs>
             <w:rPr/>
           </w:pPr>
-          <w:hyperlink w:anchor="__RefHeading___Toc1619_254375717">
+          <w:hyperlink w:anchor="__RefHeading___Toc1619_2009533110">
             <w:r>
               <w:rPr>
                 <w:rStyle w:val="IndexLink"/>
@@ -581,7 +581,7 @@
             </w:tabs>
             <w:rPr/>
           </w:pPr>
-          <w:hyperlink w:anchor="__RefHeading___Toc1621_254375717">
+          <w:hyperlink w:anchor="__RefHeading___Toc1621_2009533110">
             <w:r>
               <w:rPr>
                 <w:rStyle w:val="IndexLink"/>
@@ -601,7 +601,7 @@
             </w:tabs>
             <w:rPr/>
           </w:pPr>
-          <w:hyperlink w:anchor="__RefHeading___Toc1623_254375717">
+          <w:hyperlink w:anchor="__RefHeading___Toc1623_2009533110">
             <w:r>
               <w:rPr>
                 <w:rStyle w:val="IndexLink"/>
@@ -621,7 +621,7 @@
             </w:tabs>
             <w:rPr/>
           </w:pPr>
-          <w:hyperlink w:anchor="__RefHeading___Toc1625_254375717">
+          <w:hyperlink w:anchor="__RefHeading___Toc1625_2009533110">
             <w:r>
               <w:rPr>
                 <w:rStyle w:val="IndexLink"/>
@@ -641,7 +641,7 @@
             </w:tabs>
             <w:rPr/>
           </w:pPr>
-          <w:hyperlink w:anchor="__RefHeading___Toc1627_254375717">
+          <w:hyperlink w:anchor="__RefHeading___Toc1627_2009533110">
             <w:r>
               <w:rPr>
                 <w:rStyle w:val="IndexLink"/>
@@ -661,7 +661,7 @@
             </w:tabs>
             <w:rPr/>
           </w:pPr>
-          <w:hyperlink w:anchor="__RefHeading___Toc1629_254375717">
+          <w:hyperlink w:anchor="__RefHeading___Toc1629_2009533110">
             <w:r>
               <w:rPr>
                 <w:rStyle w:val="IndexLink"/>
@@ -681,7 +681,7 @@
             </w:tabs>
             <w:rPr/>
           </w:pPr>
-          <w:hyperlink w:anchor="__RefHeading___Toc1631_254375717">
+          <w:hyperlink w:anchor="__RefHeading___Toc1631_2009533110">
             <w:r>
               <w:rPr>
                 <w:rStyle w:val="IndexLink"/>
@@ -701,7 +701,7 @@
             </w:tabs>
             <w:rPr/>
           </w:pPr>
-          <w:hyperlink w:anchor="__RefHeading___Toc1633_254375717">
+          <w:hyperlink w:anchor="__RefHeading___Toc1633_2009533110">
             <w:r>
               <w:rPr>
                 <w:rStyle w:val="IndexLink"/>
@@ -721,7 +721,7 @@
             </w:tabs>
             <w:rPr/>
           </w:pPr>
-          <w:hyperlink w:anchor="__RefHeading___Toc1635_254375717">
+          <w:hyperlink w:anchor="__RefHeading___Toc1635_2009533110">
             <w:r>
               <w:rPr>
                 <w:rStyle w:val="IndexLink"/>
@@ -741,7 +741,7 @@
             </w:tabs>
             <w:rPr/>
           </w:pPr>
-          <w:hyperlink w:anchor="__RefHeading___Toc1637_254375717">
+          <w:hyperlink w:anchor="__RefHeading___Toc1637_2009533110">
             <w:r>
               <w:rPr>
                 <w:rStyle w:val="IndexLink"/>
@@ -761,7 +761,7 @@
             </w:tabs>
             <w:rPr/>
           </w:pPr>
-          <w:hyperlink w:anchor="__RefHeading___Toc1639_254375717">
+          <w:hyperlink w:anchor="__RefHeading___Toc1639_2009533110">
             <w:r>
               <w:rPr>
                 <w:rStyle w:val="IndexLink"/>
@@ -781,7 +781,7 @@
             </w:tabs>
             <w:rPr/>
           </w:pPr>
-          <w:hyperlink w:anchor="__RefHeading___Toc1641_254375717">
+          <w:hyperlink w:anchor="__RefHeading___Toc1641_2009533110">
             <w:r>
               <w:rPr>
                 <w:rStyle w:val="IndexLink"/>
@@ -801,7 +801,7 @@
             </w:tabs>
             <w:rPr/>
           </w:pPr>
-          <w:hyperlink w:anchor="__RefHeading___Toc1643_254375717">
+          <w:hyperlink w:anchor="__RefHeading___Toc1643_2009533110">
             <w:r>
               <w:rPr>
                 <w:rStyle w:val="IndexLink"/>
@@ -821,7 +821,7 @@
             </w:tabs>
             <w:rPr/>
           </w:pPr>
-          <w:hyperlink w:anchor="__RefHeading___Toc1645_254375717">
+          <w:hyperlink w:anchor="__RefHeading___Toc1645_2009533110">
             <w:r>
               <w:rPr>
                 <w:rStyle w:val="IndexLink"/>
@@ -841,7 +841,7 @@
             </w:tabs>
             <w:rPr/>
           </w:pPr>
-          <w:hyperlink w:anchor="__RefHeading___Toc1647_254375717">
+          <w:hyperlink w:anchor="__RefHeading___Toc1647_2009533110">
             <w:r>
               <w:rPr>
                 <w:rStyle w:val="IndexLink"/>
@@ -861,14 +861,14 @@
             </w:tabs>
             <w:rPr/>
           </w:pPr>
-          <w:hyperlink w:anchor="__RefHeading___Toc1649_254375717">
+          <w:hyperlink w:anchor="__RefHeading___Toc1649_2009533110">
             <w:r>
               <w:rPr>
                 <w:rStyle w:val="IndexLink"/>
               </w:rPr>
-              <w:t>7.3. Obligaciones fiscales, laborales y de prevención de riesgos</w:t>
+              <w:t>7.3. Obligaciones fiscales, laborales, de prevención de riesgos y de protección de datos</w:t>
               <w:tab/>
-              <w:t>24</w:t>
+              <w:t>25</w:t>
             </w:r>
           </w:hyperlink>
         </w:p>
@@ -881,7 +881,7 @@
             </w:tabs>
             <w:rPr/>
           </w:pPr>
-          <w:hyperlink w:anchor="__RefHeading___Toc1651_254375717">
+          <w:hyperlink w:anchor="__RefHeading___Toc1651_2009533110">
             <w:r>
               <w:rPr>
                 <w:rStyle w:val="IndexLink"/>
@@ -901,7 +901,7 @@
             </w:tabs>
             <w:rPr/>
           </w:pPr>
-          <w:hyperlink w:anchor="__RefHeading___Toc1653_254375717">
+          <w:hyperlink w:anchor="__RefHeading___Toc1653_2009533110">
             <w:r>
               <w:rPr>
                 <w:rStyle w:val="IndexLink"/>
@@ -921,7 +921,7 @@
             </w:tabs>
             <w:rPr/>
           </w:pPr>
-          <w:hyperlink w:anchor="__RefHeading___Toc1655_254375717">
+          <w:hyperlink w:anchor="__RefHeading___Toc1655_2009533110">
             <w:r>
               <w:rPr>
                 <w:rStyle w:val="IndexLink"/>
@@ -941,7 +941,7 @@
             </w:tabs>
             <w:rPr/>
           </w:pPr>
-          <w:hyperlink w:anchor="__RefHeading___Toc1657_254375717">
+          <w:hyperlink w:anchor="__RefHeading___Toc1657_2009533110">
             <w:r>
               <w:rPr>
                 <w:rStyle w:val="IndexLink"/>
@@ -961,7 +961,7 @@
             </w:tabs>
             <w:rPr/>
           </w:pPr>
-          <w:hyperlink w:anchor="__RefHeading___Toc1659_254375717">
+          <w:hyperlink w:anchor="__RefHeading___Toc1659_2009533110">
             <w:r>
               <w:rPr>
                 <w:rStyle w:val="IndexLink"/>
@@ -1002,7 +1002,7 @@
         <w:pStyle w:val="Heading1"/>
         <w:rPr/>
       </w:pPr>
-      <w:bookmarkStart w:id="2" w:name="__RefHeading___Toc1593_254375717"/>
+      <w:bookmarkStart w:id="2" w:name="__RefHeading___Toc1593_2009533110"/>
       <w:bookmarkEnd w:id="2"/>
       <w:r>
         <w:rPr/>
@@ -1045,7 +1045,7 @@
         <w:pStyle w:val="Heading2"/>
         <w:rPr/>
       </w:pPr>
-      <w:bookmarkStart w:id="3" w:name="__RefHeading___Toc1595_254375717"/>
+      <w:bookmarkStart w:id="3" w:name="__RefHeading___Toc1595_2009533110"/>
       <w:bookmarkEnd w:id="3"/>
       <w:r>
         <w:rPr/>
@@ -1077,7 +1077,7 @@
         <w:pStyle w:val="Heading2"/>
         <w:rPr/>
       </w:pPr>
-      <w:bookmarkStart w:id="4" w:name="__RefHeading___Toc1597_254375717"/>
+      <w:bookmarkStart w:id="4" w:name="__RefHeading___Toc1597_2009533110"/>
       <w:bookmarkEnd w:id="4"/>
       <w:r>
         <w:rPr/>
@@ -1174,7 +1174,7 @@
         <w:pStyle w:val="Heading2"/>
         <w:rPr/>
       </w:pPr>
-      <w:bookmarkStart w:id="5" w:name="__RefHeading___Toc1599_254375717"/>
+      <w:bookmarkStart w:id="5" w:name="__RefHeading___Toc1599_2009533110"/>
       <w:bookmarkEnd w:id="5"/>
       <w:r>
         <w:rPr/>
@@ -1199,7 +1199,7 @@
         <w:pStyle w:val="Heading1"/>
         <w:rPr/>
       </w:pPr>
-      <w:bookmarkStart w:id="6" w:name="__RefHeading___Toc1601_254375717"/>
+      <w:bookmarkStart w:id="6" w:name="__RefHeading___Toc1601_2009533110"/>
       <w:bookmarkEnd w:id="6"/>
       <w:r>
         <w:rPr/>
@@ -1244,7 +1244,7 @@
         <w:pStyle w:val="Heading1"/>
         <w:rPr/>
       </w:pPr>
-      <w:bookmarkStart w:id="7" w:name="__RefHeading___Toc1603_254375717"/>
+      <w:bookmarkStart w:id="7" w:name="__RefHeading___Toc1603_2009533110"/>
       <w:bookmarkEnd w:id="7"/>
       <w:r>
         <w:rPr/>
@@ -1256,7 +1256,7 @@
         <w:pStyle w:val="Heading2"/>
         <w:rPr/>
       </w:pPr>
-      <w:bookmarkStart w:id="8" w:name="__RefHeading___Toc1605_254375717"/>
+      <w:bookmarkStart w:id="8" w:name="__RefHeading___Toc1605_2009533110"/>
       <w:bookmarkEnd w:id="8"/>
       <w:r>
         <w:rPr/>
@@ -1822,7 +1822,7 @@
       </w:pPr>
       <w:r>
         <w:rPr/>
-        <w:t>La empresa pertenece al segmento más numeroso de la hostelería española: la restauración independiente, que reúne el 93 % de los establecimientos frente al 7,5 % de la restauración organizada en cadenas (Profesional Horeca, 2025). Por tamaño es una microempresa, como el 81,6 % de las empresas españolas, que tienen dos asalariados o menos (Instituto Nacional de Estadística [INE], 2025a). Esta clasificación importa para el proyecto: el cliente típico de una solución tecnológica en este sector no tiene a nadie que sepa de informática, y cualquier infraestructura que se le proponga tiene que poder funcionar sin un técnico presente.</w:t>
+        <w:t>La empresa pertenece al segmento más numeroso de la hostelería española: la restauración independiente, que reúne en torno al 93 % de los establecimientos frente al 7,5 % de la restauración organizada en cadenas (Profesional Horeca, 2025; cifras redondeadas, tal como las publica la fuente). Por tamaño es una microempresa, con menos de diez personas, y en España las más pequeñas son la gran mayoría: el 81,6 % de las empresas tiene dos asalariados o menos (Instituto Nacional de Estadística [INE], 2025a). Esta clasificación importa para el proyecto: el cliente típico de una solución tecnológica en este sector no tiene a nadie que sepa de informática, y cualquier infraestructura que se le proponga tiene que poder funcionar sin un técnico presente.</w:t>
       </w:r>
     </w:p>
     <w:p>
@@ -1830,7 +1830,7 @@
         <w:pStyle w:val="Heading2"/>
         <w:rPr/>
       </w:pPr>
-      <w:bookmarkStart w:id="9" w:name="__RefHeading___Toc1607_254375717"/>
+      <w:bookmarkStart w:id="9" w:name="__RefHeading___Toc1607_2009533110"/>
       <w:bookmarkEnd w:id="9"/>
       <w:r>
         <w:rPr/>
@@ -2547,7 +2547,7 @@
         <w:pStyle w:val="Heading2"/>
         <w:rPr/>
       </w:pPr>
-      <w:bookmarkStart w:id="10" w:name="__RefHeading___Toc1609_254375717"/>
+      <w:bookmarkStart w:id="10" w:name="__RefHeading___Toc1609_2009533110"/>
       <w:bookmarkEnd w:id="10"/>
       <w:r>
         <w:rPr/>
@@ -2969,7 +2969,7 @@
                 <w:sz w:val="19"/>
                 <w:szCs w:val="19"/>
               </w:rPr>
-              <w:t>Tableta de cada plataforma; se copia a mano en papel</w:t>
+              <w:t>Tableta de reparto, con los pedidos de las dos plataformas; se copia a mano en papel</w:t>
             </w:r>
           </w:p>
         </w:tc>
@@ -3517,7 +3517,7 @@
         <w:pStyle w:val="Heading1"/>
         <w:rPr/>
       </w:pPr>
-      <w:bookmarkStart w:id="11" w:name="__RefHeading___Toc1611_254375717"/>
+      <w:bookmarkStart w:id="11" w:name="__RefHeading___Toc1611_2009533110"/>
       <w:bookmarkEnd w:id="11"/>
       <w:r>
         <w:rPr/>
@@ -3539,7 +3539,7 @@
         <w:pStyle w:val="Heading2"/>
         <w:rPr/>
       </w:pPr>
-      <w:bookmarkStart w:id="12" w:name="__RefHeading___Toc1613_254375717"/>
+      <w:bookmarkStart w:id="12" w:name="__RefHeading___Toc1613_2009533110"/>
       <w:bookmarkEnd w:id="12"/>
       <w:r>
         <w:rPr/>
@@ -4713,7 +4713,7 @@
       </w:pPr>
       <w:r>
         <w:rPr/>
-        <w:t>Desde el punto de vista del hardware destacan tres hechos. El primero es que el único equipo que guarda datos del negocio, el PC del TPV, es el más viejo y el que tiene el disco en peor estado. El segundo es que no hay ningún sistema de alimentación ininterrumpida (SAI), de modo que un corte de luz en pleno servicio apaga el TPV y puede corromper su base de datos. El tercero es la ubicación del equipamiento de red: router y grabador comparten balda en un almacén caluroso, junto a la cámara frigorífica y cerca de la salida de humos de la cocina. No es un centro de proceso de datos, ni hace falta que lo sea, pero las condiciones ambientales (calor, grasa y humedad) acortan la vida de los equipos, y la obligación de cuidar esas condiciones también se aplica a un armario de comunicaciones pequeño.</w:t>
+        <w:t>Desde el punto de vista del hardware destacan tres hechos. El primero es que el único equipo que guarda la base de datos de ventas, facturas y cierres de caja, el PC del TPV, es el más viejo y el que tiene el disco en peor estado. El segundo es que no hay ningún sistema de alimentación ininterrumpida (SAI), de modo que un corte de luz en pleno servicio apaga el TPV y puede corromper su base de datos. El tercero es la ubicación del equipamiento de red: router y grabador comparten balda en un almacén caluroso, junto a la cámara frigorífica y cerca de la salida de humos de la cocina. No es un centro de proceso de datos, ni hace falta que lo sea, pero las condiciones ambientales (calor, grasa y humedad) acortan la vida de los equipos, y la obligación de cuidar esas condiciones también se aplica a un armario de comunicaciones pequeño.</w:t>
       </w:r>
     </w:p>
     <w:p>
@@ -4731,7 +4731,7 @@
         <w:pStyle w:val="Heading2"/>
         <w:rPr/>
       </w:pPr>
-      <w:bookmarkStart w:id="13" w:name="__RefHeading___Toc1615_254375717"/>
+      <w:bookmarkStart w:id="13" w:name="__RefHeading___Toc1615_2009533110"/>
       <w:bookmarkEnd w:id="13"/>
       <w:r>
         <w:rPr/>
@@ -5550,7 +5550,7 @@
         <w:pStyle w:val="Heading2"/>
         <w:rPr/>
       </w:pPr>
-      <w:bookmarkStart w:id="14" w:name="__RefHeading___Toc1617_254375717"/>
+      <w:bookmarkStart w:id="14" w:name="__RefHeading___Toc1617_2009533110"/>
       <w:bookmarkEnd w:id="14"/>
       <w:r>
         <w:rPr/>
@@ -6326,7 +6326,7 @@
           <w:sz w:val="20"/>
           <w:szCs w:val="20"/>
         </w:rPr>
-        <w:t xml:space="preserve"> Fechas de soporte de Windows según Microsoft (2025).</w:t>
+        <w:t xml:space="preserve"> Equipos y versiones del escenario ficticio; fechas de soporte de Windows según Microsoft (2025).</w:t>
       </w:r>
     </w:p>
     <w:p>
@@ -6354,7 +6354,7 @@
         <w:pStyle w:val="Heading2"/>
         <w:rPr/>
       </w:pPr>
-      <w:bookmarkStart w:id="15" w:name="__RefHeading___Toc1619_254375717"/>
+      <w:bookmarkStart w:id="15" w:name="__RefHeading___Toc1619_2009533110"/>
       <w:bookmarkEnd w:id="15"/>
       <w:r>
         <w:rPr/>
@@ -6960,7 +6960,7 @@
                 <w:sz w:val="19"/>
                 <w:szCs w:val="19"/>
               </w:rPr>
-              <w:t>Nube de cada plataforma y su tableta</w:t>
+              <w:t>Nube de cada plataforma y tableta de reparto</w:t>
             </w:r>
           </w:p>
         </w:tc>
@@ -7237,7 +7237,7 @@
       </w:pPr>
       <w:r>
         <w:rPr/>
-        <w:t>Llama la atención que el local no tiene ninguna copia de seguridad. La única base de datos con ventas, facturas y cierres de caja está en el disco mecánico de un equipo de diez años. El resto de la información del negocio está en cuentas personales, que dependen de que el encargado siga en la empresa y de que no pierda el móvil.</w:t>
+        <w:t>Llama la atención que el local no tiene ninguna copia de seguridad. La única base de datos con ventas, facturas y cierres de caja está en el disco mecánico de un equipo de 2015, con más de diez años. El resto de la información del negocio está en cuentas personales, que dependen de que el encargado siga en la empresa y de que no pierda el móvil.</w:t>
       </w:r>
     </w:p>
     <w:p>
@@ -7245,7 +7245,7 @@
         <w:pStyle w:val="Heading2"/>
         <w:rPr/>
       </w:pPr>
-      <w:bookmarkStart w:id="16" w:name="__RefHeading___Toc1621_254375717"/>
+      <w:bookmarkStart w:id="16" w:name="__RefHeading___Toc1621_2009533110"/>
       <w:bookmarkEnd w:id="16"/>
       <w:r>
         <w:rPr/>
@@ -8687,7 +8687,7 @@
       </w:pPr>
       <w:r>
         <w:rPr/>
-        <w:t>Seis de los diez riesgos son críticos, pero ninguno exige tecnología cara. Separar la red de los clientes de la del negocio, cambiar las credenciales de fábrica, cerrar el acceso remoto del grabador y empezar a hacer copias son medidas de coste casi nulo. Que no se hayan tomado no se debe a la falta de dinero, sino a que nadie en la empresa tiene el conocimiento ni el encargo de hacerlo. Esa es la necesidad de fondo que un técnico de sistemas puede cubrir.</w:t>
+        <w:t>Seis de los diez riesgos son críticos, pero las medidas más urgentes no exigen tecnología cara. Separar la red de los clientes de la del negocio, cambiar las credenciales de fábrica, cerrar el acceso remoto del grabador y empezar a hacer copias son medidas de coste casi nulo. Sustituir el equipo de caja y comprar un SAI sí suponen un gasto, pero con hardware que hoy tiene precios asumibles (apartado 5.4). Que no se hayan tomado no se debe a la falta de dinero, sino a que nadie en la empresa tiene el conocimiento ni el encargo de hacerlo. Esa es la necesidad de fondo que un técnico de sistemas puede cubrir.</w:t>
       </w:r>
       <w:r>
         <w:br w:type="page"/>
@@ -8698,7 +8698,7 @@
         <w:pStyle w:val="Heading1"/>
         <w:rPr/>
       </w:pPr>
-      <w:bookmarkStart w:id="17" w:name="__RefHeading___Toc1623_254375717"/>
+      <w:bookmarkStart w:id="17" w:name="__RefHeading___Toc1623_2009533110"/>
       <w:bookmarkEnd w:id="17"/>
       <w:r>
         <w:rPr/>
@@ -8972,7 +8972,7 @@
                 <w:sz w:val="19"/>
                 <w:szCs w:val="19"/>
               </w:rPr>
-              <w:t>El sector factura más pero gana menos: crecimiento del 2 % al 4 % frente a una rentabilidad del −0,9 % en 2025 (Hosteltur, 2026)</w:t>
+              <w:t>El sector factura más (crecimiento del 2 % al 4 %), pero la restauración gana menos: rentabilidad del −0,9 % en 2025 (Hosteltur, 2026)</w:t>
             </w:r>
           </w:p>
         </w:tc>
@@ -9326,7 +9326,7 @@
         <w:pStyle w:val="Heading2"/>
         <w:rPr/>
       </w:pPr>
-      <w:bookmarkStart w:id="18" w:name="__RefHeading___Toc1625_254375717"/>
+      <w:bookmarkStart w:id="18" w:name="__RefHeading___Toc1625_2009533110"/>
       <w:bookmarkEnd w:id="18"/>
       <w:r>
         <w:rPr/>
@@ -9358,7 +9358,7 @@
         <w:pStyle w:val="Heading2"/>
         <w:rPr/>
       </w:pPr>
-      <w:bookmarkStart w:id="19" w:name="__RefHeading___Toc1627_254375717"/>
+      <w:bookmarkStart w:id="19" w:name="__RefHeading___Toc1627_2009533110"/>
       <w:bookmarkEnd w:id="19"/>
       <w:r>
         <w:rPr/>
@@ -9380,7 +9380,7 @@
         <w:pStyle w:val="Heading2"/>
         <w:rPr/>
       </w:pPr>
-      <w:bookmarkStart w:id="20" w:name="__RefHeading___Toc1629_254375717"/>
+      <w:bookmarkStart w:id="20" w:name="__RefHeading___Toc1629_2009533110"/>
       <w:bookmarkEnd w:id="20"/>
       <w:r>
         <w:rPr/>
@@ -9402,7 +9402,7 @@
         <w:pStyle w:val="Heading2"/>
         <w:rPr/>
       </w:pPr>
-      <w:bookmarkStart w:id="21" w:name="__RefHeading___Toc1631_254375717"/>
+      <w:bookmarkStart w:id="21" w:name="__RefHeading___Toc1631_2009533110"/>
       <w:bookmarkEnd w:id="21"/>
       <w:r>
         <w:rPr/>
@@ -9424,7 +9424,7 @@
         <w:pStyle w:val="Heading2"/>
         <w:rPr/>
       </w:pPr>
-      <w:bookmarkStart w:id="22" w:name="__RefHeading___Toc1633_254375717"/>
+      <w:bookmarkStart w:id="22" w:name="__RefHeading___Toc1633_2009533110"/>
       <w:bookmarkEnd w:id="22"/>
       <w:r>
         <w:rPr/>
@@ -9449,7 +9449,7 @@
         <w:pStyle w:val="Heading1"/>
         <w:rPr/>
       </w:pPr>
-      <w:bookmarkStart w:id="23" w:name="__RefHeading___Toc1635_254375717"/>
+      <w:bookmarkStart w:id="23" w:name="__RefHeading___Toc1635_2009533110"/>
       <w:bookmarkEnd w:id="23"/>
       <w:r>
         <w:rPr/>
@@ -9471,7 +9471,7 @@
         <w:pStyle w:val="Heading2"/>
         <w:rPr/>
       </w:pPr>
-      <w:bookmarkStart w:id="24" w:name="__RefHeading___Toc1637_254375717"/>
+      <w:bookmarkStart w:id="24" w:name="__RefHeading___Toc1637_2009533110"/>
       <w:bookmarkEnd w:id="24"/>
       <w:r>
         <w:rPr/>
@@ -9951,7 +9951,7 @@
         <w:pStyle w:val="Heading2"/>
         <w:rPr/>
       </w:pPr>
-      <w:bookmarkStart w:id="25" w:name="__RefHeading___Toc1639_254375717"/>
+      <w:bookmarkStart w:id="25" w:name="__RefHeading___Toc1639_2009533110"/>
       <w:bookmarkEnd w:id="25"/>
       <w:r>
         <w:rPr/>
@@ -10745,7 +10745,7 @@
         <w:pStyle w:val="Heading2"/>
         <w:rPr/>
       </w:pPr>
-      <w:bookmarkStart w:id="26" w:name="__RefHeading___Toc1641_254375717"/>
+      <w:bookmarkStart w:id="26" w:name="__RefHeading___Toc1641_2009533110"/>
       <w:bookmarkEnd w:id="26"/>
       <w:r>
         <w:rPr/>
@@ -10780,7 +10780,7 @@
         <w:pStyle w:val="Heading1"/>
         <w:rPr/>
       </w:pPr>
-      <w:bookmarkStart w:id="27" w:name="__RefHeading___Toc1643_254375717"/>
+      <w:bookmarkStart w:id="27" w:name="__RefHeading___Toc1643_2009533110"/>
       <w:bookmarkEnd w:id="27"/>
       <w:r>
         <w:rPr/>
@@ -11008,7 +11008,7 @@
                 <w:sz w:val="19"/>
                 <w:szCs w:val="19"/>
               </w:rPr>
-              <w:t>Separar la red: negocio, cocina, cámaras y clientes</w:t>
+              <w:t>Separar la red: negocio, cocina, cámaras e invitados</w:t>
             </w:r>
           </w:p>
         </w:tc>
@@ -11516,7 +11516,7 @@
                 <w:sz w:val="19"/>
                 <w:szCs w:val="19"/>
               </w:rPr>
-              <w:t>El datáfono y las tabletas no pueden perder la conexión en servicio</w:t>
+              <w:t>El datáfono y la tableta de reparto no pueden perder la conexión en servicio</w:t>
             </w:r>
           </w:p>
         </w:tc>
@@ -11671,7 +11671,7 @@
         <w:pStyle w:val="Heading2"/>
         <w:rPr/>
       </w:pPr>
-      <w:bookmarkStart w:id="28" w:name="__RefHeading___Toc1645_254375717"/>
+      <w:bookmarkStart w:id="28" w:name="__RefHeading___Toc1645_2009533110"/>
       <w:bookmarkEnd w:id="28"/>
       <w:r>
         <w:rPr/>
@@ -11693,7 +11693,7 @@
         <w:pStyle w:val="Heading2"/>
         <w:rPr/>
       </w:pPr>
-      <w:bookmarkStart w:id="29" w:name="__RefHeading___Toc1647_254375717"/>
+      <w:bookmarkStart w:id="29" w:name="__RefHeading___Toc1647_2009533110"/>
       <w:bookmarkEnd w:id="29"/>
       <w:r>
         <w:rPr/>
@@ -11916,7 +11916,7 @@
                 <w:sz w:val="19"/>
                 <w:szCs w:val="19"/>
               </w:rPr>
-              <w:t>Al menos cuatro segmentos (gestión, puntos de venta, cámaras e invitados); desde la red de invitados no se alcanza ningún equipo del negocio</w:t>
+              <w:t>Al menos cuatro segmentos (negocio, cocina, cámaras e invitados); desde la red de invitados no se alcanza ningún equipo del negocio</w:t>
             </w:r>
           </w:p>
         </w:tc>
@@ -12257,11 +12257,11 @@
         <w:pStyle w:val="Heading2"/>
         <w:rPr/>
       </w:pPr>
-      <w:bookmarkStart w:id="30" w:name="__RefHeading___Toc1649_254375717"/>
+      <w:bookmarkStart w:id="30" w:name="__RefHeading___Toc1649_2009533110"/>
       <w:bookmarkEnd w:id="30"/>
       <w:r>
         <w:rPr/>
-        <w:t>7.3. Obligaciones fiscales, laborales y de prevención de riesgos</w:t>
+        <w:t>7.3. Obligaciones fiscales, laborales, de prevención de riesgos y de protección de datos</w:t>
       </w:r>
     </w:p>
     <w:p>
@@ -12801,7 +12801,7 @@
         <w:pStyle w:val="Heading2"/>
         <w:rPr/>
       </w:pPr>
-      <w:bookmarkStart w:id="31" w:name="__RefHeading___Toc1651_254375717"/>
+      <w:bookmarkStart w:id="31" w:name="__RefHeading___Toc1651_2009533110"/>
       <w:bookmarkEnd w:id="31"/>
       <w:r>
         <w:rPr/>
@@ -12826,7 +12826,7 @@
         <w:pStyle w:val="Heading1"/>
         <w:rPr/>
       </w:pPr>
-      <w:bookmarkStart w:id="32" w:name="__RefHeading___Toc1653_254375717"/>
+      <w:bookmarkStart w:id="32" w:name="__RefHeading___Toc1653_2009533110"/>
       <w:bookmarkEnd w:id="32"/>
       <w:r>
         <w:rPr/>
@@ -12840,7 +12840,7 @@
       </w:pPr>
       <w:r>
         <w:rPr/>
-        <w:t>Burglar King es un caso típico de la restauración independiente: un negocio sano en un sector con márgenes estrechos, con una tecnología que se ha ido acumulando sin diseño. El análisis muestra tres problemas de fondo. El primero es que la información de la comanda no entra en ningún sistema hasta el cobro, de modo que el local trabaja a ciegas durante el servicio. El segundo es que el único equipo que guarda datos del negocio funciona con un sistema operativo sin soporte, en un disco que falla y sin copias de seguridad. El tercero es que toda la actividad comparte una red plana con los teléfonos de los clientes y con un grabador expuesto en internet.</w:t>
+        <w:t>Burglar King es un caso típico de la restauración independiente: un negocio sano en un sector con márgenes estrechos, con una tecnología que se ha ido acumulando sin diseño. El análisis muestra tres problemas de fondo. El primero es que la información de la comanda no entra en ningún sistema hasta el cobro, de modo que el local trabaja a ciegas durante el servicio. El segundo es que el único equipo que guarda la base de datos de ventas, facturas y cierres de caja funciona con un sistema operativo sin soporte, en un disco que falla y sin copias de seguridad. El tercero es que toda la actividad comparte una red plana con los teléfonos de los clientes y con un grabador expuesto en internet.</w:t>
       </w:r>
     </w:p>
     <w:p>
@@ -13477,7 +13477,7 @@
         <w:pStyle w:val="Heading1"/>
         <w:rPr/>
       </w:pPr>
-      <w:bookmarkStart w:id="33" w:name="__RefHeading___Toc1655_254375717"/>
+      <w:bookmarkStart w:id="33" w:name="__RefHeading___Toc1655_2009533110"/>
       <w:bookmarkEnd w:id="33"/>
       <w:r>
         <w:rPr/>
@@ -13797,7 +13797,7 @@
         <w:pStyle w:val="Heading2"/>
         <w:rPr/>
       </w:pPr>
-      <w:bookmarkStart w:id="34" w:name="__RefHeading___Toc1657_254375717"/>
+      <w:bookmarkStart w:id="34" w:name="__RefHeading___Toc1657_2009533110"/>
       <w:bookmarkEnd w:id="34"/>
       <w:r>
         <w:rPr/>
@@ -14164,7 +14164,7 @@
         <w:pStyle w:val="Heading1"/>
         <w:rPr/>
       </w:pPr>
-      <w:bookmarkStart w:id="35" w:name="__RefHeading___Toc1659_254375717"/>
+      <w:bookmarkStart w:id="35" w:name="__RefHeading___Toc1659_2009533110"/>
       <w:bookmarkEnd w:id="35"/>
       <w:r>
         <w:rPr/>

</xml_diff>

<commit_message>
Reto 1: cocinero, salarios desde 2.000 € y ventas recalculadas, alquileres de Fotocasa e idealista
El que menos cobra pasa a 2.000 € brutos en 15 pagas y el resto se escala en
proporción; las ventas suben a 45.000 €/mes para que el personal quede en el 33 %.
Tabla 16 con tres anuncios de Fotocasa. Fuera la tabla del guion de retos.

Co-Authored-By: Claude Fable 5.1 <noreply@anthropic.com>
Claude-Session: https://claude.ai/code/session_01NfcVogsskG9YgoQE94aXdb
</commit_message>
<xml_diff>
--- a/docs/reto1/reto1_contexto_tecnologico.docx
+++ b/docs/reto1/reto1_contexto_tecnologico.docx
@@ -193,7 +193,7 @@
             </w:rPr>
             <w:fldChar w:fldCharType="separate"/>
           </w:r>
-          <w:hyperlink w:anchor="__RefHeading___Toc1979_4183402018">
+          <w:hyperlink w:anchor="__RefHeading___Toc1958_3382994897">
             <w:r>
               <w:rPr>
                 <w:rStyle w:val="IndexLink"/>
@@ -213,7 +213,7 @@
             </w:tabs>
             <w:rPr/>
           </w:pPr>
-          <w:hyperlink w:anchor="__RefHeading___Toc1981_4183402018">
+          <w:hyperlink w:anchor="__RefHeading___Toc1960_3382994897">
             <w:r>
               <w:rPr>
                 <w:rStyle w:val="IndexLink"/>
@@ -233,7 +233,7 @@
             </w:tabs>
             <w:rPr/>
           </w:pPr>
-          <w:hyperlink w:anchor="__RefHeading___Toc1983_4183402018">
+          <w:hyperlink w:anchor="__RefHeading___Toc1962_3382994897">
             <w:r>
               <w:rPr>
                 <w:rStyle w:val="IndexLink"/>
@@ -253,7 +253,7 @@
             </w:tabs>
             <w:rPr/>
           </w:pPr>
-          <w:hyperlink w:anchor="__RefHeading___Toc1985_4183402018">
+          <w:hyperlink w:anchor="__RefHeading___Toc1964_3382994897">
             <w:r>
               <w:rPr>
                 <w:rStyle w:val="IndexLink"/>
@@ -273,7 +273,7 @@
             </w:tabs>
             <w:rPr/>
           </w:pPr>
-          <w:hyperlink w:anchor="__RefHeading___Toc1987_4183402018">
+          <w:hyperlink w:anchor="__RefHeading___Toc1966_3382994897">
             <w:r>
               <w:rPr>
                 <w:rStyle w:val="IndexLink"/>
@@ -293,7 +293,7 @@
             </w:tabs>
             <w:rPr/>
           </w:pPr>
-          <w:hyperlink w:anchor="__RefHeading___Toc1989_4183402018">
+          <w:hyperlink w:anchor="__RefHeading___Toc1968_3382994897">
             <w:r>
               <w:rPr>
                 <w:rStyle w:val="IndexLink"/>
@@ -313,7 +313,7 @@
             </w:tabs>
             <w:rPr/>
           </w:pPr>
-          <w:hyperlink w:anchor="__RefHeading___Toc1991_4183402018">
+          <w:hyperlink w:anchor="__RefHeading___Toc1970_3382994897">
             <w:r>
               <w:rPr>
                 <w:rStyle w:val="IndexLink"/>
@@ -333,7 +333,7 @@
             </w:tabs>
             <w:rPr/>
           </w:pPr>
-          <w:hyperlink w:anchor="__RefHeading___Toc1993_4183402018">
+          <w:hyperlink w:anchor="__RefHeading___Toc1972_3382994897">
             <w:r>
               <w:rPr>
                 <w:rStyle w:val="IndexLink"/>
@@ -353,7 +353,7 @@
             </w:tabs>
             <w:rPr/>
           </w:pPr>
-          <w:hyperlink w:anchor="__RefHeading___Toc1995_4183402018">
+          <w:hyperlink w:anchor="__RefHeading___Toc1974_3382994897">
             <w:r>
               <w:rPr>
                 <w:rStyle w:val="IndexLink"/>
@@ -373,7 +373,7 @@
             </w:tabs>
             <w:rPr/>
           </w:pPr>
-          <w:hyperlink w:anchor="__RefHeading___Toc1997_4183402018">
+          <w:hyperlink w:anchor="__RefHeading___Toc1976_3382994897">
             <w:r>
               <w:rPr>
                 <w:rStyle w:val="IndexLink"/>
@@ -393,7 +393,7 @@
             </w:tabs>
             <w:rPr/>
           </w:pPr>
-          <w:hyperlink w:anchor="__RefHeading___Toc1999_4183402018">
+          <w:hyperlink w:anchor="__RefHeading___Toc1978_3382994897">
             <w:r>
               <w:rPr>
                 <w:rStyle w:val="IndexLink"/>
@@ -413,7 +413,7 @@
             </w:tabs>
             <w:rPr/>
           </w:pPr>
-          <w:hyperlink w:anchor="__RefHeading___Toc2001_4183402018">
+          <w:hyperlink w:anchor="__RefHeading___Toc1980_3382994897">
             <w:r>
               <w:rPr>
                 <w:rStyle w:val="IndexLink"/>
@@ -433,7 +433,7 @@
             </w:tabs>
             <w:rPr/>
           </w:pPr>
-          <w:hyperlink w:anchor="__RefHeading___Toc2003_4183402018">
+          <w:hyperlink w:anchor="__RefHeading___Toc1982_3382994897">
             <w:r>
               <w:rPr>
                 <w:rStyle w:val="IndexLink"/>
@@ -453,7 +453,7 @@
             </w:tabs>
             <w:rPr/>
           </w:pPr>
-          <w:hyperlink w:anchor="__RefHeading___Toc2005_4183402018">
+          <w:hyperlink w:anchor="__RefHeading___Toc1984_3382994897">
             <w:r>
               <w:rPr>
                 <w:rStyle w:val="IndexLink"/>
@@ -473,7 +473,7 @@
             </w:tabs>
             <w:rPr/>
           </w:pPr>
-          <w:hyperlink w:anchor="__RefHeading___Toc2007_4183402018">
+          <w:hyperlink w:anchor="__RefHeading___Toc1986_3382994897">
             <w:r>
               <w:rPr>
                 <w:rStyle w:val="IndexLink"/>
@@ -493,14 +493,14 @@
             </w:tabs>
             <w:rPr/>
           </w:pPr>
-          <w:hyperlink w:anchor="__RefHeading___Toc2009_4183402018">
+          <w:hyperlink w:anchor="__RefHeading___Toc1988_3382994897">
             <w:r>
               <w:rPr>
                 <w:rStyle w:val="IndexLink"/>
               </w:rPr>
               <w:t>4.3. Gastos materiales</w:t>
               <w:tab/>
-              <w:t>20</w:t>
+              <w:t>21</w:t>
             </w:r>
           </w:hyperlink>
         </w:p>
@@ -513,7 +513,7 @@
             </w:tabs>
             <w:rPr/>
           </w:pPr>
-          <w:hyperlink w:anchor="__RefHeading___Toc2011_4183402018">
+          <w:hyperlink w:anchor="__RefHeading___Toc1990_3382994897">
             <w:r>
               <w:rPr>
                 <w:rStyle w:val="IndexLink"/>
@@ -533,14 +533,14 @@
             </w:tabs>
             <w:rPr/>
           </w:pPr>
-          <w:hyperlink w:anchor="__RefHeading___Toc2013_4183402018">
+          <w:hyperlink w:anchor="__RefHeading___Toc1992_3382994897">
             <w:r>
               <w:rPr>
                 <w:rStyle w:val="IndexLink"/>
               </w:rPr>
               <w:t>5. Servicios prestados</w:t>
               <w:tab/>
-              <w:t>24</w:t>
+              <w:t>25</w:t>
             </w:r>
           </w:hyperlink>
         </w:p>
@@ -553,14 +553,14 @@
             </w:tabs>
             <w:rPr/>
           </w:pPr>
-          <w:hyperlink w:anchor="__RefHeading___Toc2015_4183402018">
+          <w:hyperlink w:anchor="__RefHeading___Toc1994_3382994897">
             <w:r>
               <w:rPr>
                 <w:rStyle w:val="IndexLink"/>
               </w:rPr>
               <w:t>6. Publicidad (marketing)</w:t>
               <w:tab/>
-              <w:t>26</w:t>
+              <w:t>27</w:t>
             </w:r>
           </w:hyperlink>
         </w:p>
@@ -573,14 +573,14 @@
             </w:tabs>
             <w:rPr/>
           </w:pPr>
-          <w:hyperlink w:anchor="__RefHeading___Toc2017_4183402018">
+          <w:hyperlink w:anchor="__RefHeading___Toc1996_3382994897">
             <w:r>
               <w:rPr>
                 <w:rStyle w:val="IndexLink"/>
               </w:rPr>
               <w:t>7. Conclusiones</w:t>
               <w:tab/>
-              <w:t>28</w:t>
+              <w:t>29</w:t>
             </w:r>
           </w:hyperlink>
         </w:p>
@@ -593,14 +593,14 @@
             </w:tabs>
             <w:rPr/>
           </w:pPr>
-          <w:hyperlink w:anchor="__RefHeading___Toc2019_4183402018">
+          <w:hyperlink w:anchor="__RefHeading___Toc1998_3382994897">
             <w:r>
               <w:rPr>
                 <w:rStyle w:val="IndexLink"/>
               </w:rPr>
               <w:t>8. Bibliografía</w:t>
               <w:tab/>
-              <w:t>30</w:t>
+              <w:t>31</w:t>
             </w:r>
           </w:hyperlink>
           <w:r>
@@ -634,7 +634,7 @@
         <w:pStyle w:val="Heading1"/>
         <w:rPr/>
       </w:pPr>
-      <w:bookmarkStart w:id="0" w:name="__RefHeading___Toc1979_4183402018"/>
+      <w:bookmarkStart w:id="0" w:name="__RefHeading___Toc1958_3382994897"/>
       <w:bookmarkEnd w:id="0"/>
       <w:r>
         <w:rPr/>
@@ -677,7 +677,7 @@
         <w:pStyle w:val="Heading2"/>
         <w:rPr/>
       </w:pPr>
-      <w:bookmarkStart w:id="1" w:name="__RefHeading___Toc1981_4183402018"/>
+      <w:bookmarkStart w:id="1" w:name="__RefHeading___Toc1960_3382994897"/>
       <w:bookmarkEnd w:id="1"/>
       <w:r>
         <w:rPr/>
@@ -1094,7 +1094,7 @@
                 <w:sz w:val="19"/>
                 <w:szCs w:val="19"/>
               </w:rPr>
-              <w:t>4 personas: encargado (socio gerente), 2 camareros y 1 cocinera</w:t>
+              <w:t>4 personas: encargado (socio gerente), 2 camareros y 1 cocinero</w:t>
             </w:r>
           </w:p>
         </w:tc>
@@ -1292,7 +1292,7 @@
         <w:pStyle w:val="Heading2"/>
         <w:rPr/>
       </w:pPr>
-      <w:bookmarkStart w:id="2" w:name="__RefHeading___Toc1983_4183402018"/>
+      <w:bookmarkStart w:id="2" w:name="__RefHeading___Toc1962_3382994897"/>
       <w:bookmarkEnd w:id="2"/>
       <w:r>
         <w:rPr/>
@@ -1821,7 +1821,7 @@
                 <w:sz w:val="19"/>
                 <w:szCs w:val="19"/>
               </w:rPr>
-              <w:t>1 cocinera</w:t>
+              <w:t>1 cocinero</w:t>
             </w:r>
           </w:p>
         </w:tc>
@@ -2009,7 +2009,7 @@
         <w:pStyle w:val="Heading2"/>
         <w:rPr/>
       </w:pPr>
-      <w:bookmarkStart w:id="3" w:name="__RefHeading___Toc1985_4183402018"/>
+      <w:bookmarkStart w:id="3" w:name="__RefHeading___Toc1964_3382994897"/>
       <w:bookmarkEnd w:id="3"/>
       <w:r>
         <w:rPr/>
@@ -2859,7 +2859,7 @@
         <w:pStyle w:val="Heading2"/>
         <w:rPr/>
       </w:pPr>
-      <w:bookmarkStart w:id="4" w:name="__RefHeading___Toc1987_4183402018"/>
+      <w:bookmarkStart w:id="4" w:name="__RefHeading___Toc1966_3382994897"/>
       <w:bookmarkEnd w:id="4"/>
       <w:r>
         <w:rPr/>
@@ -3681,7 +3681,7 @@
         <w:pStyle w:val="Heading1"/>
         <w:rPr/>
       </w:pPr>
-      <w:bookmarkStart w:id="5" w:name="__RefHeading___Toc1989_4183402018"/>
+      <w:bookmarkStart w:id="5" w:name="__RefHeading___Toc1968_3382994897"/>
       <w:bookmarkEnd w:id="5"/>
       <w:r>
         <w:rPr/>
@@ -3736,7 +3736,7 @@
         <w:pStyle w:val="Heading2"/>
         <w:rPr/>
       </w:pPr>
-      <w:bookmarkStart w:id="6" w:name="__RefHeading___Toc1991_4183402018"/>
+      <w:bookmarkStart w:id="6" w:name="__RefHeading___Toc1970_3382994897"/>
       <w:bookmarkEnd w:id="6"/>
       <w:r>
         <w:rPr/>
@@ -3758,7 +3758,7 @@
         <w:pStyle w:val="Heading2"/>
         <w:rPr/>
       </w:pPr>
-      <w:bookmarkStart w:id="7" w:name="__RefHeading___Toc1993_4183402018"/>
+      <w:bookmarkStart w:id="7" w:name="__RefHeading___Toc1972_3382994897"/>
       <w:bookmarkEnd w:id="7"/>
       <w:r>
         <w:rPr/>
@@ -3780,7 +3780,7 @@
         <w:pStyle w:val="Heading2"/>
         <w:rPr/>
       </w:pPr>
-      <w:bookmarkStart w:id="8" w:name="__RefHeading___Toc1995_4183402018"/>
+      <w:bookmarkStart w:id="8" w:name="__RefHeading___Toc1974_3382994897"/>
       <w:bookmarkEnd w:id="8"/>
       <w:r>
         <w:rPr/>
@@ -4289,7 +4289,7 @@
                 <w:sz w:val="19"/>
                 <w:szCs w:val="19"/>
               </w:rPr>
-              <w:t>Unos 360.000 € sin IVA (estimación)</w:t>
+              <w:t>Unos 540.000 € sin IVA (estimación)</w:t>
             </w:r>
           </w:p>
         </w:tc>
@@ -4483,7 +4483,7 @@
                 <w:sz w:val="19"/>
                 <w:szCs w:val="19"/>
               </w:rPr>
-              <w:t>Un 20 % de las ventas</w:t>
+              <w:t>Un 18 % de las ventas</w:t>
             </w:r>
           </w:p>
         </w:tc>
@@ -4760,7 +4760,7 @@
       </w:pPr>
       <w:r>
         <w:rPr/>
-        <w:t>De Hundred Burgers, Burglar King toma tres decisiones. La primera es la carta corta: pocas referencias, bien ejecutadas, que simplifican las compras, reducen la merma y permiten que una sola cocinera saque el servicio. La segunda es el peso del reparto y de la comida para llevar, que en Hundred supone un tercio de los ingresos y que exige que el pedido entre en cocina sin que nadie lo copie a mano. La tercera es la forma de crecer: Hundred ha abierto locales solo cuando el anterior funcionaba, con un flujo de pedido ya digital desde el primer día. De Goiko, Burglar King toma la advertencia: el mercado de la hamburguesa está saturado, el cliente ha reducido su consumo y un negocio de este tipo solo sobrevive con los costes muy controlados. Esa es la razón por la que el apartado 4 dedica tanto espacio a las cifras.</w:t>
+        <w:t>De Hundred Burgers, Burglar King toma tres decisiones. La primera es la carta corta: pocas referencias, bien ejecutadas, que simplifican las compras, reducen la merma y permiten que un solo cocinero saque el servicio. La segunda es el peso del reparto y de la comida para llevar, que en Hundred supone un tercio de los ingresos y que exige que el pedido entre en cocina sin que nadie lo copie a mano. La tercera es la forma de crecer: Hundred ha abierto locales solo cuando el anterior funcionaba, con un flujo de pedido ya digital desde el primer día. De Goiko, Burglar King toma la advertencia: el mercado de la hamburguesa está saturado, el cliente ha reducido su consumo y un negocio de este tipo solo sobrevive con los costes muy controlados. Esa es la razón por la que el apartado 4 dedica tanto espacio a las cifras.</w:t>
       </w:r>
       <w:r>
         <w:br w:type="page"/>
@@ -4771,7 +4771,7 @@
         <w:pStyle w:val="Heading1"/>
         <w:rPr/>
       </w:pPr>
-      <w:bookmarkStart w:id="9" w:name="__RefHeading___Toc1997_4183402018"/>
+      <w:bookmarkStart w:id="9" w:name="__RefHeading___Toc1976_3382994897"/>
       <w:bookmarkEnd w:id="9"/>
       <w:r>
         <w:rPr/>
@@ -4793,7 +4793,7 @@
         <w:pStyle w:val="Heading2"/>
         <w:rPr/>
       </w:pPr>
-      <w:bookmarkStart w:id="10" w:name="__RefHeading___Toc1999_4183402018"/>
+      <w:bookmarkStart w:id="10" w:name="__RefHeading___Toc1978_3382994897"/>
       <w:bookmarkEnd w:id="10"/>
       <w:r>
         <w:rPr/>
@@ -5496,7 +5496,7 @@
         <w:pStyle w:val="Heading2"/>
         <w:rPr/>
       </w:pPr>
-      <w:bookmarkStart w:id="11" w:name="__RefHeading___Toc2001_4183402018"/>
+      <w:bookmarkStart w:id="11" w:name="__RefHeading___Toc1980_3382994897"/>
       <w:bookmarkEnd w:id="11"/>
       <w:r>
         <w:rPr/>
@@ -5874,7 +5874,7 @@
                 <w:sz w:val="19"/>
                 <w:szCs w:val="19"/>
               </w:rPr>
-              <w:t>25 %</w:t>
+              <w:t>27 %</w:t>
             </w:r>
           </w:p>
         </w:tc>
@@ -6068,7 +6068,7 @@
                 <w:sz w:val="19"/>
                 <w:szCs w:val="19"/>
               </w:rPr>
-              <w:t>20 %</w:t>
+              <w:t>18 %</w:t>
             </w:r>
           </w:p>
         </w:tc>
@@ -6923,7 +6923,7 @@
         <w:pStyle w:val="Heading1"/>
         <w:rPr/>
       </w:pPr>
-      <w:bookmarkStart w:id="12" w:name="__RefHeading___Toc2003_4183402018"/>
+      <w:bookmarkStart w:id="12" w:name="__RefHeading___Toc1982_3382994897"/>
       <w:bookmarkEnd w:id="12"/>
       <w:r>
         <w:rPr/>
@@ -7151,7 +7151,7 @@
                 <w:sz w:val="19"/>
                 <w:szCs w:val="19"/>
               </w:rPr>
-              <w:t>1.300 comensales</w:t>
+              <w:t>1.500 comensales</w:t>
             </w:r>
           </w:p>
         </w:tc>
@@ -7174,7 +7174,7 @@
                 <w:sz w:val="19"/>
                 <w:szCs w:val="19"/>
               </w:rPr>
-              <w:t>16,50 €</w:t>
+              <w:t>19,50 €</w:t>
             </w:r>
           </w:p>
         </w:tc>
@@ -7197,7 +7197,7 @@
                 <w:sz w:val="19"/>
                 <w:szCs w:val="19"/>
               </w:rPr>
-              <w:t>21.450 €</w:t>
+              <w:t>29.250 €</w:t>
             </w:r>
           </w:p>
         </w:tc>
@@ -7248,7 +7248,7 @@
                 <w:sz w:val="19"/>
                 <w:szCs w:val="19"/>
               </w:rPr>
-              <w:t>250 comensales</w:t>
+              <w:t>300 comensales</w:t>
             </w:r>
           </w:p>
         </w:tc>
@@ -7271,7 +7271,7 @@
                 <w:sz w:val="19"/>
                 <w:szCs w:val="19"/>
               </w:rPr>
-              <w:t>9,00 €</w:t>
+              <w:t>10,00 €</w:t>
             </w:r>
           </w:p>
         </w:tc>
@@ -7294,7 +7294,7 @@
                 <w:sz w:val="19"/>
                 <w:szCs w:val="19"/>
               </w:rPr>
-              <w:t>2.250 €</w:t>
+              <w:t>3.000 €</w:t>
             </w:r>
           </w:p>
         </w:tc>
@@ -7345,7 +7345,7 @@
                 <w:sz w:val="19"/>
                 <w:szCs w:val="19"/>
               </w:rPr>
-              <w:t>220 pedidos</w:t>
+              <w:t>300 pedidos</w:t>
             </w:r>
           </w:p>
         </w:tc>
@@ -7368,7 +7368,7 @@
                 <w:sz w:val="19"/>
                 <w:szCs w:val="19"/>
               </w:rPr>
-              <w:t>13,60 €</w:t>
+              <w:t>15,00 €</w:t>
             </w:r>
           </w:p>
         </w:tc>
@@ -7391,7 +7391,7 @@
                 <w:sz w:val="19"/>
                 <w:szCs w:val="19"/>
               </w:rPr>
-              <w:t>3.000 €</w:t>
+              <w:t>4.500 €</w:t>
             </w:r>
           </w:p>
         </w:tc>
@@ -7442,7 +7442,7 @@
                 <w:sz w:val="19"/>
                 <w:szCs w:val="19"/>
               </w:rPr>
-              <w:t>440 pedidos</w:t>
+              <w:t>550 pedidos</w:t>
             </w:r>
           </w:p>
         </w:tc>
@@ -7465,7 +7465,7 @@
                 <w:sz w:val="19"/>
                 <w:szCs w:val="19"/>
               </w:rPr>
-              <w:t>13,60 €</w:t>
+              <w:t>15,00 €</w:t>
             </w:r>
           </w:p>
         </w:tc>
@@ -7488,7 +7488,7 @@
                 <w:sz w:val="19"/>
                 <w:szCs w:val="19"/>
               </w:rPr>
-              <w:t>6.000 €</w:t>
+              <w:t>8.250 €</w:t>
             </w:r>
           </w:p>
         </w:tc>
@@ -7539,7 +7539,7 @@
                 <w:sz w:val="19"/>
                 <w:szCs w:val="19"/>
               </w:rPr>
-              <w:t>2.210</w:t>
+              <w:t>2.650</w:t>
             </w:r>
           </w:p>
         </w:tc>
@@ -7562,7 +7562,7 @@
                 <w:sz w:val="19"/>
                 <w:szCs w:val="19"/>
               </w:rPr>
-              <w:t>14,80 €</w:t>
+              <w:t>16,98 €</w:t>
             </w:r>
           </w:p>
         </w:tc>
@@ -7585,7 +7585,7 @@
                 <w:sz w:val="19"/>
                 <w:szCs w:val="19"/>
               </w:rPr>
-              <w:t>32.700 €</w:t>
+              <w:t>45.000 €</w:t>
             </w:r>
           </w:p>
         </w:tc>
@@ -7612,7 +7612,7 @@
           <w:sz w:val="20"/>
           <w:szCs w:val="20"/>
         </w:rPr>
-        <w:t xml:space="preserve"> Elaboración propia. 26 días de apertura al mes; los importes excluyen el IVA del 10 % de la hostelería (Ley 37/1992). Unos 390.000 euros anuales, en la banda baja de lo que factura un local de 44 plazas con dos turnos.</w:t>
+        <w:t xml:space="preserve"> Elaboración propia. 26 días de apertura al mes; los importes excluyen el IVA del 10 % de la hostelería (Ley 37/1992). Unos 540.000 euros anuales, lo que factura un local de 44 plazas con dos turnos y reparto.</w:t>
       </w:r>
     </w:p>
     <w:p>
@@ -7622,7 +7622,7 @@
       </w:pPr>
       <w:r>
         <w:rPr/>
-        <w:t>Con esas ventas, la cuenta de resultados mensual estimada queda como muestra la tabla 10 y la figura 3. El resultado antes de impuestos ronda el 11 % de las ventas, un margen razonable para un local bien gestionado pero que se evapora con dos meses flojos; la rentabilidad media del sector fue negativa en 2025 (Hosteltur, 2026). El tipo del impuesto sobre sociedades para microempresas en 2026 es del 19 % hasta 50.000 euros de base imponible y del 21 % para el resto (Ley 7/2024).</w:t>
+        <w:t>Con esas ventas, la cuenta de resultados mensual estimada queda como muestra la tabla 10 y la figura 3. El resultado antes de impuestos ronda el 16 % de las ventas, un margen holgado para un local bien gestionado, pero que se evapora con dos meses flojos; la rentabilidad media del sector fue negativa en 2025 (Hosteltur, 2026). El tipo del impuesto sobre sociedades para microempresas en 2026 es del 19 % hasta 50.000 euros de base imponible y del 21 % para el resto (Ley 7/2024).</w:t>
       </w:r>
     </w:p>
     <w:p>
@@ -7836,7 +7836,7 @@
                 <w:sz w:val="19"/>
                 <w:szCs w:val="19"/>
               </w:rPr>
-              <w:t>32.700 €</w:t>
+              <w:t>45.000 €</w:t>
             </w:r>
           </w:p>
         </w:tc>
@@ -7910,7 +7910,7 @@
                 <w:sz w:val="19"/>
                 <w:szCs w:val="19"/>
               </w:rPr>
-              <w:t>Materia prima y consumibles</w:t>
+              <w:t>Materia prima (comida y bebida)</w:t>
             </w:r>
           </w:p>
         </w:tc>
@@ -7940,7 +7940,7 @@
                 <w:sz w:val="19"/>
                 <w:szCs w:val="19"/>
               </w:rPr>
-              <w:t>10.470 €</w:t>
+              <w:t>14.400 €</w:t>
             </w:r>
           </w:p>
         </w:tc>
@@ -8044,7 +8044,7 @@
                 <w:sz w:val="19"/>
                 <w:szCs w:val="19"/>
               </w:rPr>
-              <w:t>9.100 €</w:t>
+              <w:t>14.800 €</w:t>
             </w:r>
           </w:p>
         </w:tc>
@@ -8067,7 +8067,7 @@
                 <w:sz w:val="19"/>
                 <w:szCs w:val="19"/>
               </w:rPr>
-              <w:t>28 %</w:t>
+              <w:t>33 %</w:t>
             </w:r>
           </w:p>
         </w:tc>
@@ -8171,7 +8171,7 @@
                 <w:sz w:val="19"/>
                 <w:szCs w:val="19"/>
               </w:rPr>
-              <w:t>3 %</w:t>
+              <w:t>2 %</w:t>
             </w:r>
           </w:p>
         </w:tc>
@@ -8222,7 +8222,7 @@
                 <w:sz w:val="19"/>
                 <w:szCs w:val="19"/>
               </w:rPr>
-              <w:t>Suministros, seguros, gestoría y mantenimiento</w:t>
+              <w:t>Suministros, consumibles, seguros, gestoría y mantenimiento</w:t>
             </w:r>
           </w:p>
         </w:tc>
@@ -8252,7 +8252,7 @@
                 <w:sz w:val="19"/>
                 <w:szCs w:val="19"/>
               </w:rPr>
-              <w:t>2.300 €</w:t>
+              <w:t>3.600 €</w:t>
             </w:r>
           </w:p>
         </w:tc>
@@ -8275,7 +8275,7 @@
                 <w:sz w:val="19"/>
                 <w:szCs w:val="19"/>
               </w:rPr>
-              <w:t>7 %</w:t>
+              <w:t>8 %</w:t>
             </w:r>
           </w:p>
         </w:tc>
@@ -8356,7 +8356,7 @@
                 <w:sz w:val="19"/>
                 <w:szCs w:val="19"/>
               </w:rPr>
-              <w:t>1.500 €</w:t>
+              <w:t>2.100 €</w:t>
             </w:r>
           </w:p>
         </w:tc>
@@ -8460,7 +8460,7 @@
                 <w:sz w:val="19"/>
                 <w:szCs w:val="19"/>
               </w:rPr>
-              <w:t>300 €</w:t>
+              <w:t>450 €</w:t>
             </w:r>
           </w:p>
         </w:tc>
@@ -8564,7 +8564,7 @@
                 <w:sz w:val="19"/>
                 <w:szCs w:val="19"/>
               </w:rPr>
-              <w:t>600 €</w:t>
+              <w:t>900 €</w:t>
             </w:r>
           </w:p>
         </w:tc>
@@ -8668,7 +8668,7 @@
                 <w:sz w:val="19"/>
                 <w:szCs w:val="19"/>
               </w:rPr>
-              <w:t>350 €</w:t>
+              <w:t>400 €</w:t>
             </w:r>
           </w:p>
         </w:tc>
@@ -8765,7 +8765,7 @@
                 <w:sz w:val="19"/>
                 <w:szCs w:val="19"/>
               </w:rPr>
-              <w:t>3.580 €</w:t>
+              <w:t>7.350 €</w:t>
             </w:r>
           </w:p>
         </w:tc>
@@ -8788,7 +8788,7 @@
                 <w:sz w:val="19"/>
                 <w:szCs w:val="19"/>
               </w:rPr>
-              <w:t>11 %</w:t>
+              <w:t>16 %</w:t>
             </w:r>
           </w:p>
         </w:tc>
@@ -8949,7 +8949,7 @@
         <w:pStyle w:val="Heading2"/>
         <w:rPr/>
       </w:pPr>
-      <w:bookmarkStart w:id="13" w:name="__RefHeading___Toc2005_4183402018"/>
+      <w:bookmarkStart w:id="13" w:name="__RefHeading___Toc1984_3382994897"/>
       <w:bookmarkEnd w:id="13"/>
       <w:r>
         <w:rPr/>
@@ -8963,7 +8963,7 @@
       </w:pPr>
       <w:r>
         <w:rPr/>
-        <w:t>Burglar King se constituyó en 2022 con 60.000 euros: 35.000 de capital aportado por el socio gerente y un familiar, y un préstamo bancario de 25.000 euros a cinco años que financió la obra, la salida de humos y la cocina. Hoy quedan unos 7.000 euros pendientes, con una cuota de unos 450 euros mensuales, y la empresa no tiene otra deuda. Lo que necesita financiar ahora es el proyecto tecnológico: red segmentada, servidor, puestos de sala y cocina, pantallas y SAI. Su presupuesto detallado corresponde al Reto 4, pero una estimación de entre 5.000 y 8.000 euros permite valorar ya las fuentes disponibles (tabla 11).</w:t>
+        <w:t>Burglar King se constituyó en 2022 con 60.000 euros: 35.000 de capital aportado por el socio gerente y un familiar, y un préstamo bancario de 25.000 euros a cinco años que financió la obra, la salida de humos y la cocina. Hoy quedan unos 7.000 euros pendientes, con una cuota de unos 450 euros mensuales, y la empresa no tiene otra deuda. Lo que necesita financiar ahora es el proyecto tecnológico: red segmentada, servidor, puestos de sala y cocina, pantallas y SAI. Su presupuesto detallado queda fuera de este informe, pero una estimación de entre 5.000 y 8.000 euros permite valorar ya las fuentes disponibles (tabla 11).</w:t>
       </w:r>
     </w:p>
     <w:p>
@@ -9149,7 +9149,7 @@
                 <w:sz w:val="19"/>
                 <w:szCs w:val="19"/>
               </w:rPr>
-              <w:t>Sin coste financiero; el resultado mensual estimado permite ahorrar 2.000-3.000 € al mes</w:t>
+              <w:t>Sin coste financiero; el resultado mensual estimado permite ahorrar 3.000-5.000 € al mes</w:t>
             </w:r>
           </w:p>
         </w:tc>
@@ -9579,7 +9579,7 @@
       </w:pPr>
       <w:r>
         <w:rPr/>
-        <w:t>La decisión es financiar el proyecto con tesorería propia en dos fases y, si la segunda fase lo requiere, con un microcrédito de MicroBank de hasta 8.000 euros a tres años, cuya cuota rondaría los 250 euros mensuales. Esa cuota es inferior a lo que hoy cobran las plataformas en la nube por dos terminales y dos pantallas de cocina, de modo que el proyecto se paga solo con lo que evita gastar (Riches Manuel y Roca, 2026). Las ayudas públicas se buscarán, pero el presupuesto del Reto 4 se calculará sin ellas.</w:t>
+        <w:t>La decisión es financiar el proyecto con tesorería propia en dos fases y, si la segunda fase lo requiere, con un microcrédito de MicroBank de hasta 8.000 euros a tres años, cuya cuota rondaría los 250 euros mensuales. Esa cuota es inferior a lo que hoy cobran las plataformas en la nube por dos terminales y dos pantallas de cocina, de modo que el proyecto se paga solo con lo que evita gastar (Riches Manuel y Roca, 2026). Las ayudas públicas se buscarán, pero el presupuesto del proyecto se calculará sin ellas.</w:t>
       </w:r>
     </w:p>
     <w:p>
@@ -9587,7 +9587,7 @@
         <w:pStyle w:val="Heading2"/>
         <w:rPr/>
       </w:pPr>
-      <w:bookmarkStart w:id="14" w:name="__RefHeading___Toc2007_4183402018"/>
+      <w:bookmarkStart w:id="14" w:name="__RefHeading___Toc1986_3382994897"/>
       <w:bookmarkEnd w:id="14"/>
       <w:r>
         <w:rPr/>
@@ -10286,7 +10286,7 @@
       </w:pPr>
       <w:r>
         <w:rPr/>
-        <w:t>Al salario bruto hay que sumar la cotización a cargo de la empresa. Para 2026, los tipos empresariales del régimen general son el 23,60 % por contingencias comunes, el 5,50 % por desempleo en contratos indefinidos, el 0,20 % del FOGASA, el 0,60 % de formación profesional y el 0,75 % del mecanismo de equidad intergeneracional, más la prima de accidentes de trabajo, que para los servicios de comidas y bebidas (CNAE 56) es del 1,50 % (Ibermutua, 2026). En total, un 32,15 % sobre el salario bruto. La tabla 13 aplica estos porcentajes a la plantilla de Burglar King.</w:t>
+        <w:t>Al salario bruto hay que sumar la cotización a cargo de la empresa. Para 2026, los tipos empresariales del régimen general son el 23,60 % por contingencias comunes, el 5,50 % por desempleo en contratos indefinidos, el 0,20 % del FOGASA, el 0,60 % de formación profesional y el 0,75 % del mecanismo de equidad intergeneracional, más la prima de accidentes de trabajo, que para los servicios de comidas y bebidas (CNAE 56) es del 1,50 % (Ibermutua, 2026). En total, un 32,15 % sobre el salario bruto. La tabla 13 aplica estos porcentajes a la plantilla de Burglar King, que paga por encima del convenio: el salario más bajo del local es de 2.000 euros brutos al mes en 15 pagas, y el resto se escala en la misma proporción que guardan entre sí los niveles del convenio.</w:t>
       </w:r>
     </w:p>
     <w:p>
@@ -10528,7 +10528,7 @@
                 <w:sz w:val="19"/>
                 <w:szCs w:val="19"/>
               </w:rPr>
-              <w:t>Nivel III, indefinido a jornada completa</w:t>
+              <w:t>Nivel III, indefinido a jornada completa; 2.000 € brutos al mes</w:t>
             </w:r>
           </w:p>
         </w:tc>
@@ -10551,7 +10551,7 @@
                 <w:sz w:val="19"/>
                 <w:szCs w:val="19"/>
               </w:rPr>
-              <w:t>18.222,60 €</w:t>
+              <w:t>30.000 €</w:t>
             </w:r>
           </w:p>
         </w:tc>
@@ -10574,7 +10574,7 @@
                 <w:sz w:val="19"/>
                 <w:szCs w:val="19"/>
               </w:rPr>
-              <w:t>24.081 €</w:t>
+              <w:t>39.645 €</w:t>
             </w:r>
           </w:p>
         </w:tc>
@@ -10597,7 +10597,7 @@
                 <w:sz w:val="19"/>
                 <w:szCs w:val="19"/>
               </w:rPr>
-              <w:t>2.007 €</w:t>
+              <w:t>3.304 €</w:t>
             </w:r>
           </w:p>
         </w:tc>
@@ -10648,7 +10648,7 @@
                 <w:sz w:val="19"/>
                 <w:szCs w:val="19"/>
               </w:rPr>
-              <w:t>Nivel III, indefinido a jornada completa</w:t>
+              <w:t>Nivel III, indefinido a jornada completa; 2.000 € brutos al mes</w:t>
             </w:r>
           </w:p>
         </w:tc>
@@ -10671,7 +10671,7 @@
                 <w:sz w:val="19"/>
                 <w:szCs w:val="19"/>
               </w:rPr>
-              <w:t>18.222,60 €</w:t>
+              <w:t>30.000 €</w:t>
             </w:r>
           </w:p>
         </w:tc>
@@ -10694,7 +10694,7 @@
                 <w:sz w:val="19"/>
                 <w:szCs w:val="19"/>
               </w:rPr>
-              <w:t>24.081 €</w:t>
+              <w:t>39.645 €</w:t>
             </w:r>
           </w:p>
         </w:tc>
@@ -10717,7 +10717,7 @@
                 <w:sz w:val="19"/>
                 <w:szCs w:val="19"/>
               </w:rPr>
-              <w:t>2.007 €</w:t>
+              <w:t>3.304 €</w:t>
             </w:r>
           </w:p>
         </w:tc>
@@ -10745,7 +10745,7 @@
                 <w:sz w:val="19"/>
                 <w:szCs w:val="19"/>
               </w:rPr>
-              <w:t>Cocinera</w:t>
+              <w:t>Cocinero</w:t>
             </w:r>
           </w:p>
         </w:tc>
@@ -10768,7 +10768,7 @@
                 <w:sz w:val="19"/>
                 <w:szCs w:val="19"/>
               </w:rPr>
-              <w:t>Nivel II, indefinida a jornada completa</w:t>
+              <w:t>Nivel II, indefinido a jornada completa; 2.122 € brutos al mes</w:t>
             </w:r>
           </w:p>
         </w:tc>
@@ -10791,7 +10791,7 @@
                 <w:sz w:val="19"/>
                 <w:szCs w:val="19"/>
               </w:rPr>
-              <w:t>19.330,35 €</w:t>
+              <w:t>31.830 €</w:t>
             </w:r>
           </w:p>
         </w:tc>
@@ -10814,7 +10814,7 @@
                 <w:sz w:val="19"/>
                 <w:szCs w:val="19"/>
               </w:rPr>
-              <w:t>25.545 €</w:t>
+              <w:t>42.063 €</w:t>
             </w:r>
           </w:p>
         </w:tc>
@@ -10837,7 +10837,7 @@
                 <w:sz w:val="19"/>
                 <w:szCs w:val="19"/>
               </w:rPr>
-              <w:t>2.129 €</w:t>
+              <w:t>3.505 €</w:t>
             </w:r>
           </w:p>
         </w:tc>
@@ -10888,7 +10888,7 @@
                 <w:sz w:val="19"/>
                 <w:szCs w:val="19"/>
               </w:rPr>
-              <w:t>Socio gerente en el régimen de autónomos: sueldo de 2.400 € brutos y cuota de unos 350 € al mes</w:t>
+              <w:t>Socio gerente en el régimen de autónomos: sueldo de 3.950 € brutos y cuota de unos 530 € al mes</w:t>
             </w:r>
           </w:p>
         </w:tc>
@@ -10911,7 +10911,7 @@
                 <w:sz w:val="19"/>
                 <w:szCs w:val="19"/>
               </w:rPr>
-              <w:t>28.800 €</w:t>
+              <w:t>47.400 €</w:t>
             </w:r>
           </w:p>
         </w:tc>
@@ -10934,7 +10934,7 @@
                 <w:sz w:val="19"/>
                 <w:szCs w:val="19"/>
               </w:rPr>
-              <w:t>33.000 €</w:t>
+              <w:t>53.760 €</w:t>
             </w:r>
           </w:p>
         </w:tc>
@@ -10957,7 +10957,7 @@
                 <w:sz w:val="19"/>
                 <w:szCs w:val="19"/>
               </w:rPr>
-              <w:t>2.750 €</w:t>
+              <w:t>4.480 €</w:t>
             </w:r>
           </w:p>
         </w:tc>
@@ -11027,7 +11027,7 @@
                 <w:sz w:val="19"/>
                 <w:szCs w:val="19"/>
               </w:rPr>
-              <w:t>84.576 €</w:t>
+              <w:t>139.230 €</w:t>
             </w:r>
           </w:p>
         </w:tc>
@@ -11050,7 +11050,7 @@
                 <w:sz w:val="19"/>
                 <w:szCs w:val="19"/>
               </w:rPr>
-              <w:t>106.707 €</w:t>
+              <w:t>175.113 €</w:t>
             </w:r>
           </w:p>
         </w:tc>
@@ -11073,7 +11073,7 @@
                 <w:sz w:val="19"/>
                 <w:szCs w:val="19"/>
               </w:rPr>
-              <w:t>8.893 €</w:t>
+              <w:t>14.593 €</w:t>
             </w:r>
           </w:p>
         </w:tc>
@@ -11100,7 +11100,7 @@
           <w:sz w:val="20"/>
           <w:szCs w:val="20"/>
         </w:rPr>
-        <w:t xml:space="preserve"> Elaboración propia. Coste de empresa = bruto × 1,3215. El encargado cotiza como autónomo societario; la cuota depende de su tramo de rendimientos. Redondeado a 9.100 € en la tabla 10 para incluir pluses de transporte y nocturnidad.</w:t>
+        <w:t xml:space="preserve"> Elaboración propia. Coste de empresa = bruto × 1,3215; el encargado cotiza como autónomo societario y su cuota depende del tramo de rendimientos. Redondeado a 14.800 € en la tabla 10 para incluir pluses de transporte y nocturnidad.</w:t>
       </w:r>
     </w:p>
     <w:p>
@@ -11110,7 +11110,7 @@
       </w:pPr>
       <w:r>
         <w:rPr/>
-        <w:t>El coste de personal, unos 9.100 euros al mes, supone el 28 % de las ventas, dentro de la banda del 30 %-35 % que se considera normal en el servicio en mesa (Tourinews, 2025). Es la partida más rígida de la empresa: los salarios de convenio y el SMI suben cada año aunque las ventas no lo hagan. Por eso el proyecto tecnológico no busca reducir plantilla, que ya es mínima, sino que las cuatro personas puedan sacar un servicio más grande sin errores: que el camarero no tenga que volver a la caja a teclear, que la cocinera no tenga que descifrar un papel y que el encargado no tenga que copiar los pedidos de la tableta.</w:t>
+        <w:t>El coste de personal, unos 14.800 euros al mes, supone el 33 % de las ventas, en la banda del 30 %-35 % que se considera normal en el servicio en mesa (Tourinews, 2025). Pagar por encima del convenio es una decisión del negocio: en un sector con mucha rotación, conservar a un equipo de cuatro personas que conoce el local vale más que lo que se ahorraría pagando el mínimo. Es la partida más rígida de la empresa: los salarios de convenio y el SMI suben cada año aunque las ventas no lo hagan. Por eso el proyecto tecnológico no busca reducir plantilla, que ya es mínima, sino que las cuatro personas puedan sacar un servicio más grande sin errores: que el camarero no tenga que volver a la caja a teclear, que el cocinero no tenga que descifrar un papel y que el encargado no tenga que copiar los pedidos de la tableta.</w:t>
       </w:r>
     </w:p>
     <w:p>
@@ -11118,7 +11118,7 @@
         <w:pStyle w:val="Heading2"/>
         <w:rPr/>
       </w:pPr>
-      <w:bookmarkStart w:id="15" w:name="__RefHeading___Toc2009_4183402018"/>
+      <w:bookmarkStart w:id="15" w:name="__RefHeading___Toc1988_3382994897"/>
       <w:bookmarkEnd w:id="15"/>
       <w:r>
         <w:rPr/>
@@ -11966,7 +11966,7 @@
       </w:pPr>
       <w:r>
         <w:rPr/>
-        <w:t xml:space="preserve">Aplicado a toda la carta, el coste de producto ronda el 30 % de las ventas; con los consumibles (papel térmico, envases, productos de limpieza) llega al 32 %, unos 10.470 euros al mes. Las compras se hacen dos veces por semana en el </w:t>
+        <w:t xml:space="preserve">Aplicado a toda la carta, el coste de producto ronda el 32 % de las ventas, unos 14.400 euros al mes; los consumibles (papel térmico, envases, productos de limpieza) se cuentan aparte, en la tabla 15. Las compras se hacen dos veces por semana en el </w:t>
       </w:r>
       <w:r>
         <w:rPr>
@@ -12163,7 +12163,7 @@
                 <w:sz w:val="19"/>
                 <w:szCs w:val="19"/>
               </w:rPr>
-              <w:t>950 €</w:t>
+              <w:t>1.500 €</w:t>
             </w:r>
           </w:p>
         </w:tc>
@@ -12237,7 +12237,7 @@
                 <w:sz w:val="19"/>
                 <w:szCs w:val="19"/>
               </w:rPr>
-              <w:t>180 €</w:t>
+              <w:t>280 €</w:t>
             </w:r>
           </w:p>
         </w:tc>
@@ -12311,7 +12311,7 @@
                 <w:sz w:val="19"/>
                 <w:szCs w:val="19"/>
               </w:rPr>
-              <w:t>90 €</w:t>
+              <w:t>130 €</w:t>
             </w:r>
           </w:p>
         </w:tc>
@@ -12459,7 +12459,7 @@
                 <w:sz w:val="19"/>
                 <w:szCs w:val="19"/>
               </w:rPr>
-              <w:t>130 €</w:t>
+              <w:t>150 €</w:t>
             </w:r>
           </w:p>
         </w:tc>
@@ -12533,7 +12533,7 @@
                 <w:sz w:val="19"/>
                 <w:szCs w:val="19"/>
               </w:rPr>
-              <w:t>150 €</w:t>
+              <w:t>180 €</w:t>
             </w:r>
           </w:p>
         </w:tc>
@@ -12607,7 +12607,7 @@
                 <w:sz w:val="19"/>
                 <w:szCs w:val="19"/>
               </w:rPr>
-              <w:t>340 €</w:t>
+              <w:t>450 €</w:t>
             </w:r>
           </w:p>
         </w:tc>
@@ -12681,7 +12681,7 @@
                 <w:sz w:val="19"/>
                 <w:szCs w:val="19"/>
               </w:rPr>
-              <w:t>60 €</w:t>
+              <w:t>80 €</w:t>
             </w:r>
           </w:p>
         </w:tc>
@@ -12829,7 +12829,7 @@
                 <w:sz w:val="19"/>
                 <w:szCs w:val="19"/>
               </w:rPr>
-              <w:t>340 €</w:t>
+              <w:t>770 €</w:t>
             </w:r>
           </w:p>
         </w:tc>
@@ -12903,7 +12903,7 @@
                 <w:sz w:val="19"/>
                 <w:szCs w:val="19"/>
               </w:rPr>
-              <w:t>2.300 €</w:t>
+              <w:t>3.600 €</w:t>
             </w:r>
           </w:p>
         </w:tc>
@@ -12926,7 +12926,7 @@
                 <w:sz w:val="19"/>
                 <w:szCs w:val="19"/>
               </w:rPr>
-              <w:t>7 % de las ventas</w:t>
+              <w:t>8 % de las ventas</w:t>
             </w:r>
           </w:p>
         </w:tc>
@@ -12953,7 +12953,7 @@
           <w:sz w:val="20"/>
           <w:szCs w:val="20"/>
         </w:rPr>
-        <w:t xml:space="preserve"> Elaboración propia a partir del escenario. Los consumibles de caja y los envases se han contado en la partida de materia prima de la tabla 10.</w:t>
+        <w:t xml:space="preserve"> Elaboración propia a partir del escenario.</w:t>
       </w:r>
     </w:p>
     <w:p>
@@ -12961,7 +12961,7 @@
         <w:pStyle w:val="Heading2"/>
         <w:rPr/>
       </w:pPr>
-      <w:bookmarkStart w:id="16" w:name="__RefHeading___Toc2011_4183402018"/>
+      <w:bookmarkStart w:id="16" w:name="__RefHeading___Toc1990_3382994897"/>
       <w:bookmarkEnd w:id="16"/>
       <w:r>
         <w:rPr/>
@@ -12975,7 +12975,7 @@
       </w:pPr>
       <w:r>
         <w:rPr/>
-        <w:t>Burglar King no es propietaria de su local: lo alquila. El mercado de locales comerciales de Burjassot es asequible en comparación con València ciudad. Los anuncios actuales sitúan el alquiler entre 3 y 14 euros por metro cuadrado al mes, con una media de 7,05 euros (idealista, 2026): los locales pequeños en las zonas más comerciales (Concòrdia, L'Eixereta, el entorno de la estación de metro) están entre 9 y 13 euros por metro cuadrado, y los grandes, de más de 200 metros, bajan a 3-6 euros (tabla 16). Son precios de oferta, no de cierre, y conviene tomarlos como orientación.</w:t>
+        <w:t>Burglar King no es propietaria de su local: lo alquila. El mercado de locales comerciales de Burjassot es asequible en comparación con València ciudad. Fotocasa publica 35 locales en alquiler en el municipio (Fotocasa, 2026) y los anuncios sitúan el alquiler entre 3 y 14 euros por metro cuadrado al mes, con una media de 7,05 euros en idealista (idealista, 2026): los locales pequeños en las zonas más comerciales (Concòrdia, L'Eixereta, el entorno de la estación de metro) están entre 9 y 13 euros por metro cuadrado, y los grandes, de más de 200 metros, bajan a 3-6 euros (tabla 16). Son precios de oferta, no de cierre, y conviene tomarlos como orientación.</w:t>
       </w:r>
     </w:p>
     <w:p>
@@ -13788,6 +13788,366 @@
           <w:tcPr>
             <w:tcW w:w="2699" w:type="dxa"/>
             <w:tcBorders>
+              <w:bottom w:val="single" w:sz="2" w:space="0" w:color="DDDDDD"/>
+            </w:tcBorders>
+          </w:tcPr>
+          <w:p>
+            <w:pPr>
+              <w:pStyle w:val="Normal"/>
+              <w:spacing w:lineRule="auto" w:line="252" w:before="0" w:after="0"/>
+              <w:ind w:hanging="0"/>
+              <w:rPr/>
+            </w:pPr>
+            <w:r>
+              <w:rPr>
+                <w:sz w:val="19"/>
+                <w:szCs w:val="19"/>
+              </w:rPr>
+              <w:t>Burjassot</w:t>
+            </w:r>
+          </w:p>
+        </w:tc>
+        <w:tc>
+          <w:tcPr>
+            <w:tcW w:w="1301" w:type="dxa"/>
+            <w:tcBorders>
+              <w:bottom w:val="single" w:sz="2" w:space="0" w:color="DDDDDD"/>
+            </w:tcBorders>
+          </w:tcPr>
+          <w:p>
+            <w:pPr>
+              <w:pStyle w:val="Normal"/>
+              <w:spacing w:lineRule="auto" w:line="252" w:before="0" w:after="0"/>
+              <w:ind w:hanging="0"/>
+              <w:rPr/>
+            </w:pPr>
+            <w:r>
+              <w:rPr>
+                <w:sz w:val="19"/>
+                <w:szCs w:val="19"/>
+              </w:rPr>
+              <w:t>146 m²</w:t>
+            </w:r>
+          </w:p>
+        </w:tc>
+        <w:tc>
+          <w:tcPr>
+            <w:tcW w:w="1699" w:type="dxa"/>
+            <w:tcBorders>
+              <w:bottom w:val="single" w:sz="2" w:space="0" w:color="DDDDDD"/>
+            </w:tcBorders>
+          </w:tcPr>
+          <w:p>
+            <w:pPr>
+              <w:pStyle w:val="Normal"/>
+              <w:spacing w:lineRule="auto" w:line="252" w:before="0" w:after="0"/>
+              <w:ind w:hanging="0"/>
+              <w:rPr/>
+            </w:pPr>
+            <w:r>
+              <w:rPr>
+                <w:sz w:val="19"/>
+                <w:szCs w:val="19"/>
+              </w:rPr>
+              <w:t>1.000 €</w:t>
+            </w:r>
+          </w:p>
+        </w:tc>
+        <w:tc>
+          <w:tcPr>
+            <w:tcW w:w="1400" w:type="dxa"/>
+            <w:tcBorders>
+              <w:bottom w:val="single" w:sz="2" w:space="0" w:color="DDDDDD"/>
+            </w:tcBorders>
+          </w:tcPr>
+          <w:p>
+            <w:pPr>
+              <w:pStyle w:val="Normal"/>
+              <w:spacing w:lineRule="auto" w:line="252" w:before="0" w:after="0"/>
+              <w:ind w:hanging="0"/>
+              <w:rPr/>
+            </w:pPr>
+            <w:r>
+              <w:rPr>
+                <w:sz w:val="19"/>
+                <w:szCs w:val="19"/>
+              </w:rPr>
+              <w:t>6,85 €</w:t>
+            </w:r>
+          </w:p>
+        </w:tc>
+        <w:tc>
+          <w:tcPr>
+            <w:tcW w:w="1927" w:type="dxa"/>
+            <w:tcBorders>
+              <w:bottom w:val="single" w:sz="2" w:space="0" w:color="DDDDDD"/>
+            </w:tcBorders>
+          </w:tcPr>
+          <w:p>
+            <w:pPr>
+              <w:pStyle w:val="Normal"/>
+              <w:spacing w:lineRule="auto" w:line="252" w:before="0" w:after="0"/>
+              <w:ind w:hanging="0"/>
+              <w:rPr/>
+            </w:pPr>
+            <w:r>
+              <w:rPr>
+                <w:sz w:val="19"/>
+                <w:szCs w:val="19"/>
+              </w:rPr>
+              <w:t>Nuroa (2026)</w:t>
+            </w:r>
+          </w:p>
+        </w:tc>
+      </w:tr>
+      <w:tr>
+        <w:trPr>
+          <w:cantSplit w:val="true"/>
+        </w:trPr>
+        <w:tc>
+          <w:tcPr>
+            <w:tcW w:w="2699" w:type="dxa"/>
+            <w:tcBorders>
+              <w:bottom w:val="single" w:sz="2" w:space="0" w:color="DDDDDD"/>
+            </w:tcBorders>
+          </w:tcPr>
+          <w:p>
+            <w:pPr>
+              <w:pStyle w:val="Normal"/>
+              <w:spacing w:lineRule="auto" w:line="252" w:before="0" w:after="0"/>
+              <w:ind w:hanging="0"/>
+              <w:rPr/>
+            </w:pPr>
+            <w:r>
+              <w:rPr>
+                <w:sz w:val="19"/>
+                <w:szCs w:val="19"/>
+              </w:rPr>
+              <w:t>El Castell (centro)</w:t>
+            </w:r>
+          </w:p>
+        </w:tc>
+        <w:tc>
+          <w:tcPr>
+            <w:tcW w:w="1301" w:type="dxa"/>
+            <w:tcBorders>
+              <w:bottom w:val="single" w:sz="2" w:space="0" w:color="DDDDDD"/>
+            </w:tcBorders>
+          </w:tcPr>
+          <w:p>
+            <w:pPr>
+              <w:pStyle w:val="Normal"/>
+              <w:spacing w:lineRule="auto" w:line="252" w:before="0" w:after="0"/>
+              <w:ind w:hanging="0"/>
+              <w:rPr/>
+            </w:pPr>
+            <w:r>
+              <w:rPr>
+                <w:sz w:val="19"/>
+                <w:szCs w:val="19"/>
+              </w:rPr>
+              <w:t>81 m²</w:t>
+            </w:r>
+          </w:p>
+        </w:tc>
+        <w:tc>
+          <w:tcPr>
+            <w:tcW w:w="1699" w:type="dxa"/>
+            <w:tcBorders>
+              <w:bottom w:val="single" w:sz="2" w:space="0" w:color="DDDDDD"/>
+            </w:tcBorders>
+          </w:tcPr>
+          <w:p>
+            <w:pPr>
+              <w:pStyle w:val="Normal"/>
+              <w:spacing w:lineRule="auto" w:line="252" w:before="0" w:after="0"/>
+              <w:ind w:hanging="0"/>
+              <w:rPr/>
+            </w:pPr>
+            <w:r>
+              <w:rPr>
+                <w:sz w:val="19"/>
+                <w:szCs w:val="19"/>
+              </w:rPr>
+              <w:t>650 €</w:t>
+            </w:r>
+          </w:p>
+        </w:tc>
+        <w:tc>
+          <w:tcPr>
+            <w:tcW w:w="1400" w:type="dxa"/>
+            <w:tcBorders>
+              <w:bottom w:val="single" w:sz="2" w:space="0" w:color="DDDDDD"/>
+            </w:tcBorders>
+          </w:tcPr>
+          <w:p>
+            <w:pPr>
+              <w:pStyle w:val="Normal"/>
+              <w:spacing w:lineRule="auto" w:line="252" w:before="0" w:after="0"/>
+              <w:ind w:hanging="0"/>
+              <w:rPr/>
+            </w:pPr>
+            <w:r>
+              <w:rPr>
+                <w:sz w:val="19"/>
+                <w:szCs w:val="19"/>
+              </w:rPr>
+              <w:t>8,02 €</w:t>
+            </w:r>
+          </w:p>
+        </w:tc>
+        <w:tc>
+          <w:tcPr>
+            <w:tcW w:w="1927" w:type="dxa"/>
+            <w:tcBorders>
+              <w:bottom w:val="single" w:sz="2" w:space="0" w:color="DDDDDD"/>
+            </w:tcBorders>
+          </w:tcPr>
+          <w:p>
+            <w:pPr>
+              <w:pStyle w:val="Normal"/>
+              <w:spacing w:lineRule="auto" w:line="252" w:before="0" w:after="0"/>
+              <w:ind w:hanging="0"/>
+              <w:rPr/>
+            </w:pPr>
+            <w:r>
+              <w:rPr>
+                <w:sz w:val="19"/>
+                <w:szCs w:val="19"/>
+              </w:rPr>
+              <w:t>Fotocasa (2026)</w:t>
+            </w:r>
+          </w:p>
+        </w:tc>
+      </w:tr>
+      <w:tr>
+        <w:trPr>
+          <w:cantSplit w:val="true"/>
+        </w:trPr>
+        <w:tc>
+          <w:tcPr>
+            <w:tcW w:w="2699" w:type="dxa"/>
+            <w:tcBorders>
+              <w:bottom w:val="single" w:sz="2" w:space="0" w:color="DDDDDD"/>
+            </w:tcBorders>
+          </w:tcPr>
+          <w:p>
+            <w:pPr>
+              <w:pStyle w:val="Normal"/>
+              <w:spacing w:lineRule="auto" w:line="252" w:before="0" w:after="0"/>
+              <w:ind w:hanging="0"/>
+              <w:rPr/>
+            </w:pPr>
+            <w:r>
+              <w:rPr>
+                <w:sz w:val="19"/>
+                <w:szCs w:val="19"/>
+              </w:rPr>
+              <w:t>Zona del campus universitario</w:t>
+            </w:r>
+          </w:p>
+        </w:tc>
+        <w:tc>
+          <w:tcPr>
+            <w:tcW w:w="1301" w:type="dxa"/>
+            <w:tcBorders>
+              <w:bottom w:val="single" w:sz="2" w:space="0" w:color="DDDDDD"/>
+            </w:tcBorders>
+          </w:tcPr>
+          <w:p>
+            <w:pPr>
+              <w:pStyle w:val="Normal"/>
+              <w:spacing w:lineRule="auto" w:line="252" w:before="0" w:after="0"/>
+              <w:ind w:hanging="0"/>
+              <w:rPr/>
+            </w:pPr>
+            <w:r>
+              <w:rPr>
+                <w:sz w:val="19"/>
+                <w:szCs w:val="19"/>
+              </w:rPr>
+              <w:t>40 m²</w:t>
+            </w:r>
+          </w:p>
+        </w:tc>
+        <w:tc>
+          <w:tcPr>
+            <w:tcW w:w="1699" w:type="dxa"/>
+            <w:tcBorders>
+              <w:bottom w:val="single" w:sz="2" w:space="0" w:color="DDDDDD"/>
+            </w:tcBorders>
+          </w:tcPr>
+          <w:p>
+            <w:pPr>
+              <w:pStyle w:val="Normal"/>
+              <w:spacing w:lineRule="auto" w:line="252" w:before="0" w:after="0"/>
+              <w:ind w:hanging="0"/>
+              <w:rPr/>
+            </w:pPr>
+            <w:r>
+              <w:rPr>
+                <w:sz w:val="19"/>
+                <w:szCs w:val="19"/>
+              </w:rPr>
+              <w:t>550 €</w:t>
+            </w:r>
+          </w:p>
+        </w:tc>
+        <w:tc>
+          <w:tcPr>
+            <w:tcW w:w="1400" w:type="dxa"/>
+            <w:tcBorders>
+              <w:bottom w:val="single" w:sz="2" w:space="0" w:color="DDDDDD"/>
+            </w:tcBorders>
+          </w:tcPr>
+          <w:p>
+            <w:pPr>
+              <w:pStyle w:val="Normal"/>
+              <w:spacing w:lineRule="auto" w:line="252" w:before="0" w:after="0"/>
+              <w:ind w:hanging="0"/>
+              <w:rPr/>
+            </w:pPr>
+            <w:r>
+              <w:rPr>
+                <w:sz w:val="19"/>
+                <w:szCs w:val="19"/>
+              </w:rPr>
+              <w:t>13,75 €</w:t>
+            </w:r>
+          </w:p>
+        </w:tc>
+        <w:tc>
+          <w:tcPr>
+            <w:tcW w:w="1927" w:type="dxa"/>
+            <w:tcBorders>
+              <w:bottom w:val="single" w:sz="2" w:space="0" w:color="DDDDDD"/>
+            </w:tcBorders>
+          </w:tcPr>
+          <w:p>
+            <w:pPr>
+              <w:pStyle w:val="Normal"/>
+              <w:spacing w:lineRule="auto" w:line="252" w:before="0" w:after="0"/>
+              <w:ind w:hanging="0"/>
+              <w:rPr/>
+            </w:pPr>
+            <w:r>
+              <w:rPr>
+                <w:sz w:val="19"/>
+                <w:szCs w:val="19"/>
+              </w:rPr>
+              <w:t>Fotocasa (2026)</w:t>
+            </w:r>
+          </w:p>
+        </w:tc>
+      </w:tr>
+      <w:tr>
+        <w:trPr>
+          <w:cantSplit w:val="true"/>
+        </w:trPr>
+        <w:tc>
+          <w:tcPr>
+            <w:tcW w:w="2699" w:type="dxa"/>
+            <w:tcBorders>
               <w:bottom w:val="single" w:sz="6" w:space="0" w:color="808080"/>
             </w:tcBorders>
           </w:tcPr>
@@ -13803,7 +14163,7 @@
                 <w:sz w:val="19"/>
                 <w:szCs w:val="19"/>
               </w:rPr>
-              <w:t>Burjassot</w:t>
+              <w:t>Empalme</w:t>
             </w:r>
           </w:p>
         </w:tc>
@@ -13826,7 +14186,7 @@
                 <w:sz w:val="19"/>
                 <w:szCs w:val="19"/>
               </w:rPr>
-              <w:t>146 m²</w:t>
+              <w:t>280 m²</w:t>
             </w:r>
           </w:p>
         </w:tc>
@@ -13849,7 +14209,7 @@
                 <w:sz w:val="19"/>
                 <w:szCs w:val="19"/>
               </w:rPr>
-              <w:t>1.000 €</w:t>
+              <w:t>1.250 €</w:t>
             </w:r>
           </w:p>
         </w:tc>
@@ -13872,7 +14232,7 @@
                 <w:sz w:val="19"/>
                 <w:szCs w:val="19"/>
               </w:rPr>
-              <w:t>6,85 €</w:t>
+              <w:t>4,46 €</w:t>
             </w:r>
           </w:p>
         </w:tc>
@@ -13895,7 +14255,7 @@
                 <w:sz w:val="19"/>
                 <w:szCs w:val="19"/>
               </w:rPr>
-              <w:t>Nuroa (2026)</w:t>
+              <w:t>Fotocasa (2026)</w:t>
             </w:r>
           </w:p>
         </w:tc>
@@ -13922,7 +14282,7 @@
           <w:sz w:val="20"/>
           <w:szCs w:val="20"/>
         </w:rPr>
-        <w:t xml:space="preserve"> Anuncios consultados el 15 de octubre de 2026 en los portales citados; el alquiler mensual de los dos primeros se ha calculado a partir del precio unitario publicado.</w:t>
+        <w:t xml:space="preserve"> Anuncios consultados el 15 de octubre de 2026 en los portales citados; el alquiler mensual de los dos primeros se ha calculado a partir del precio unitario publicado, y el precio por metro de los de Fotocasa a partir del alquiler publicado.</w:t>
       </w:r>
     </w:p>
     <w:p>
@@ -13932,7 +14292,7 @@
       </w:pPr>
       <w:r>
         <w:rPr/>
-        <w:t>El local de Burglar King, de 120 metros cuadrados en planta baja con salida de humos ya instalada, se alquila por 1.000 euros mensuales más IVA, unos 8,30 euros por metro cuadrado, en la media de la zona. Supone el 3 % de las ventas, muy por debajo del 10 % que las guías del sector consideran el límite (Hostelería Madrid, s.f.). El contrato es de arrendamiento para uso distinto de vivienda, regulado por la Ley 29/1994 de Arrendamientos Urbanos, con una duración pactada de diez años, actualización anual con el IPC y una fianza de dos mensualidades, como exige su artículo 36. A ello se suman las obligaciones municipales: la licencia de actividad y apertura, la tasa de ocupación de la vía pública por las cuatro mesas de terraza y el impuesto de bienes inmuebles, que el contrato repercute al inquilino; en conjunto, unos 350 euros al mes.</w:t>
+        <w:t>El local de Burglar King, de 120 metros cuadrados en planta baja con salida de humos ya instalada, se alquila por 1.000 euros mensuales más IVA, unos 8,30 euros por metro cuadrado, en la media de la zona. Supone el 2 % de las ventas, muy por debajo del 10 % que las guías del sector consideran el límite (Hostelería Madrid, s.f.). El contrato es de arrendamiento para uso distinto de vivienda, regulado por la Ley 29/1994 de Arrendamientos Urbanos, con una duración pactada de diez años, actualización anual con el IPC y una fianza de dos mensualidades, como exige su artículo 36. A ello se suman las obligaciones municipales: la licencia de actividad y apertura, la tasa de ocupación de la vía pública por las cuatro mesas de terraza y el impuesto de bienes inmuebles, que el contrato repercute al inquilino; en conjunto, unos 400 euros al mes.</w:t>
       </w:r>
     </w:p>
     <w:p>
@@ -13953,7 +14313,7 @@
         <w:pStyle w:val="Heading1"/>
         <w:rPr/>
       </w:pPr>
-      <w:bookmarkStart w:id="17" w:name="__RefHeading___Toc2013_4183402018"/>
+      <w:bookmarkStart w:id="17" w:name="__RefHeading___Toc1992_3382994897"/>
       <w:bookmarkEnd w:id="17"/>
       <w:r>
         <w:rPr/>
@@ -14204,7 +14564,7 @@
                 <w:sz w:val="19"/>
                 <w:szCs w:val="19"/>
               </w:rPr>
-              <w:t>66 %</w:t>
+              <w:t>65 %</w:t>
             </w:r>
           </w:p>
         </w:tc>
@@ -14398,7 +14758,7 @@
                 <w:sz w:val="19"/>
                 <w:szCs w:val="19"/>
               </w:rPr>
-              <w:t>9 %</w:t>
+              <w:t>10 %</w:t>
             </w:r>
           </w:p>
         </w:tc>
@@ -15040,7 +15400,7 @@
       </w:pPr>
       <w:r>
         <w:rPr/>
-        <w:t>El flujo central de todos esos servicios es el de la comanda (figura 4). Hoy la información nace en la mesa, viaja en papel y a voz hasta la cocina, vuelve al pase y solo entra en un sistema informático en el último paso, cuando el camarero teclea el pedido para cobrarlo. En el reparto el recorrido es peor: el pedido llega a la tableta, el encargado lo copia en papel, la cocinera lo prepara y, cuando el repartidor llega, nadie sabe con certeza si está listo.</w:t>
+        <w:t>El flujo central de todos esos servicios es el de la comanda (figura 4). Hoy la información nace en la mesa, viaja en papel y a voz hasta la cocina, vuelve al pase y solo entra en un sistema informático en el último paso, cuando el camarero teclea el pedido para cobrarlo. En el reparto el recorrido es peor: el pedido llega a la tableta, el encargado lo copia en papel, el cocinero lo prepara y, cuando el repartidor llega, nadie sabe con certeza si está listo.</w:t>
       </w:r>
     </w:p>
     <w:p>
@@ -15157,7 +15517,7 @@
       </w:pPr>
       <w:r>
         <w:rPr/>
-        <w:t>Las plataformas de reparto merecen un comentario aparte, porque son a la vez un canal de venta y un coste. Cobran entre el 15 % y el 30 % del importe de cada pedido, a veces con cuotas fijas, y el mercado está concentrado en Glovo, Uber Eats y Just Eat (Qamarero, 2025). Con 6.000 euros de ventas mensuales por reparto, Burglar King paga unos 1.500 euros de comisiones, más que el alquiler del local. Es una de las razones para potenciar el pedido para llevar directo, sin intermediario, que el proyecto facilitará con la carta del cliente en su propio teléfono.</w:t>
+        <w:t>Las plataformas de reparto merecen un comentario aparte, porque son a la vez un canal de venta y un coste. Cobran entre el 15 % y el 30 % del importe de cada pedido, a veces con cuotas fijas, y el mercado está concentrado en Glovo, Uber Eats y Just Eat (Qamarero, 2025). Con 8.250 euros de ventas mensuales por reparto, Burglar King paga unos 2.100 euros de comisiones, el doble que el alquiler del local. Es una de las razones para potenciar el pedido para llevar directo, sin intermediario, que el proyecto facilitará con la carta del cliente en su propio teléfono.</w:t>
       </w:r>
       <w:r>
         <w:br w:type="page"/>
@@ -15168,7 +15528,7 @@
         <w:pStyle w:val="Heading1"/>
         <w:rPr/>
       </w:pPr>
-      <w:bookmarkStart w:id="18" w:name="__RefHeading___Toc2015_4183402018"/>
+      <w:bookmarkStart w:id="18" w:name="__RefHeading___Toc1994_3382994897"/>
       <w:bookmarkEnd w:id="18"/>
       <w:r>
         <w:rPr/>
@@ -15182,7 +15542,7 @@
       </w:pPr>
       <w:r>
         <w:rPr/>
-        <w:t>Con un presupuesto de unos 300 euros al mes, el 1 % de las ventas, Burglar King no puede hacer publicidad tradicional. Su marketing se apoya en lo que decide de verdad al cliente joven: la reputación en línea y el boca a boca. Según el estudio de TheFork de julio de 2026, el 62 % de los españoles descarta un restaurante por una mala reseña, el 73 % lee las opiniones de otros comensales y el 75 % mira la carta antes de ir, mientras que las redes sociales y la web del local solo influyen en el 17 % (L'Express Franchise, 2026). La prioridad, por tanto, es el perfil de Google y la carta, y después las redes.</w:t>
+        <w:t>Con un presupuesto de unos 450 euros al mes, el 1 % de las ventas, Burglar King no puede hacer publicidad tradicional. Su marketing se apoya en lo que decide de verdad al cliente joven: la reputación en línea y el boca a boca. Según el estudio de TheFork de julio de 2026, el 62 % de los españoles descarta un restaurante por una mala reseña, el 73 % lee las opiniones de otros comensales y el 75 % mira la carta antes de ir, mientras que las redes sociales y la web del local solo influyen en el 17 % (L'Express Franchise, 2026). La prioridad, por tanto, es el perfil de Google y la carta, y después las redes.</w:t>
       </w:r>
     </w:p>
     <w:p>
@@ -15613,7 +15973,7 @@
                 <w:sz w:val="19"/>
                 <w:szCs w:val="19"/>
               </w:rPr>
-              <w:t>120 € (contenido y pequeñas promociones)</w:t>
+              <w:t>180 € (contenido y pequeñas promociones)</w:t>
             </w:r>
           </w:p>
         </w:tc>
@@ -15710,7 +16070,7 @@
                 <w:sz w:val="19"/>
                 <w:szCs w:val="19"/>
               </w:rPr>
-              <w:t>100 € (descuentos)</w:t>
+              <w:t>150 € (descuentos)</w:t>
             </w:r>
           </w:p>
         </w:tc>
@@ -15807,7 +16167,7 @@
                 <w:sz w:val="19"/>
                 <w:szCs w:val="19"/>
               </w:rPr>
-              <w:t>80 € (fotografía y promociones)</w:t>
+              <w:t>120 € (fotografía y promociones)</w:t>
             </w:r>
           </w:p>
         </w:tc>
@@ -16072,7 +16432,7 @@
         <w:pStyle w:val="Heading1"/>
         <w:rPr/>
       </w:pPr>
-      <w:bookmarkStart w:id="19" w:name="__RefHeading___Toc2017_4183402018"/>
+      <w:bookmarkStart w:id="19" w:name="__RefHeading___Toc1996_3382994897"/>
       <w:bookmarkEnd w:id="19"/>
       <w:r>
         <w:rPr/>
@@ -16086,7 +16446,7 @@
       </w:pPr>
       <w:r>
         <w:rPr/>
-        <w:t>Burglar King es una hamburguesería de barrio en Burjassot, con trece mesas, cuatro personas y unas ventas de unos 32.700 euros mensuales sin IVA. Pertenece a la restauración independiente, que agrupa al 93 % de los locales del país, y opera en el sector que más empleo crea en España y uno de los que menos margen deja: la rentabilidad de la restauración fue negativa en 2025. Su empresa de referencia, Hundred Burgers, muestra que una hamburguesería valenciana puede crecer con carta corta, buen producto y un flujo de pedido digital; el caso de Goiko muestra lo rápido que se deshace un negocio de hamburguesas cuando el consumo cae y los costes no.</w:t>
+        <w:t>Burglar King es una hamburguesería de barrio en Burjassot, con trece mesas, cuatro personas y unas ventas de unos 45.000 euros mensuales sin IVA. Pertenece a la restauración independiente, que agrupa al 93 % de los locales del país, y opera en el sector que más empleo crea en España y uno de los que menos margen deja: la rentabilidad de la restauración fue negativa en 2025. Su empresa de referencia, Hundred Burgers, muestra que una hamburguesería valenciana puede crecer con carta corta, buen producto y un flujo de pedido digital; el caso de Goiko muestra lo rápido que se deshace un negocio de hamburguesas cuando el consumo cae y los costes no.</w:t>
       </w:r>
     </w:p>
     <w:p>
@@ -16096,7 +16456,7 @@
       </w:pPr>
       <w:r>
         <w:rPr/>
-        <w:t>Las cifras del modelo de negocio son coherentes con los ratios del sector: la materia prima supone el 32 % de las ventas, el personal el 28 %, el alquiler el 3 % y los suministros el 7 %, lo que deja un resultado antes de impuestos del 11 %. Los salarios los fija el convenio provincial de hostelería, en ultraactividad desde enero de 2026, y la cotización empresarial añade un 32 % al bruto; el alquiler, de 1.000 euros por 120 metros cuadrados, está en la media del mercado de Burjassot. Las comisiones de las plataformas de reparto, unos 1.500 euros al mes, son el coste que más margen tiene de reducirse. La financiación del proyecto tecnológico, de entre 5.000 y 8.000 euros, puede cubrirse con tesorería propia y, si hace falta, con un microcrédito de MicroBank; el Kit Digital ya no existe y las ayudas autonómicas no se darán por hechas.</w:t>
+        <w:t>Las cifras del modelo de negocio son coherentes con los ratios del sector: la materia prima supone el 32 % de las ventas, el personal el 33 %, el alquiler el 2 % y los suministros el 8 %, lo que deja un resultado antes de impuestos del 16 %. Los salarios parten del convenio provincial de hostelería, en ultraactividad desde enero de 2026, pero el local paga por encima de él (2.000 euros brutos el que menos cobra), y la cotización empresarial añade un 32 % al bruto; el alquiler, de 1.000 euros por 120 metros cuadrados, está en la media del mercado de Burjassot. Las comisiones de las plataformas de reparto, unos 2.100 euros al mes, son el coste que más margen tiene de reducirse. La financiación del proyecto tecnológico, de entre 5.000 y 8.000 euros, puede cubrirse con tesorería propia y, si hace falta, con un microcrédito de MicroBank; el Kit Digital ya no existe y las ayudas autonómicas no se darán por hechas.</w:t>
       </w:r>
     </w:p>
     <w:p>
@@ -16106,613 +16466,7 @@
       </w:pPr>
       <w:r>
         <w:rPr/>
-        <w:t>El entorno añade urgencia y oportunidad. Verifactu fija una fecha, el 1 de enero de 2027, a partir de la cual el sistema de facturación actual dejará de ser legal para una sociedad. El fin del soporte de Windows 10 obliga a renovar el puesto de caja en cualquier caso. Y el cliente decide dónde comer mirando las reseñas y la carta en el teléfono, de modo que la reputación en línea es parte del producto. Lo que le falta a la empresa no es dinero, sino alguien que diseñe su infraestructura y la deje funcionando sola: una red separada de la de los clientes, un servidor con copias, cuentas individuales y, sobre todo, que la comanda llegue a la cocina en pantalla y el pedido de reparto no se copie a mano. Ese es el proyecto que los retos siguientes diseñarán, presupuestarán y planificarán.</w:t>
-      </w:r>
-    </w:p>
-    <w:p>
-      <w:pPr>
-        <w:pStyle w:val="Normal"/>
-        <w:keepNext w:val="true"/>
-        <w:spacing w:lineRule="auto" w:line="480" w:before="240" w:after="0"/>
-        <w:ind w:hanging="0"/>
-        <w:rPr/>
-      </w:pPr>
-      <w:r>
-        <w:rPr>
-          <w:b/>
-          <w:bCs/>
-        </w:rPr>
-        <w:t>Tabla 19</w:t>
-      </w:r>
-    </w:p>
-    <w:p>
-      <w:pPr>
-        <w:pStyle w:val="Normal"/>
-        <w:keepNext w:val="true"/>
-        <w:spacing w:lineRule="auto" w:line="480" w:before="0" w:after="120"/>
-        <w:ind w:hanging="0"/>
-        <w:rPr/>
-      </w:pPr>
-      <w:r>
-        <w:rPr>
-          <w:i/>
-          <w:iCs/>
-        </w:rPr>
-        <w:t>Guion de trabajo del proyecto</w:t>
-      </w:r>
-    </w:p>
-    <w:tbl>
-      <w:tblPr>
-        <w:tblW w:w="9026" w:type="dxa"/>
-        <w:jc w:val="left"/>
-        <w:tblInd w:w="0" w:type="dxa"/>
-        <w:tblLayout w:type="fixed"/>
-        <w:tblCellMar>
-          <w:top w:w="60" w:type="dxa"/>
-          <w:left w:w="100" w:type="dxa"/>
-          <w:bottom w:w="60" w:type="dxa"/>
-          <w:right w:w="100" w:type="dxa"/>
-        </w:tblCellMar>
-      </w:tblPr>
-      <w:tblGrid>
-        <w:gridCol w:w="2299"/>
-        <w:gridCol w:w="3601"/>
-        <w:gridCol w:w="3126"/>
-      </w:tblGrid>
-      <w:tr>
-        <w:trPr>
-          <w:tblHeader w:val="true"/>
-          <w:cantSplit w:val="true"/>
-        </w:trPr>
-        <w:tc>
-          <w:tcPr>
-            <w:tcW w:w="2299" w:type="dxa"/>
-            <w:tcBorders>
-              <w:top w:val="single" w:sz="6" w:space="0" w:color="808080"/>
-              <w:bottom w:val="single" w:sz="6" w:space="0" w:color="808080"/>
-            </w:tcBorders>
-            <w:shd w:color="auto" w:fill="FDEBD9" w:val="clear"/>
-          </w:tcPr>
-          <w:p>
-            <w:pPr>
-              <w:pStyle w:val="Normal"/>
-              <w:spacing w:lineRule="auto" w:line="252" w:before="0" w:after="0"/>
-              <w:ind w:hanging="0"/>
-              <w:rPr/>
-            </w:pPr>
-            <w:r>
-              <w:rPr>
-                <w:b/>
-                <w:bCs/>
-                <w:sz w:val="19"/>
-                <w:szCs w:val="19"/>
-              </w:rPr>
-              <w:t>Fase</w:t>
-            </w:r>
-          </w:p>
-        </w:tc>
-        <w:tc>
-          <w:tcPr>
-            <w:tcW w:w="3601" w:type="dxa"/>
-            <w:tcBorders>
-              <w:top w:val="single" w:sz="6" w:space="0" w:color="808080"/>
-              <w:bottom w:val="single" w:sz="6" w:space="0" w:color="808080"/>
-            </w:tcBorders>
-            <w:shd w:color="auto" w:fill="FDEBD9" w:val="clear"/>
-          </w:tcPr>
-          <w:p>
-            <w:pPr>
-              <w:pStyle w:val="Normal"/>
-              <w:spacing w:lineRule="auto" w:line="252" w:before="0" w:after="0"/>
-              <w:ind w:hanging="0"/>
-              <w:rPr/>
-            </w:pPr>
-            <w:r>
-              <w:rPr>
-                <w:b/>
-                <w:bCs/>
-                <w:sz w:val="19"/>
-                <w:szCs w:val="19"/>
-              </w:rPr>
-              <w:t>Contenido</w:t>
-            </w:r>
-          </w:p>
-        </w:tc>
-        <w:tc>
-          <w:tcPr>
-            <w:tcW w:w="3126" w:type="dxa"/>
-            <w:tcBorders>
-              <w:top w:val="single" w:sz="6" w:space="0" w:color="808080"/>
-              <w:bottom w:val="single" w:sz="6" w:space="0" w:color="808080"/>
-            </w:tcBorders>
-            <w:shd w:color="auto" w:fill="FDEBD9" w:val="clear"/>
-          </w:tcPr>
-          <w:p>
-            <w:pPr>
-              <w:pStyle w:val="Normal"/>
-              <w:spacing w:lineRule="auto" w:line="252" w:before="0" w:after="0"/>
-              <w:ind w:hanging="0"/>
-              <w:rPr/>
-            </w:pPr>
-            <w:r>
-              <w:rPr>
-                <w:b/>
-                <w:bCs/>
-                <w:sz w:val="19"/>
-                <w:szCs w:val="19"/>
-              </w:rPr>
-              <w:t>Resultado esperado</w:t>
-            </w:r>
-          </w:p>
-        </w:tc>
-      </w:tr>
-      <w:tr>
-        <w:trPr>
-          <w:cantSplit w:val="true"/>
-        </w:trPr>
-        <w:tc>
-          <w:tcPr>
-            <w:tcW w:w="2299" w:type="dxa"/>
-            <w:tcBorders>
-              <w:bottom w:val="single" w:sz="2" w:space="0" w:color="DDDDDD"/>
-            </w:tcBorders>
-          </w:tcPr>
-          <w:p>
-            <w:pPr>
-              <w:pStyle w:val="Normal"/>
-              <w:spacing w:lineRule="auto" w:line="252" w:before="0" w:after="0"/>
-              <w:ind w:hanging="0"/>
-              <w:rPr/>
-            </w:pPr>
-            <w:r>
-              <w:rPr>
-                <w:sz w:val="19"/>
-                <w:szCs w:val="19"/>
-              </w:rPr>
-              <w:t>Reto 1 (este informe)</w:t>
-            </w:r>
-          </w:p>
-        </w:tc>
-        <w:tc>
-          <w:tcPr>
-            <w:tcW w:w="3601" w:type="dxa"/>
-            <w:tcBorders>
-              <w:bottom w:val="single" w:sz="2" w:space="0" w:color="DDDDDD"/>
-            </w:tcBorders>
-          </w:tcPr>
-          <w:p>
-            <w:pPr>
-              <w:pStyle w:val="Normal"/>
-              <w:spacing w:lineRule="auto" w:line="252" w:before="0" w:after="0"/>
-              <w:ind w:hanging="0"/>
-              <w:rPr/>
-            </w:pPr>
-            <w:r>
-              <w:rPr>
-                <w:sz w:val="19"/>
-                <w:szCs w:val="19"/>
-              </w:rPr>
-              <w:t>Contextualización de la empresa y análisis del entorno económico</w:t>
-            </w:r>
-          </w:p>
-        </w:tc>
-        <w:tc>
-          <w:tcPr>
-            <w:tcW w:w="3126" w:type="dxa"/>
-            <w:tcBorders>
-              <w:bottom w:val="single" w:sz="2" w:space="0" w:color="DDDDDD"/>
-            </w:tcBorders>
-          </w:tcPr>
-          <w:p>
-            <w:pPr>
-              <w:pStyle w:val="Normal"/>
-              <w:spacing w:lineRule="auto" w:line="252" w:before="0" w:after="0"/>
-              <w:ind w:hanging="0"/>
-              <w:rPr/>
-            </w:pPr>
-            <w:r>
-              <w:rPr>
-                <w:sz w:val="19"/>
-                <w:szCs w:val="19"/>
-              </w:rPr>
-              <w:t>Modelo de negocio con cifras y necesidades del proyecto</w:t>
-            </w:r>
-          </w:p>
-        </w:tc>
-      </w:tr>
-      <w:tr>
-        <w:trPr>
-          <w:cantSplit w:val="true"/>
-        </w:trPr>
-        <w:tc>
-          <w:tcPr>
-            <w:tcW w:w="2299" w:type="dxa"/>
-            <w:tcBorders>
-              <w:bottom w:val="single" w:sz="2" w:space="0" w:color="DDDDDD"/>
-            </w:tcBorders>
-          </w:tcPr>
-          <w:p>
-            <w:pPr>
-              <w:pStyle w:val="Normal"/>
-              <w:spacing w:lineRule="auto" w:line="252" w:before="0" w:after="0"/>
-              <w:ind w:hanging="0"/>
-              <w:rPr/>
-            </w:pPr>
-            <w:r>
-              <w:rPr>
-                <w:sz w:val="19"/>
-                <w:szCs w:val="19"/>
-              </w:rPr>
-              <w:t>Reto 2</w:t>
-            </w:r>
-          </w:p>
-        </w:tc>
-        <w:tc>
-          <w:tcPr>
-            <w:tcW w:w="3601" w:type="dxa"/>
-            <w:tcBorders>
-              <w:bottom w:val="single" w:sz="2" w:space="0" w:color="DDDDDD"/>
-            </w:tcBorders>
-          </w:tcPr>
-          <w:p>
-            <w:pPr>
-              <w:pStyle w:val="Normal"/>
-              <w:spacing w:lineRule="auto" w:line="252" w:before="0" w:after="0"/>
-              <w:ind w:hanging="0"/>
-              <w:rPr/>
-            </w:pPr>
-            <w:r>
-              <w:rPr>
-                <w:sz w:val="19"/>
-                <w:szCs w:val="19"/>
-              </w:rPr>
-              <w:t>Diseño de la solución: red segmentada, servidor y puestos</w:t>
-            </w:r>
-          </w:p>
-        </w:tc>
-        <w:tc>
-          <w:tcPr>
-            <w:tcW w:w="3126" w:type="dxa"/>
-            <w:tcBorders>
-              <w:bottom w:val="single" w:sz="2" w:space="0" w:color="DDDDDD"/>
-            </w:tcBorders>
-          </w:tcPr>
-          <w:p>
-            <w:pPr>
-              <w:pStyle w:val="Normal"/>
-              <w:spacing w:lineRule="auto" w:line="252" w:before="0" w:after="0"/>
-              <w:ind w:hanging="0"/>
-              <w:rPr/>
-            </w:pPr>
-            <w:r>
-              <w:rPr>
-                <w:sz w:val="19"/>
-                <w:szCs w:val="19"/>
-              </w:rPr>
-              <w:t>Esquema lógico y físico, direccionamiento y elección del hardware</w:t>
-            </w:r>
-          </w:p>
-        </w:tc>
-      </w:tr>
-      <w:tr>
-        <w:trPr>
-          <w:cantSplit w:val="true"/>
-        </w:trPr>
-        <w:tc>
-          <w:tcPr>
-            <w:tcW w:w="2299" w:type="dxa"/>
-            <w:tcBorders>
-              <w:bottom w:val="single" w:sz="2" w:space="0" w:color="DDDDDD"/>
-            </w:tcBorders>
-          </w:tcPr>
-          <w:p>
-            <w:pPr>
-              <w:pStyle w:val="Normal"/>
-              <w:spacing w:lineRule="auto" w:line="252" w:before="0" w:after="0"/>
-              <w:ind w:hanging="0"/>
-              <w:rPr/>
-            </w:pPr>
-            <w:r>
-              <w:rPr>
-                <w:sz w:val="19"/>
-                <w:szCs w:val="19"/>
-              </w:rPr>
-              <w:t>Reto 3</w:t>
-            </w:r>
-          </w:p>
-        </w:tc>
-        <w:tc>
-          <w:tcPr>
-            <w:tcW w:w="3601" w:type="dxa"/>
-            <w:tcBorders>
-              <w:bottom w:val="single" w:sz="2" w:space="0" w:color="DDDDDD"/>
-            </w:tcBorders>
-          </w:tcPr>
-          <w:p>
-            <w:pPr>
-              <w:pStyle w:val="Normal"/>
-              <w:spacing w:lineRule="auto" w:line="252" w:before="0" w:after="0"/>
-              <w:ind w:hanging="0"/>
-              <w:rPr/>
-            </w:pPr>
-            <w:r>
-              <w:rPr>
-                <w:sz w:val="19"/>
-                <w:szCs w:val="19"/>
-              </w:rPr>
-              <w:t>Viabilidad técnica y objetivos con sus indicadores</w:t>
-            </w:r>
-          </w:p>
-        </w:tc>
-        <w:tc>
-          <w:tcPr>
-            <w:tcW w:w="3126" w:type="dxa"/>
-            <w:tcBorders>
-              <w:bottom w:val="single" w:sz="2" w:space="0" w:color="DDDDDD"/>
-            </w:tcBorders>
-          </w:tcPr>
-          <w:p>
-            <w:pPr>
-              <w:pStyle w:val="Normal"/>
-              <w:spacing w:lineRule="auto" w:line="252" w:before="0" w:after="0"/>
-              <w:ind w:hanging="0"/>
-              <w:rPr/>
-            </w:pPr>
-            <w:r>
-              <w:rPr>
-                <w:sz w:val="19"/>
-                <w:szCs w:val="19"/>
-              </w:rPr>
-              <w:t>Estudio de viabilidad e indicadores para medir el éxito</w:t>
-            </w:r>
-          </w:p>
-        </w:tc>
-      </w:tr>
-      <w:tr>
-        <w:trPr>
-          <w:cantSplit w:val="true"/>
-        </w:trPr>
-        <w:tc>
-          <w:tcPr>
-            <w:tcW w:w="2299" w:type="dxa"/>
-            <w:tcBorders>
-              <w:bottom w:val="single" w:sz="2" w:space="0" w:color="DDDDDD"/>
-            </w:tcBorders>
-          </w:tcPr>
-          <w:p>
-            <w:pPr>
-              <w:pStyle w:val="Normal"/>
-              <w:spacing w:lineRule="auto" w:line="252" w:before="0" w:after="0"/>
-              <w:ind w:hanging="0"/>
-              <w:rPr/>
-            </w:pPr>
-            <w:r>
-              <w:rPr>
-                <w:sz w:val="19"/>
-                <w:szCs w:val="19"/>
-              </w:rPr>
-              <w:t>Reto 4</w:t>
-            </w:r>
-          </w:p>
-        </w:tc>
-        <w:tc>
-          <w:tcPr>
-            <w:tcW w:w="3601" w:type="dxa"/>
-            <w:tcBorders>
-              <w:bottom w:val="single" w:sz="2" w:space="0" w:color="DDDDDD"/>
-            </w:tcBorders>
-          </w:tcPr>
-          <w:p>
-            <w:pPr>
-              <w:pStyle w:val="Normal"/>
-              <w:spacing w:lineRule="auto" w:line="252" w:before="0" w:after="0"/>
-              <w:ind w:hanging="0"/>
-              <w:rPr/>
-            </w:pPr>
-            <w:r>
-              <w:rPr>
-                <w:sz w:val="19"/>
-                <w:szCs w:val="19"/>
-              </w:rPr>
-              <w:t>Recursos y presupuesto</w:t>
-            </w:r>
-          </w:p>
-        </w:tc>
-        <w:tc>
-          <w:tcPr>
-            <w:tcW w:w="3126" w:type="dxa"/>
-            <w:tcBorders>
-              <w:bottom w:val="single" w:sz="2" w:space="0" w:color="DDDDDD"/>
-            </w:tcBorders>
-          </w:tcPr>
-          <w:p>
-            <w:pPr>
-              <w:pStyle w:val="Normal"/>
-              <w:spacing w:lineRule="auto" w:line="252" w:before="0" w:after="0"/>
-              <w:ind w:hanging="0"/>
-              <w:rPr/>
-            </w:pPr>
-            <w:r>
-              <w:rPr>
-                <w:sz w:val="19"/>
-                <w:szCs w:val="19"/>
-              </w:rPr>
-              <w:t>Presupuesto detallado y comparación a cinco años con las alternativas</w:t>
-            </w:r>
-          </w:p>
-        </w:tc>
-      </w:tr>
-      <w:tr>
-        <w:trPr>
-          <w:cantSplit w:val="true"/>
-        </w:trPr>
-        <w:tc>
-          <w:tcPr>
-            <w:tcW w:w="2299" w:type="dxa"/>
-            <w:tcBorders>
-              <w:bottom w:val="single" w:sz="2" w:space="0" w:color="DDDDDD"/>
-            </w:tcBorders>
-          </w:tcPr>
-          <w:p>
-            <w:pPr>
-              <w:pStyle w:val="Normal"/>
-              <w:spacing w:lineRule="auto" w:line="252" w:before="0" w:after="0"/>
-              <w:ind w:hanging="0"/>
-              <w:rPr/>
-            </w:pPr>
-            <w:r>
-              <w:rPr>
-                <w:sz w:val="19"/>
-                <w:szCs w:val="19"/>
-              </w:rPr>
-              <w:t>Reto 5</w:t>
-            </w:r>
-          </w:p>
-        </w:tc>
-        <w:tc>
-          <w:tcPr>
-            <w:tcW w:w="3601" w:type="dxa"/>
-            <w:tcBorders>
-              <w:bottom w:val="single" w:sz="2" w:space="0" w:color="DDDDDD"/>
-            </w:tcBorders>
-          </w:tcPr>
-          <w:p>
-            <w:pPr>
-              <w:pStyle w:val="Normal"/>
-              <w:spacing w:lineRule="auto" w:line="252" w:before="0" w:after="0"/>
-              <w:ind w:hanging="0"/>
-              <w:rPr/>
-            </w:pPr>
-            <w:r>
-              <w:rPr>
-                <w:sz w:val="19"/>
-                <w:szCs w:val="19"/>
-              </w:rPr>
-              <w:t>Documentación del diseño y control de calidad</w:t>
-            </w:r>
-          </w:p>
-        </w:tc>
-        <w:tc>
-          <w:tcPr>
-            <w:tcW w:w="3126" w:type="dxa"/>
-            <w:tcBorders>
-              <w:bottom w:val="single" w:sz="2" w:space="0" w:color="DDDDDD"/>
-            </w:tcBorders>
-          </w:tcPr>
-          <w:p>
-            <w:pPr>
-              <w:pStyle w:val="Normal"/>
-              <w:spacing w:lineRule="auto" w:line="252" w:before="0" w:after="0"/>
-              <w:ind w:hanging="0"/>
-              <w:rPr/>
-            </w:pPr>
-            <w:r>
-              <w:rPr>
-                <w:sz w:val="19"/>
-                <w:szCs w:val="19"/>
-              </w:rPr>
-              <w:t>Memoria técnica y plan de pruebas</w:t>
-            </w:r>
-          </w:p>
-        </w:tc>
-      </w:tr>
-      <w:tr>
-        <w:trPr>
-          <w:cantSplit w:val="true"/>
-        </w:trPr>
-        <w:tc>
-          <w:tcPr>
-            <w:tcW w:w="2299" w:type="dxa"/>
-            <w:tcBorders>
-              <w:bottom w:val="single" w:sz="6" w:space="0" w:color="808080"/>
-            </w:tcBorders>
-          </w:tcPr>
-          <w:p>
-            <w:pPr>
-              <w:pStyle w:val="Normal"/>
-              <w:spacing w:lineRule="auto" w:line="252" w:before="0" w:after="0"/>
-              <w:ind w:hanging="0"/>
-              <w:rPr/>
-            </w:pPr>
-            <w:r>
-              <w:rPr>
-                <w:sz w:val="19"/>
-                <w:szCs w:val="19"/>
-              </w:rPr>
-              <w:t>Reto 6</w:t>
-            </w:r>
-          </w:p>
-        </w:tc>
-        <w:tc>
-          <w:tcPr>
-            <w:tcW w:w="3601" w:type="dxa"/>
-            <w:tcBorders>
-              <w:bottom w:val="single" w:sz="6" w:space="0" w:color="808080"/>
-            </w:tcBorders>
-          </w:tcPr>
-          <w:p>
-            <w:pPr>
-              <w:pStyle w:val="Normal"/>
-              <w:spacing w:lineRule="auto" w:line="252" w:before="0" w:after="0"/>
-              <w:ind w:hanging="0"/>
-              <w:rPr/>
-            </w:pPr>
-            <w:r>
-              <w:rPr>
-                <w:sz w:val="19"/>
-                <w:szCs w:val="19"/>
-              </w:rPr>
-              <w:t>Plan de intervención: actividades, logística, riesgos y permisos</w:t>
-            </w:r>
-          </w:p>
-        </w:tc>
-        <w:tc>
-          <w:tcPr>
-            <w:tcW w:w="3126" w:type="dxa"/>
-            <w:tcBorders>
-              <w:bottom w:val="single" w:sz="6" w:space="0" w:color="808080"/>
-            </w:tcBorders>
-          </w:tcPr>
-          <w:p>
-            <w:pPr>
-              <w:pStyle w:val="Normal"/>
-              <w:spacing w:lineRule="auto" w:line="252" w:before="0" w:after="0"/>
-              <w:ind w:hanging="0"/>
-              <w:rPr/>
-            </w:pPr>
-            <w:r>
-              <w:rPr>
-                <w:sz w:val="19"/>
-                <w:szCs w:val="19"/>
-              </w:rPr>
-              <w:t>Calendario de ejecución y plan de prevención</w:t>
-            </w:r>
-          </w:p>
-        </w:tc>
-      </w:tr>
-    </w:tbl>
-    <w:p>
-      <w:pPr>
-        <w:pStyle w:val="Normal"/>
-        <w:spacing w:lineRule="auto" w:line="276" w:before="80" w:after="240"/>
-        <w:ind w:hanging="0"/>
-        <w:rPr/>
-      </w:pPr>
-      <w:r>
-        <w:rPr>
-          <w:i/>
-          <w:iCs/>
-          <w:sz w:val="20"/>
-          <w:szCs w:val="20"/>
-        </w:rPr>
-        <w:t>Nota.</w:t>
-      </w:r>
-      <w:r>
-        <w:rPr>
-          <w:sz w:val="20"/>
-          <w:szCs w:val="20"/>
-        </w:rPr>
-        <w:t xml:space="preserve"> Elaboración propia. El reparto de contenidos entre los retos 2 a 6 se ajustará a sus enunciados cuando se publiquen.</w:t>
+        <w:t>El entorno añade urgencia y oportunidad. Verifactu fija una fecha, el 1 de enero de 2027, a partir de la cual el sistema de facturación actual dejará de ser legal para una sociedad. El fin del soporte de Windows 10 obliga a renovar el puesto de caja en cualquier caso. Y el cliente decide dónde comer mirando las reseñas y la carta en el teléfono, de modo que la reputación en línea es parte del producto. Lo que le falta a la empresa no es dinero, sino alguien que diseñe su infraestructura y la deje funcionando sola: una red separada de la de los clientes, un servidor con copias, cuentas individuales y, sobre todo, que la comanda llegue a la cocina en pantalla y el pedido de reparto no se copie a mano. Ese es el proyecto que este informe deja planteado.</w:t>
       </w:r>
       <w:r>
         <w:br w:type="page"/>
@@ -16723,7 +16477,7 @@
         <w:pStyle w:val="Heading1"/>
         <w:rPr/>
       </w:pPr>
-      <w:bookmarkStart w:id="20" w:name="__RefHeading___Toc2019_4183402018"/>
+      <w:bookmarkStart w:id="20" w:name="__RefHeading___Toc1998_3382994897"/>
       <w:bookmarkEnd w:id="20"/>
       <w:r>
         <w:rPr/>
@@ -16904,6 +16658,28 @@
       <w:r>
         <w:rPr/>
         <w:t>. https://forbes.es/ultima-hora/1009888/goiko-dispara-un-161-sus-perdidas-hasta-los-364-millones-en-2025/</w:t>
+      </w:r>
+    </w:p>
+    <w:p>
+      <w:pPr>
+        <w:pStyle w:val="Normal"/>
+        <w:ind w:hanging="720" w:left="720"/>
+        <w:rPr/>
+      </w:pPr>
+      <w:r>
+        <w:rPr/>
+        <w:t xml:space="preserve">Fotocasa. (2026). </w:t>
+      </w:r>
+      <w:r>
+        <w:rPr>
+          <w:i/>
+          <w:iCs/>
+        </w:rPr>
+        <w:t>Locales de alquiler en Burjassot</w:t>
+      </w:r>
+      <w:r>
+        <w:rPr/>
+        <w:t>. https://www.fotocasa.es/es/alquiler/locales/burjassot/todas-las-zonas/l</w:t>
       </w:r>
     </w:p>
     <w:p>
@@ -17791,7 +17567,7 @@
     </w:r>
     <w:r>
       <w:rPr/>
-      <w:t>34</w:t>
+      <w:t>35</w:t>
     </w:r>
     <w:r>
       <w:rPr/>
@@ -17815,7 +17591,7 @@
     </w:r>
     <w:r>
       <w:rPr/>
-      <w:t>34</w:t>
+      <w:t>35</w:t>
     </w:r>
     <w:r>
       <w:rPr/>

</xml_diff>

<commit_message>
Reto 1: informe corregido tras la revisión de Economía, Empresariales y Derecho
Plantilla de 6 personas (ayudante de cocina y extra de sala) que cubre el horario,
con salarios un 15 % sobre convenio y el cocinero en el nivel III. Cuenta de
resultados con EBITDA, amortización, intereses, impuesto sobre sociedades y
resultado neto; punto muerto, margen de seguridad y sensibilidad. Lecturas de
fuentes corregidas (rentabilidad de la restauración, INE TIC, Goiko, Hundred,
comisiones de reparto, alquileres), inflación de 2026 y Digitaliza-CV.
Obligaciones legales completadas: protección de datos y videovigilancia,
factura simplificada, envases y residuos, consumo, APPCC, prevención de riesgos,
LSSI y Verifactu con su sanción. Bibliografía con títulos oficiales.
</commit_message>
<xml_diff>
--- a/docs/reto1/reto1_contexto_tecnologico.docx
+++ b/docs/reto1/reto1_contexto_tecnologico.docx
@@ -193,7 +193,7 @@
             </w:rPr>
             <w:fldChar w:fldCharType="separate"/>
           </w:r>
-          <w:hyperlink w:anchor="__RefHeading___Toc1958_3382994897">
+          <w:hyperlink w:anchor="__RefHeading___Toc2091_2846471793">
             <w:r>
               <w:rPr>
                 <w:rStyle w:val="IndexLink"/>
@@ -213,7 +213,7 @@
             </w:tabs>
             <w:rPr/>
           </w:pPr>
-          <w:hyperlink w:anchor="__RefHeading___Toc1960_3382994897">
+          <w:hyperlink w:anchor="__RefHeading___Toc2093_2846471793">
             <w:r>
               <w:rPr>
                 <w:rStyle w:val="IndexLink"/>
@@ -233,7 +233,7 @@
             </w:tabs>
             <w:rPr/>
           </w:pPr>
-          <w:hyperlink w:anchor="__RefHeading___Toc1962_3382994897">
+          <w:hyperlink w:anchor="__RefHeading___Toc2095_2846471793">
             <w:r>
               <w:rPr>
                 <w:rStyle w:val="IndexLink"/>
@@ -253,7 +253,7 @@
             </w:tabs>
             <w:rPr/>
           </w:pPr>
-          <w:hyperlink w:anchor="__RefHeading___Toc1964_3382994897">
+          <w:hyperlink w:anchor="__RefHeading___Toc2097_2846471793">
             <w:r>
               <w:rPr>
                 <w:rStyle w:val="IndexLink"/>
@@ -273,7 +273,7 @@
             </w:tabs>
             <w:rPr/>
           </w:pPr>
-          <w:hyperlink w:anchor="__RefHeading___Toc1966_3382994897">
+          <w:hyperlink w:anchor="__RefHeading___Toc2099_2846471793">
             <w:r>
               <w:rPr>
                 <w:rStyle w:val="IndexLink"/>
@@ -293,7 +293,7 @@
             </w:tabs>
             <w:rPr/>
           </w:pPr>
-          <w:hyperlink w:anchor="__RefHeading___Toc1968_3382994897">
+          <w:hyperlink w:anchor="__RefHeading___Toc2101_2846471793">
             <w:r>
               <w:rPr>
                 <w:rStyle w:val="IndexLink"/>
@@ -313,7 +313,7 @@
             </w:tabs>
             <w:rPr/>
           </w:pPr>
-          <w:hyperlink w:anchor="__RefHeading___Toc1970_3382994897">
+          <w:hyperlink w:anchor="__RefHeading___Toc2103_2846471793">
             <w:r>
               <w:rPr>
                 <w:rStyle w:val="IndexLink"/>
@@ -333,7 +333,7 @@
             </w:tabs>
             <w:rPr/>
           </w:pPr>
-          <w:hyperlink w:anchor="__RefHeading___Toc1972_3382994897">
+          <w:hyperlink w:anchor="__RefHeading___Toc2105_2846471793">
             <w:r>
               <w:rPr>
                 <w:rStyle w:val="IndexLink"/>
@@ -353,7 +353,7 @@
             </w:tabs>
             <w:rPr/>
           </w:pPr>
-          <w:hyperlink w:anchor="__RefHeading___Toc1974_3382994897">
+          <w:hyperlink w:anchor="__RefHeading___Toc2107_2846471793">
             <w:r>
               <w:rPr>
                 <w:rStyle w:val="IndexLink"/>
@@ -373,14 +373,14 @@
             </w:tabs>
             <w:rPr/>
           </w:pPr>
-          <w:hyperlink w:anchor="__RefHeading___Toc1976_3382994897">
+          <w:hyperlink w:anchor="__RefHeading___Toc2109_2846471793">
             <w:r>
               <w:rPr>
                 <w:rStyle w:val="IndexLink"/>
               </w:rPr>
               <w:t>3. Análisis del entorno económico</w:t>
               <w:tab/>
-              <w:t>11</w:t>
+              <w:t>12</w:t>
             </w:r>
           </w:hyperlink>
         </w:p>
@@ -393,14 +393,14 @@
             </w:tabs>
             <w:rPr/>
           </w:pPr>
-          <w:hyperlink w:anchor="__RefHeading___Toc1978_3382994897">
+          <w:hyperlink w:anchor="__RefHeading___Toc2111_2846471793">
             <w:r>
               <w:rPr>
                 <w:rStyle w:val="IndexLink"/>
               </w:rPr>
               <w:t>3.1. Factores macroeconómicos</w:t>
               <w:tab/>
-              <w:t>11</w:t>
+              <w:t>12</w:t>
             </w:r>
           </w:hyperlink>
         </w:p>
@@ -413,14 +413,14 @@
             </w:tabs>
             <w:rPr/>
           </w:pPr>
-          <w:hyperlink w:anchor="__RefHeading___Toc1980_3382994897">
+          <w:hyperlink w:anchor="__RefHeading___Toc2113_2846471793">
             <w:r>
               <w:rPr>
                 <w:rStyle w:val="IndexLink"/>
               </w:rPr>
               <w:t>3.2. Factores microeconómicos</w:t>
               <w:tab/>
-              <w:t>13</w:t>
+              <w:t>16</w:t>
             </w:r>
           </w:hyperlink>
         </w:p>
@@ -433,14 +433,14 @@
             </w:tabs>
             <w:rPr/>
           </w:pPr>
-          <w:hyperlink w:anchor="__RefHeading___Toc1982_3382994897">
+          <w:hyperlink w:anchor="__RefHeading___Toc2115_2846471793">
             <w:r>
               <w:rPr>
                 <w:rStyle w:val="IndexLink"/>
               </w:rPr>
               <w:t>4. Modelo de negocio y finanzas</w:t>
               <w:tab/>
-              <w:t>16</w:t>
+              <w:t>19</w:t>
             </w:r>
           </w:hyperlink>
         </w:p>
@@ -453,14 +453,14 @@
             </w:tabs>
             <w:rPr/>
           </w:pPr>
-          <w:hyperlink w:anchor="__RefHeading___Toc1984_3382994897">
+          <w:hyperlink w:anchor="__RefHeading___Toc2117_2846471793">
             <w:r>
               <w:rPr>
                 <w:rStyle w:val="IndexLink"/>
               </w:rPr>
               <w:t>4.1. Financiación</w:t>
               <w:tab/>
-              <w:t>17</w:t>
+              <w:t>21</w:t>
             </w:r>
           </w:hyperlink>
         </w:p>
@@ -473,14 +473,14 @@
             </w:tabs>
             <w:rPr/>
           </w:pPr>
-          <w:hyperlink w:anchor="__RefHeading___Toc1986_3382994897">
+          <w:hyperlink w:anchor="__RefHeading___Toc2119_2846471793">
             <w:r>
               <w:rPr>
                 <w:rStyle w:val="IndexLink"/>
               </w:rPr>
               <w:t>4.2. Salarios</w:t>
               <w:tab/>
-              <w:t>19</w:t>
+              <w:t>23</w:t>
             </w:r>
           </w:hyperlink>
         </w:p>
@@ -493,14 +493,14 @@
             </w:tabs>
             <w:rPr/>
           </w:pPr>
-          <w:hyperlink w:anchor="__RefHeading___Toc1988_3382994897">
+          <w:hyperlink w:anchor="__RefHeading___Toc2121_2846471793">
             <w:r>
               <w:rPr>
                 <w:rStyle w:val="IndexLink"/>
               </w:rPr>
               <w:t>4.3. Gastos materiales</w:t>
               <w:tab/>
-              <w:t>21</w:t>
+              <w:t>26</w:t>
             </w:r>
           </w:hyperlink>
         </w:p>
@@ -513,14 +513,14 @@
             </w:tabs>
             <w:rPr/>
           </w:pPr>
-          <w:hyperlink w:anchor="__RefHeading___Toc1990_3382994897">
+          <w:hyperlink w:anchor="__RefHeading___Toc2123_2846471793">
             <w:r>
               <w:rPr>
                 <w:rStyle w:val="IndexLink"/>
               </w:rPr>
               <w:t>4.4. Locales de alquiler</w:t>
               <w:tab/>
-              <w:t>22</w:t>
+              <w:t>27</w:t>
             </w:r>
           </w:hyperlink>
         </w:p>
@@ -533,14 +533,14 @@
             </w:tabs>
             <w:rPr/>
           </w:pPr>
-          <w:hyperlink w:anchor="__RefHeading___Toc1992_3382994897">
+          <w:hyperlink w:anchor="__RefHeading___Toc2125_2846471793">
             <w:r>
               <w:rPr>
                 <w:rStyle w:val="IndexLink"/>
               </w:rPr>
               <w:t>5. Servicios prestados</w:t>
               <w:tab/>
-              <w:t>25</w:t>
+              <w:t>30</w:t>
             </w:r>
           </w:hyperlink>
         </w:p>
@@ -553,14 +553,14 @@
             </w:tabs>
             <w:rPr/>
           </w:pPr>
-          <w:hyperlink w:anchor="__RefHeading___Toc1994_3382994897">
+          <w:hyperlink w:anchor="__RefHeading___Toc2127_2846471793">
             <w:r>
               <w:rPr>
                 <w:rStyle w:val="IndexLink"/>
               </w:rPr>
               <w:t>6. Publicidad (marketing)</w:t>
               <w:tab/>
-              <w:t>27</w:t>
+              <w:t>32</w:t>
             </w:r>
           </w:hyperlink>
         </w:p>
@@ -573,14 +573,14 @@
             </w:tabs>
             <w:rPr/>
           </w:pPr>
-          <w:hyperlink w:anchor="__RefHeading___Toc1996_3382994897">
+          <w:hyperlink w:anchor="__RefHeading___Toc2129_2846471793">
             <w:r>
               <w:rPr>
                 <w:rStyle w:val="IndexLink"/>
               </w:rPr>
               <w:t>7. Conclusiones</w:t>
               <w:tab/>
-              <w:t>29</w:t>
+              <w:t>34</w:t>
             </w:r>
           </w:hyperlink>
         </w:p>
@@ -593,14 +593,14 @@
             </w:tabs>
             <w:rPr/>
           </w:pPr>
-          <w:hyperlink w:anchor="__RefHeading___Toc1998_3382994897">
+          <w:hyperlink w:anchor="__RefHeading___Toc2131_2846471793">
             <w:r>
               <w:rPr>
                 <w:rStyle w:val="IndexLink"/>
               </w:rPr>
               <w:t>8. Bibliografía</w:t>
               <w:tab/>
-              <w:t>31</w:t>
+              <w:t>36</w:t>
             </w:r>
           </w:hyperlink>
           <w:r>
@@ -634,7 +634,7 @@
         <w:pStyle w:val="Heading1"/>
         <w:rPr/>
       </w:pPr>
-      <w:bookmarkStart w:id="0" w:name="__RefHeading___Toc1958_3382994897"/>
+      <w:bookmarkStart w:id="0" w:name="__RefHeading___Toc2091_2846471793"/>
       <w:bookmarkEnd w:id="0"/>
       <w:r>
         <w:rPr/>
@@ -677,7 +677,7 @@
         <w:pStyle w:val="Heading2"/>
         <w:rPr/>
       </w:pPr>
-      <w:bookmarkStart w:id="1" w:name="__RefHeading___Toc1960_3382994897"/>
+      <w:bookmarkStart w:id="1" w:name="__RefHeading___Toc2093_2846471793"/>
       <w:bookmarkEnd w:id="1"/>
       <w:r>
         <w:rPr/>
@@ -1094,7 +1094,7 @@
                 <w:sz w:val="19"/>
                 <w:szCs w:val="19"/>
               </w:rPr>
-              <w:t>4 personas: encargado (socio gerente), 2 camareros y 1 cocinero</w:t>
+              <w:t>6 personas (5,5 a jornada completa): encargado (socio gerente), 2 camareros, 1 cocinero, 1 ayudante de cocina y 1 extra de sala a media jornada para el fin de semana</w:t>
             </w:r>
           </w:p>
         </w:tc>
@@ -1292,7 +1292,7 @@
         <w:pStyle w:val="Heading2"/>
         <w:rPr/>
       </w:pPr>
-      <w:bookmarkStart w:id="2" w:name="__RefHeading___Toc1962_3382994897"/>
+      <w:bookmarkStart w:id="2" w:name="__RefHeading___Toc2095_2846471793"/>
       <w:bookmarkEnd w:id="2"/>
       <w:r>
         <w:rPr/>
@@ -1724,7 +1724,7 @@
                 <w:sz w:val="19"/>
                 <w:szCs w:val="19"/>
               </w:rPr>
-              <w:t>2 camareros</w:t>
+              <w:t>2 camareros y 1 extra de fin de semana</w:t>
             </w:r>
           </w:p>
         </w:tc>
@@ -1821,7 +1821,7 @@
                 <w:sz w:val="19"/>
                 <w:szCs w:val="19"/>
               </w:rPr>
-              <w:t>1 cocinero</w:t>
+              <w:t>1 cocinero y 1 ayudante de cocina</w:t>
             </w:r>
           </w:p>
         </w:tc>
@@ -2001,7 +2001,7 @@
       </w:pPr>
       <w:r>
         <w:rPr/>
-        <w:t>La lectura organizativa más importante es la concentración: el encargado es a la vez dirección, compras, caja, administración y, en la práctica, el único «responsable de informática». Si él falta, nadie sabe reiniciar el router, recuperar la contraseña del TPV o consultar un pedido de una plataforma. Es un punto único de fallo humano, igual que lo hay técnico.</w:t>
+        <w:t>La lectura organizativa más importante es la concentración: el encargado es a la vez dirección, compras, caja, administración y, en la práctica, el único «responsable de informática». Si él falta, nadie sabe reiniciar el router, recuperar la contraseña del TPV o consultar un pedido de una plataforma. Es un punto único de fallo humano, igual que lo hay técnico. Con un único cocinero, la cocina sería un segundo punto único de fallo: por eso la plantilla incluye un ayudante de cocina que cubre sus descansos y sus vacaciones (apartado 4.2).</w:t>
       </w:r>
     </w:p>
     <w:p>
@@ -2009,7 +2009,7 @@
         <w:pStyle w:val="Heading2"/>
         <w:rPr/>
       </w:pPr>
-      <w:bookmarkStart w:id="3" w:name="__RefHeading___Toc1964_3382994897"/>
+      <w:bookmarkStart w:id="3" w:name="__RefHeading___Toc2097_2846471793"/>
       <w:bookmarkEnd w:id="3"/>
       <w:r>
         <w:rPr/>
@@ -2859,7 +2859,7 @@
         <w:pStyle w:val="Heading2"/>
         <w:rPr/>
       </w:pPr>
-      <w:bookmarkStart w:id="4" w:name="__RefHeading___Toc1966_3382994897"/>
+      <w:bookmarkStart w:id="4" w:name="__RefHeading___Toc2099_2846471793"/>
       <w:bookmarkEnd w:id="4"/>
       <w:r>
         <w:rPr/>
@@ -3670,7 +3670,7 @@
       </w:pPr>
       <w:r>
         <w:rPr/>
-        <w:t>Tres hechos resumen el diagnóstico técnico. Primero, la información de la comanda no entra en ningún sistema hasta el cobro, de modo que durante el servicio el local no sabe qué mesa espera ni cuánto tarda la cocina. Segundo, el único equipo que guarda datos del negocio funciona con un sistema operativo sin soporte, en un disco que falla y sin copias. Tercero, toda la actividad comparte una red plana con los teléfonos de los clientes y con un grabador expuesto en internet. Ninguno de los tres problemas exige tecnología cara; exigen que alguien diseñe la infraestructura, que es lo que este proyecto se propone.</w:t>
+        <w:t>Tres hechos resumen el diagnóstico técnico. Primero, la información de la comanda no entra en ningún sistema hasta el cobro, de modo que durante el servicio el local no sabe qué mesa espera ni cuánto tarda la cocina. Segundo, el único equipo que guarda la base de datos de ventas, facturas y cierres de caja funciona con un sistema operativo sin soporte, en un disco que falla y sin copias. Tercero, toda la actividad comparte una red plana con los teléfonos de los clientes y con un grabador expuesto en internet. Este último punto no es solo un riesgo técnico: la videovigilancia ya incumple la ley, porque falta el cartel informativo (artículo 22.4 de la Ley Orgánica 3/2018) y un grabador accesible desde internet con la contraseña de fábrica no ofrece la seguridad que exige el artículo 32 del RGPD. Hay que poner el cartel, cambiar las credenciales, cerrar el acceso externo y comprobar si ha habido accesos indebidos, que habría que notificar a la Agencia Española de Protección de Datos en 72 horas (artículo 33 del RGPD). Ninguno de los tres problemas exige tecnología cara; exigen que alguien diseñe la infraestructura, que es lo que este proyecto se propone.</w:t>
       </w:r>
       <w:r>
         <w:br w:type="page"/>
@@ -3681,7 +3681,7 @@
         <w:pStyle w:val="Heading1"/>
         <w:rPr/>
       </w:pPr>
-      <w:bookmarkStart w:id="5" w:name="__RefHeading___Toc1968_3382994897"/>
+      <w:bookmarkStart w:id="5" w:name="__RefHeading___Toc2101_2846471793"/>
       <w:bookmarkEnd w:id="5"/>
       <w:r>
         <w:rPr/>
@@ -3728,7 +3728,7 @@
       </w:r>
       <w:r>
         <w:rPr/>
-        <w:t xml:space="preserve"> en España y que en 2025 ha sufrido la caída del mercado. Entre las dos marcan los límites del negocio: lo que funciona y lo que deja de funcionar.</w:t>
+        <w:t xml:space="preserve"> en España y que en 2025 ha visto caer sus ventas. Entre las dos marcan los límites del negocio: lo que funciona y lo que deja de funcionar.</w:t>
       </w:r>
     </w:p>
     <w:p>
@@ -3736,7 +3736,7 @@
         <w:pStyle w:val="Heading2"/>
         <w:rPr/>
       </w:pPr>
-      <w:bookmarkStart w:id="6" w:name="__RefHeading___Toc1970_3382994897"/>
+      <w:bookmarkStart w:id="6" w:name="__RefHeading___Toc2103_2846471793"/>
       <w:bookmarkEnd w:id="6"/>
       <w:r>
         <w:rPr/>
@@ -3758,7 +3758,7 @@
         <w:pStyle w:val="Heading2"/>
         <w:rPr/>
       </w:pPr>
-      <w:bookmarkStart w:id="7" w:name="__RefHeading___Toc1972_3382994897"/>
+      <w:bookmarkStart w:id="7" w:name="__RefHeading___Toc2105_2846471793"/>
       <w:bookmarkEnd w:id="7"/>
       <w:r>
         <w:rPr/>
@@ -3772,7 +3772,7 @@
       </w:pPr>
       <w:r>
         <w:rPr/>
-        <w:t>Goiko es el ejemplo de lo que ocurre cuando el crecimiento va por delante de la demanda. Con 117 restaurantes propios a cierre de 2024, en 2025 facturó 109 millones de euros, un 11,2 % menos que el año anterior, y sus pérdidas se dispararon un 161 % hasta los 36,4 millones; la plantilla media bajó a 1.737 personas y las cuentas atribuyen la caída a la «disminución del tráfico» y a «menores niveles de consumo» (Forbes España, 2026). El segmento de la hamburguesa en España ha crecido mucho en pocos años y ya no admite a todos los que entran.</w:t>
+        <w:t>Goiko muestra el riesgo de crecer deprisa con costes altos. A cierre de 2024 gestionaba directamente 117 restaurantes (L'Express Franchise, 2026b). En 2025 facturó 109 millones de euros, un 11,2 % menos que el año anterior, y sus pérdidas se dispararon un 161 %, hasta los 36,4 millones; la plantilla media bajó a 1.737 personas (Forbes España, 2026). Las fuentes consultadas no detallan las causas: la noticia relaciona la situación con el cambio de accionista, el fondo Capza, y con el relevo en la dirección (L'Express Franchise, 2026b). Es el caso de una empresa concreta, y no basta para afirmar que todo el segmento de la hamburguesa esté saturado.</w:t>
       </w:r>
     </w:p>
     <w:p>
@@ -3780,7 +3780,7 @@
         <w:pStyle w:val="Heading2"/>
         <w:rPr/>
       </w:pPr>
-      <w:bookmarkStart w:id="8" w:name="__RefHeading___Toc1974_3382994897"/>
+      <w:bookmarkStart w:id="8" w:name="__RefHeading___Toc2107_2846471793"/>
       <w:bookmarkEnd w:id="8"/>
       <w:r>
         <w:rPr/>
@@ -4192,7 +4192,7 @@
                 <w:sz w:val="19"/>
                 <w:szCs w:val="19"/>
               </w:rPr>
-              <w:t>4</w:t>
+              <w:t>6 (5,5 a jornada completa)</w:t>
             </w:r>
           </w:p>
         </w:tc>
@@ -4363,6 +4363,103 @@
                 <w:sz w:val="19"/>
                 <w:szCs w:val="19"/>
               </w:rPr>
+              <w:t>Ventas por persona</w:t>
+            </w:r>
+          </w:p>
+        </w:tc>
+        <w:tc>
+          <w:tcPr>
+            <w:tcW w:w="2400" w:type="dxa"/>
+            <w:tcBorders>
+              <w:bottom w:val="single" w:sz="2" w:space="0" w:color="DDDDDD"/>
+            </w:tcBorders>
+          </w:tcPr>
+          <w:p>
+            <w:pPr>
+              <w:pStyle w:val="Normal"/>
+              <w:spacing w:lineRule="auto" w:line="252" w:before="0" w:after="0"/>
+              <w:ind w:hanging="0"/>
+              <w:rPr/>
+            </w:pPr>
+            <w:r>
+              <w:rPr>
+                <w:sz w:val="19"/>
+                <w:szCs w:val="19"/>
+              </w:rPr>
+              <w:t>Unos 90.000 €</w:t>
+            </w:r>
+          </w:p>
+        </w:tc>
+        <w:tc>
+          <w:tcPr>
+            <w:tcW w:w="2400" w:type="dxa"/>
+            <w:tcBorders>
+              <w:bottom w:val="single" w:sz="2" w:space="0" w:color="DDDDDD"/>
+            </w:tcBorders>
+          </w:tcPr>
+          <w:p>
+            <w:pPr>
+              <w:pStyle w:val="Normal"/>
+              <w:spacing w:lineRule="auto" w:line="252" w:before="0" w:after="0"/>
+              <w:ind w:hanging="0"/>
+              <w:rPr/>
+            </w:pPr>
+            <w:r>
+              <w:rPr>
+                <w:sz w:val="19"/>
+                <w:szCs w:val="19"/>
+              </w:rPr>
+              <w:t>Menos de 125.000 € (datos de años distintos)</w:t>
+            </w:r>
+          </w:p>
+        </w:tc>
+        <w:tc>
+          <w:tcPr>
+            <w:tcW w:w="2326" w:type="dxa"/>
+            <w:tcBorders>
+              <w:bottom w:val="single" w:sz="2" w:space="0" w:color="DDDDDD"/>
+            </w:tcBorders>
+          </w:tcPr>
+          <w:p>
+            <w:pPr>
+              <w:pStyle w:val="Normal"/>
+              <w:spacing w:lineRule="auto" w:line="252" w:before="0" w:after="0"/>
+              <w:ind w:hanging="0"/>
+              <w:rPr/>
+            </w:pPr>
+            <w:r>
+              <w:rPr>
+                <w:sz w:val="19"/>
+                <w:szCs w:val="19"/>
+              </w:rPr>
+              <w:t>Unos 62.750 €</w:t>
+            </w:r>
+          </w:p>
+        </w:tc>
+      </w:tr>
+      <w:tr>
+        <w:trPr>
+          <w:cantSplit w:val="true"/>
+        </w:trPr>
+        <w:tc>
+          <w:tcPr>
+            <w:tcW w:w="1899" w:type="dxa"/>
+            <w:tcBorders>
+              <w:bottom w:val="single" w:sz="2" w:space="0" w:color="DDDDDD"/>
+            </w:tcBorders>
+          </w:tcPr>
+          <w:p>
+            <w:pPr>
+              <w:pStyle w:val="Normal"/>
+              <w:spacing w:lineRule="auto" w:line="252" w:before="0" w:after="0"/>
+              <w:ind w:hanging="0"/>
+              <w:rPr/>
+            </w:pPr>
+            <w:r>
+              <w:rPr>
+                <w:sz w:val="19"/>
+                <w:szCs w:val="19"/>
+              </w:rPr>
               <w:t>Ticket medio</w:t>
             </w:r>
           </w:p>
@@ -4386,7 +4483,7 @@
                 <w:sz w:val="19"/>
                 <w:szCs w:val="19"/>
               </w:rPr>
-              <w:t>15-25 € en sala; 15 € para llevar</w:t>
+              <w:t>19,50 € sin IVA en sala (21,45 € con IVA); 15 € sin IVA para llevar</w:t>
             </w:r>
           </w:p>
         </w:tc>
@@ -4409,7 +4506,7 @@
                 <w:sz w:val="19"/>
                 <w:szCs w:val="19"/>
               </w:rPr>
-              <w:t>Unos 20 €</w:t>
+              <w:t>Unos 20 € (la fuente no indica si lleva IVA)</w:t>
             </w:r>
           </w:p>
         </w:tc>
@@ -4750,7 +4847,7 @@
           <w:sz w:val="20"/>
           <w:szCs w:val="20"/>
         </w:rPr>
-        <w:t xml:space="preserve"> Datos de Hundred Burgers según Economía 3 (2024), Buenavista Equity Partners (2025) y El Confidencial Digital (2025); datos de Goiko según Forbes España (2026). Los de Burglar King son del escenario y se desarrollan en el apartado 4.</w:t>
+        <w:t xml:space="preserve"> Datos de Hundred Burgers según Economía 3 (2024), Buenavista Equity Partners (2025) y El Confidencial Digital (2025); datos de Goiko según Forbes España (2026) y L'Express Franchise (2026b). Los de Burglar King son del escenario y se desarrollan en el apartado 4; sus ventas por persona superan las de Goiko, señal de que el escenario es optimista.</w:t>
       </w:r>
     </w:p>
     <w:p>
@@ -4760,7 +4857,7 @@
       </w:pPr>
       <w:r>
         <w:rPr/>
-        <w:t>De Hundred Burgers, Burglar King toma tres decisiones. La primera es la carta corta: pocas referencias, bien ejecutadas, que simplifican las compras, reducen la merma y permiten que un solo cocinero saque el servicio. La segunda es el peso del reparto y de la comida para llevar, que en Hundred supone un tercio de los ingresos y que exige que el pedido entre en cocina sin que nadie lo copie a mano. La tercera es la forma de crecer: Hundred ha abierto locales solo cuando el anterior funcionaba, con un flujo de pedido ya digital desde el primer día. De Goiko, Burglar King toma la advertencia: el mercado de la hamburguesa está saturado, el cliente ha reducido su consumo y un negocio de este tipo solo sobrevive con los costes muy controlados. Esa es la razón por la que el apartado 4 dedica tanto espacio a las cifras.</w:t>
+        <w:t>De Hundred Burgers, Burglar King toma tres decisiones. La primera es la carta corta: pocas referencias, bien ejecutadas, que simplifican las compras, reducen la merma y permiten que una cocina pequeña saque el servicio. La segunda es el peso del reparto y de la comida para llevar, que en Hundred supone un tercio de los ingresos y que exige que el pedido entre en cocina sin que nadie lo copie a mano. La tercera es una advertencia sobre el ritmo: Hundred ha crecido de forma selectiva, apoyada en obradores propios, para no perder calidad (El Confidencial Digital, 2025), y Burglar King prioriza que un solo local funcione con procesos claros antes de pensar en crecer. De Goiko, Burglar King toma otra advertencia: una cadena que crece deprisa y con costes altos pierde dinero en cuanto bajan las ventas. Un local pequeño tiene que vigilar sus costes con más cuidado aún, y por eso el apartado 4 dedica tanto espacio a las cifras.</w:t>
       </w:r>
       <w:r>
         <w:br w:type="page"/>
@@ -4771,7 +4868,7 @@
         <w:pStyle w:val="Heading1"/>
         <w:rPr/>
       </w:pPr>
-      <w:bookmarkStart w:id="9" w:name="__RefHeading___Toc1976_3382994897"/>
+      <w:bookmarkStart w:id="9" w:name="__RefHeading___Toc2109_2846471793"/>
       <w:bookmarkEnd w:id="9"/>
       <w:r>
         <w:rPr/>
@@ -4785,7 +4882,7 @@
       </w:pPr>
       <w:r>
         <w:rPr/>
-        <w:t>El entorno de la empresa se analiza en dos planos. El macroentorno son los factores generales que la empresa no controla pero que condicionan su actividad: se estudia con el método PESTEL (factores políticos, económicos, sociales, tecnológicos, ambientales y legales). El microentorno son los actores con los que la empresa se relaciona directamente: clientes, proveedores y competidores. Las fuentes se han valorado con el criterio CRAAP que propone la guía del módulo (actualidad, relevancia, autoridad, precisión y propósito), y por eso las cifras que proceden de estudios encargados por fabricantes o plataformas se presentan como indicios y no como estadística (IES Conselleria, 2025b).</w:t>
+        <w:t>El entorno de la empresa se analiza en dos planos. El macroentorno son los factores generales que la empresa no controla pero que condicionan su actividad: se estudia con el método PESTEL (factores políticos, económicos, sociales, tecnológicos, ambientales y legales). El microentorno son los actores con los que la empresa se relaciona directamente: clientes, proveedores y competidores. Las fuentes se han valorado con el criterio CRAAP que propone la guía del módulo (actualidad, relevancia, autoridad, precisión y propósito), y por eso las cifras que proceden de estudios encargados por fabricantes o plataformas se presentan como indicios y no como estadística (IES Conselleria, 2025b). Lo mismo vale para las guías del sector, los blogs de proveedores y la prensa especializada que se citan en los apartados 4 y 5: dan órdenes de magnitud, no datos oficiales.</w:t>
       </w:r>
     </w:p>
     <w:p>
@@ -4793,7 +4890,7 @@
         <w:pStyle w:val="Heading2"/>
         <w:rPr/>
       </w:pPr>
-      <w:bookmarkStart w:id="10" w:name="__RefHeading___Toc1978_3382994897"/>
+      <w:bookmarkStart w:id="10" w:name="__RefHeading___Toc2111_2846471793"/>
       <w:bookmarkEnd w:id="10"/>
       <w:r>
         <w:rPr/>
@@ -5057,7 +5154,7 @@
                 <w:sz w:val="19"/>
                 <w:szCs w:val="19"/>
               </w:rPr>
-              <w:t>El sector factura más (crecimiento del 2 % al 4 %), pero la restauración gana menos: rentabilidad del −0,9 % en 2025 (Hosteltur, 2026); el SMI sube a 1.221 € en 14 pagas (Real Decreto 126/2026)</w:t>
+              <w:t>Inflación del 4,9 % en septiembre de 2026, con la subyacente en el 3,1 % (INE, 2026); el sector factura más (crecimiento del 2 % al 4 %), pero la rentabilidad de la restauración cayó un 0,9 % hasta septiembre de 2025 (Hosteltur, 2026); el SMI sube a 1.221 € en 14 pagas (Real Decreto 126/2026)</w:t>
             </w:r>
           </w:p>
         </w:tc>
@@ -5080,7 +5177,7 @@
                 <w:sz w:val="19"/>
                 <w:szCs w:val="19"/>
               </w:rPr>
-              <w:t>Los costes de personal y de producto suben más que el ticket; cualquier inversión debe justificarse por lo que ahorra</w:t>
+              <w:t>Suben los precios de compra, el alquiler (que se actualiza con el IPC) y los salarios; cualquier inversión debe justificarse por lo que ahorra</w:t>
             </w:r>
           </w:p>
         </w:tc>
@@ -5131,7 +5228,7 @@
                 <w:sz w:val="19"/>
                 <w:szCs w:val="19"/>
               </w:rPr>
-              <w:t>Población universitaria; entre el 65 % y el 70 % de los pagos ya son digitales, según un fabricante (El Independiente, 2026); el 62 % de los españoles descarta un restaurante por una mala reseña (L'Express Franchise, 2026)</w:t>
+              <w:t>Población universitaria; entre el 65 % y el 70 % de los pagos en España ya son digitales, según un fabricante de TPV (El Independiente, 2026); el 62 % de los españoles descarta un restaurante por una mala reseña (L'Express Franchise, 2026a)</w:t>
             </w:r>
           </w:p>
         </w:tc>
@@ -5205,7 +5302,7 @@
                 <w:sz w:val="19"/>
                 <w:szCs w:val="19"/>
               </w:rPr>
-              <w:t>Fin del soporte de Windows 10 (Microsoft, 2025); la digitalización del sector se ha concentrado en el cobro y no en la cocina (Riches Manuel y Roca, 2026)</w:t>
+              <w:t>Fin del soporte de Windows 10 (Microsoft, 2025); según el estudio de mercado del propio equipo, la digitalización del sector se ha concentrado en el cobro y no en la cocina (Riches Manuel y Roca, 2026)</w:t>
             </w:r>
           </w:p>
         </w:tc>
@@ -5279,7 +5376,7 @@
                 <w:sz w:val="19"/>
                 <w:szCs w:val="19"/>
               </w:rPr>
-              <w:t>Restricción del bisfenol A en el papel térmico (Reglamento [UE] 2016/2235); Ley 7/2022 de residuos y gestión de RAEE (Real Decreto 110/2015)</w:t>
+              <w:t>Restricción del bisfenol A en el papel térmico (Reglamento [UE] 2016/2235); Ley 7/2022 de residuos (envases, agua no envasada gratuita, residuos comerciales y aceite usado); Reglamento (UE) 2025/40 de envases, aplicable desde el 12/8/2026; Ley 1/2025 de desperdicio alimentario; gestión de RAEE (Real Decreto 110/2015)</w:t>
             </w:r>
           </w:p>
         </w:tc>
@@ -5302,7 +5399,7 @@
                 <w:sz w:val="19"/>
                 <w:szCs w:val="19"/>
               </w:rPr>
-              <w:t>Ticket en pantalla y papel solo a petición; envases para llevar sin plástico de un solo uso; retirada correcta de los equipos viejos</w:t>
+              <w:t>Factura simplificada en papel o, si el cliente lo acepta, electrónica; envases para llevar de cartón sin plástico; aceite usado a gestor autorizado; retirada correcta de los equipos viejos</w:t>
             </w:r>
           </w:p>
         </w:tc>
@@ -5353,7 +5450,7 @@
                 <w:sz w:val="19"/>
                 <w:szCs w:val="19"/>
               </w:rPr>
-              <w:t>Ley antifraude, Verifactu, RGPD y LOPDGDD, información de alérgenos, registro de jornada, convenio provincial de hostelería</w:t>
+              <w:t>Ley antifraude, Verifactu y obligación de facturar, RGPD y LOPDGDD, consumo, alérgenos y seguridad alimentaria (APPCC), prevención de riesgos laborales, registro de jornada, convenio provincial de hostelería, tabaco en la terraza</w:t>
             </w:r>
           </w:p>
         </w:tc>
@@ -5376,7 +5473,7 @@
                 <w:sz w:val="19"/>
                 <w:szCs w:val="19"/>
               </w:rPr>
-              <w:t>Requisitos de trazabilidad de ventas, protección de datos, identificación individual y tablas salariales de obligado cumplimiento</w:t>
+              <w:t>Requisitos de trazabilidad de ventas y de compras, protección de datos, identificación individual, precios visibles y tablas salariales de obligado cumplimiento</w:t>
             </w:r>
           </w:p>
         </w:tc>
@@ -5420,7 +5517,27 @@
       </w:r>
       <w:r>
         <w:rPr/>
-        <w:t xml:space="preserve"> Buena parte de la demanda de tecnología en la hostelería no nace del deseo de modernizarse, sino de obligaciones legales. La Ley 11/2021 prohíbe el software de facturación capaz de ocultar o alterar ventas, y el Real Decreto 1007/2023 (reglamento Verifactu) exige que cada factura quede registrada, encadenada y sea trazable. Su entrada en vigor se aplazó por el Real Decreto-ley 15/2025: será el 1 de enero de 2027 para las sociedades y el 1 de julio de 2027 para el resto (Garrigues, 2025). Como Burglar King es una sociedad limitada, su plazo es el primero. En protección de datos, el RGPD y la Ley Orgánica 3/2018 obligan a tratar los datos personales con medidas de seguridad adecuadas; su artículo 22 regula la videovigilancia, con cartel informativo y conservación máxima de un mes. A esto se suman la información obligatoria sobre los catorce alérgenos (Reglamento [UE] 1169/2011 y Real Decreto 126/2015) y el registro diario de jornada (artículo 34.9 del Estatuto de los Trabajadores).</w:t>
+        <w:t xml:space="preserve"> Buena parte de la demanda de tecnología en la hostelería no nace del deseo de modernizarse, sino de obligaciones legales. La Ley 11/2021 prohíbe el software de facturación capaz de ocultar o alterar ventas, y el Real Decreto 1007/2023 (reglamento Verifactu) exige que cada factura quede registrada, encadenada y sea trazable. Su entrada en vigor se aplazó por el Real Decreto-ley 15/2025: será el 1 de enero de 2027 para las sociedades y el 1 de julio de 2027 para el resto (Garrigues, 2025). Como Burglar King es una sociedad limitada, su plazo es el primero. Tener un sistema de facturación que no cumpla se sanciona con 50.000 euros por ejercicio (artículo 201 bis de la Ley 58/2003, General Tributaria), y cada venta exige expedir una factura simplificada (Real Decreto 1619/2012).</w:t>
+      </w:r>
+    </w:p>
+    <w:p>
+      <w:pPr>
+        <w:pStyle w:val="Normal"/>
+        <w:rPr/>
+      </w:pPr>
+      <w:r>
+        <w:rPr/>
+        <w:t>En protección de datos, el RGPD y la Ley Orgánica 3/2018 (LOPDGDD) obligan a la empresa a llevar un registro de las actividades de tratamiento (clientes y reservas, empleados y nóminas, videovigilancia, proveedores; artículo 30 del RGPD), a informar a los interesados (artículo 13), a firmar un contrato con quienes tratan datos por su cuenta, como la gestoría o el proveedor del TPV (artículo 28), y a aplicar medidas de seguridad adecuadas (artículo 32). La videovigilancia la regula el artículo 22 de la LOPDGDD: cartel informativo y conservación máxima de un mes, salvo para acreditar hechos ilícitos. Como las cámaras graban también a la plantilla, hay que informar antes a los trabajadores, y no se pueden poner en aseos ni en vestuarios (artículo 89 de la LOPDGDD).</w:t>
+      </w:r>
+    </w:p>
+    <w:p>
+      <w:pPr>
+        <w:pStyle w:val="Normal"/>
+        <w:rPr/>
+      </w:pPr>
+      <w:r>
+        <w:rPr/>
+        <w:t>A esto se suman otras obligaciones de cualquier restaurante. En consumo, el precio debe ser final, con impuestos incluidos, y el cliente tiene derecho a un justificante (artículos 20 y 63 del texto refundido de la Ley General para la Defensa de los Consumidores y Usuarios) y a hojas de reclamaciones. En seguridad alimentaria, la información sobre los catorce alérgenos (Reglamento [UE] 1169/2011 y Real Decreto 126/2015), un sistema de autocontrol basado en el APPCC con formación de los manipuladores (Reglamento [CE] 852/2004) y la trazabilidad de los proveedores, conservando albaranes y facturas (artículo 18 del Reglamento [CE] 178/2002); las compras por WhatsApp sin registro de la tabla 3 dificultan cumplirla. En lo laboral, el registro diario de jornada (artículo 34.9 del Estatuto de los Trabajadores) y la prevención de riesgos laborales: evaluación de riesgos, planificación, formación y vigilancia de la salud en una cocina con plancha, freidoras y suelos resbaladizos (Ley 31/1995). Por último, está prohibido fumar dentro del local y se permite en una terraza al aire libre (Ley 28/2005).</w:t>
       </w:r>
     </w:p>
     <w:p>
@@ -5437,7 +5554,7 @@
       </w:r>
       <w:r>
         <w:rPr/>
-        <w:t xml:space="preserve"> La hostelería española reúne 280.403 establecimientos (Profesional Horeca, 2025) y da empleo a 1,89 millones de personas, el 8,6 % del empleo total (Hosteltur, 2026). En la Comunitat Valenciana hay 31.186 bares y restaurantes, uno por cada 174 habitantes, y 13.698 en la provincia de València (El Periòdic, 2025). Es un mercado muy competido y con márgenes estrechos. El dato que más condiciona el proyecto es la tendencia opuesta entre facturación y beneficio: el sector vende más pero gana menos, con una rentabilidad negativa en la restauración en 2025 (Hosteltur, 2026). Por el lado de los costes, el salario mínimo interprofesional de 2026 es de 1.221 euros mensuales en 14 pagas, 17.094 euros anuales, un 3,1 % más que en 2025 (Real Decreto 126/2026), y el convenio provincial de hostelería, vencido el 31 de diciembre de 2025, sigue aplicándose en ultraactividad mientras se negocia el nuevo (Turnozo, 2026). El caso de Goiko, con una caída de ventas del 11,2 % en 2025, muestra que el segmento de la hamburguesa no es ajeno a esta presión (Forbes España, 2026).</w:t>
+        <w:t xml:space="preserve"> La hostelería española reúne 280.403 establecimientos (Profesional Horeca, 2025) y da empleo a 1,89 millones de personas, el 8,6 % del empleo total (Hosteltur, 2026). En la Comunitat Valenciana hay 31.186 bares y restaurantes, uno por cada 174 habitantes, y 13.698 en la provincia de València (El Periòdic, 2025). Es un mercado muy competido y con márgenes estrechos. El dato que más condiciona el proyecto es la tendencia opuesta entre facturación y beneficio: el sector vende más pero gana menos; según el Anuario de Hostelería de España, con datos hasta septiembre de 2025 la rentabilidad de la restauración cayó un 0,9 %, mientras la del alojamiento mejoraba un 2,1 % (Hosteltur, 2026). A eso se suma la inflación: el IPC general subió al 4,9 % en septiembre de 2026, con la subyacente en el 3,1 % (INE, 2026). Para Burglar King significa que el alquiler, que se actualiza con el IPC, pasaría de 1.000 a unos 1.049 euros, y que una subida parecida de la materia prima restaría unos 700 euros al mes al resultado si no se traslada a los precios. Por el lado de los costes, el salario mínimo interprofesional de 2026 es de 1.221 euros mensuales en 14 pagas, 17.094 euros anuales, un 3,1 % más que en 2025 (Real Decreto 126/2026), y el convenio provincial de hostelería, vencido el 31 de diciembre de 2025, sigue aplicándose en ultraactividad mientras se negocia el nuevo (Turnozo, 2026). El caso de Goiko, con una caída de ventas del 11,2 % en 2025, muestra que el segmento de la hamburguesa no es ajeno a esta presión (Forbes España, 2026).</w:t>
       </w:r>
     </w:p>
     <w:p>
@@ -5454,7 +5571,7 @@
       </w:r>
       <w:r>
         <w:rPr/>
-        <w:t xml:space="preserve"> El cliente de Burglar King es joven, paga con tarjeta o con el móvil, espera conexión wifi y decide dónde comer mirando el teléfono. Un fabricante de TPV sitúa entre el 65 % y el 70 % los pagos digitales en la hostelería española (El Independiente, 2026), y un estudio de TheFork indica que el 62 % de los españoles descarta un restaurante por una mala reseña en línea, por delante del precio (24 %), y que el 73 % lee las opiniones de otros comensales antes de reservar (L'Express Franchise, 2026). Son estudios de empresas con interés comercial, pero coinciden con lo que se observa en el local.</w:t>
+        <w:t xml:space="preserve"> El cliente de Burglar King es joven, paga con tarjeta o con el móvil, espera conexión wifi y decide dónde comer mirando el teléfono. Un fabricante de TPV estima, a partir de los datos de sus propios clientes, que entre el 65 % y el 70 % de los pagos en España ya son digitales (El Independiente, 2026), y un estudio de TheFork indica que el 62 % de los españoles descarta un restaurante por una mala reseña en línea, por delante del precio (24 %), y que el 73 % lee las opiniones de otros comensales antes de reservar (L'Express Franchise, 2026a). Son estudios de empresas con interés comercial, y por eso se toman solo como indicios.</w:t>
       </w:r>
     </w:p>
     <w:p>
@@ -5471,7 +5588,7 @@
       </w:r>
       <w:r>
         <w:rPr/>
-        <w:t xml:space="preserve"> El fin del soporte de Windows 10 en octubre de 2025 (Microsoft, 2025) deja sin actualizaciones de seguridad a buena parte de los TPV instalados en el sector. Al mismo tiempo, el 84,5 % de las empresas españolas tiene sitio web y el 26,6 % vende por comercio electrónico (INE, 2025b), pero en la hostelería esa digitalización se ha concentrado en el cobro (datáfono, TPV, carta con código QR) mientras que la producción sigue funcionando con papel y a voz (Riches Manuel y Roca, 2026). El hardware necesario para cerrar esa brecha se ha abaratado hasta precios asumibles para un local pequeño.</w:t>
+        <w:t xml:space="preserve"> El fin del soporte de Windows 10 en octubre de 2025 (Microsoft, 2025) deja sin actualizaciones de seguridad a buena parte de los TPV instalados en el sector. Al mismo tiempo, entre las empresas de 10 o más empleados, el 84,5 % de las que tienen internet dispone de sitio web y el 26,6 % vendió por comercio electrónico en 2024; entre las de menos de 10 empleados, como Burglar King, las cifras bajan al 37,0 % y al 8,6 % (INE, 2025b). El estudio de mercado del propio equipo apunta a que en la hostelería esa digitalización se ha concentrado en el cobro (datáfono, TPV, carta con código QR), mientras que la producción sigue funcionando con papel y a voz (Riches Manuel y Roca, 2026). El hardware necesario para cerrar esa brecha se ha abaratado hasta precios asumibles para un local pequeño.</w:t>
       </w:r>
     </w:p>
     <w:p>
@@ -5488,7 +5605,7 @@
       </w:r>
       <w:r>
         <w:rPr/>
-        <w:t xml:space="preserve"> El Reglamento (UE) 2016/2235 restringe el bisfenol A en el papel térmico de los tickets, y la Ley 7/2022 de residuos grava los envases de plástico de un solo uso, que son precisamente los de la comida para llevar. Un sistema que muestre el ticket en pantalla y solo lo imprima a petición reduce residuos y gasto, y la elección de envases de cartón evita el impuesto. Los equipos que se sustituyan deben gestionarse como residuos de aparatos eléctricos y electrónicos (Real Decreto 110/2015).</w:t>
+        <w:t xml:space="preserve"> El Reglamento (UE) 2016/2235 restringe el bisfenol A en el papel térmico de los tickets. El TPV deberá expedir siempre la factura simplificada, pero podrá entregarla en formato electrónico, con un código QR o por correo, a los clientes que lo acepten, y solo en ese caso se ahorra el papel (artículo 9 del Real Decreto 1619/2012). La Ley 7/2022 de residuos crea un impuesto de 0,45 euros por kilo de plástico no reciclado en los envases no reutilizables; lo pagan los fabricantes e importadores y lo repercuten en el precio, así que Burglar King no es contribuyente, pero lo soporta al comprar. Los envases de cartón sin plástico no lo llevan; los de cartón plastificado sí, por su parte de plástico. La misma ley obliga al local a ofrecer agua no envasada gratis, a cobrar aparte en el tique los vasos y recipientes de plástico de un solo uso que entregue, a separar sus residuos comerciales y a entregar el aceite de cocina usado a un gestor autorizado. Desde el 12 de agosto de 2026 se aplica además el Reglamento (UE) 2025/40 de envases, que impulsa los envases reutilizables y que el cliente pueda traer su propio recipiente para la comida para llevar. Y la Ley 1/2025, de prevención de las pérdidas y el desperdicio alimentario, obliga a facilitar sin coste que el cliente se lleve lo que no ha consumido. Los equipos que se sustituyan deben gestionarse como residuos de aparatos eléctricos y electrónicos (Real Decreto 110/2015).</w:t>
       </w:r>
     </w:p>
     <w:p>
@@ -5496,7 +5613,7 @@
         <w:pStyle w:val="Heading2"/>
         <w:rPr/>
       </w:pPr>
-      <w:bookmarkStart w:id="11" w:name="__RefHeading___Toc1980_3382994897"/>
+      <w:bookmarkStart w:id="11" w:name="__RefHeading___Toc2113_2846471793"/>
       <w:bookmarkEnd w:id="11"/>
       <w:r>
         <w:rPr/>
@@ -6095,7 +6212,7 @@
           <w:sz w:val="20"/>
           <w:szCs w:val="20"/>
         </w:rPr>
-        <w:t xml:space="preserve"> Elaboración propia a partir del escenario. El peso es la parte estimada de las ventas.</w:t>
+        <w:t xml:space="preserve"> Elaboración propia a partir del escenario. El peso es la parte estimada de las ventas. Los dos primeros segmentos son clientes que consumen en el local (sala y barra, el 72 % de las ventas); los dos últimos son canales, en los que también piden estudiantes y familias.</w:t>
       </w:r>
     </w:p>
     <w:p>
@@ -6123,7 +6240,7 @@
       </w:r>
       <w:r>
         <w:rPr/>
-        <w:t xml:space="preserve"> como Makro o GM Cash, que dominan el abastecimiento de la hostelería independiente (Makro España, 2026; GM Cash, 2026), más una carnicería local para la carne picada y un obrador para el pan. Los tecnológicos son los que más importan para el proyecto, porque de ellos depende la infraestructura (tabla 8).</w:t>
+        <w:t xml:space="preserve"> como Makro o GM Cash, habituales en el abastecimiento de la hostelería independiente (Makro España, 2026; GM Cash, 2026), más una carnicería local para la carne picada y un obrador para el pan. Los tecnológicos son los que más importan para el proyecto, porque de ellos depende la infraestructura (tabla 8).</w:t>
       </w:r>
     </w:p>
     <w:p>
@@ -6771,7 +6888,7 @@
                 <w:sz w:val="19"/>
                 <w:szCs w:val="19"/>
               </w:rPr>
-              <w:t>Comisión del 15 % al 30 % del pedido (Qamarero, 2025); los pedidos no llegan al TPV</w:t>
+              <w:t>Comisión del 15 % al 35 % del pedido más IVA; con reparto de la plataforma, del 25 % al 35 % (Qamarero, 2025); los pedidos no llegan al TPV</w:t>
             </w:r>
           </w:p>
         </w:tc>
@@ -6912,7 +7029,7 @@
       </w:r>
       <w:r>
         <w:rPr/>
-        <w:t xml:space="preserve"> En el plano del negocio, Burglar King compite con otras hamburgueserías y locales de comida rápida del barrio, con las cadenas de los centros comerciales cercanos y con las cocinas que solo venden por plataformas de reparto. Las cadenas tienen sistemas integrados en los que la comanda llega a la cocina en pantalla y el cliente ve en un monitor cuándo está listo su pedido: esa es la experiencia con la que el cliente compara. En el plano tecnológico, la competencia son las soluciones que el local podría contratar en lugar del proyecto. El estudio de mercado del equipo (Riches Manuel y Roca, 2026) distingue tres capas: el software español clásico de licencia por terminal sobre Windows; las plataformas en la nube de suscripción por terminal o por local; y las soluciones gratuitas que cobran por complementos y por los datos. Casi todas cobran por terminal o por pantalla, y esa es la oportunidad que el proyecto aprovecha: que añadir pantallas no suponga pagar más licencias.</w:t>
+        <w:t xml:space="preserve"> En el plano del negocio, Burglar King compite con otras hamburgueserías y locales de comida rápida del barrio, con las cadenas de los centros comerciales cercanos y con las cocinas que solo venden por plataformas de reparto. Las cadenas tienen sistemas integrados en los que la comanda llega a la cocina en pantalla y el cliente ve en un monitor cuándo está listo su pedido: esa es la experiencia con la que el cliente compara. Desde la economía, es un mercado de competencia monopolística: muchos locales, un producto diferenciado (receta, ambiente, ubicación) y una entrada fácil, como muestran los locales comerciales en alquiler del municipio (apartado 4.4). Cada local tiene algo de margen para fijar su precio, pero poco, y los sustitutivos están a mano: la comida preparada del supermercado y los comedores del campus. En el plano tecnológico, la competencia son las soluciones que el local podría contratar en lugar del proyecto. El estudio de mercado del equipo (Riches Manuel y Roca, 2026) distingue tres capas: el software español clásico de licencia por terminal sobre Windows; las plataformas en la nube de suscripción por terminal o por local; y las soluciones gratuitas que cobran por complementos y por los datos. Casi todas cobran por terminal o por pantalla, y esa es la oportunidad que el proyecto aprovecha: que añadir pantallas no suponga pagar más licencias.</w:t>
       </w:r>
       <w:r>
         <w:br w:type="page"/>
@@ -6923,7 +7040,7 @@
         <w:pStyle w:val="Heading1"/>
         <w:rPr/>
       </w:pPr>
-      <w:bookmarkStart w:id="12" w:name="__RefHeading___Toc1982_3382994897"/>
+      <w:bookmarkStart w:id="12" w:name="__RefHeading___Toc2115_2846471793"/>
       <w:bookmarkEnd w:id="12"/>
       <w:r>
         <w:rPr/>
@@ -6937,7 +7054,7 @@
       </w:pPr>
       <w:r>
         <w:rPr/>
-        <w:t>El modelo de negocio de Burglar King es el de una hamburguesería de carta corta con cuatro canales de venta. La tabla 9 lo resume con las cifras del escenario, que se han construido para ser coherentes con los ratios habituales del sector: coste de producto entre el 28 % y el 35 % de las ventas, personal entre el 30 % y el 35 % en servicio en mesa, alquiler por debajo del 10 % y gastos generales entre el 13 % y el 20 % (Tourinews, 2025; Hostelería Madrid, s.f.).</w:t>
+        <w:t>El modelo de negocio de Burglar King es el de una hamburguesería de carta corta con cuatro canales de venta. Su propuesta de valor es una hamburguesa de calidad a un precio asumible para un estudiante, a diez minutos del campus, para comer en el local, llevar o recibir en casa; su estrategia es de enfoque, en el público universitario y en el del barrio. La tabla 9 resume las ventas del escenario, que se han construido con las referencias de una guía del sector: coste de producto en torno al 30 % de las ventas, personal entre el 30 % y el 35 % en servicio en mesa, alquiler idealmente por debajo del 5 %, gastos generales entre el 13 % y el 20 % y un resultado bruto de explotación (EBITDA) del 10 % al 13 % en un restaurante eficiente (Tourinews, 2025). Son referencias orientativas de una fuente no estadística; otras guías dan costes de materia prima más altos en la comida rápida (Hostelería Madrid, s.f.).</w:t>
       </w:r>
     </w:p>
     <w:p>
@@ -7612,7 +7729,7 @@
           <w:sz w:val="20"/>
           <w:szCs w:val="20"/>
         </w:rPr>
-        <w:t xml:space="preserve"> Elaboración propia. 26 días de apertura al mes; los importes excluyen el IVA del 10 % de la hostelería (Ley 37/1992). Unos 540.000 euros anuales, lo que factura un local de 44 plazas con dos turnos y reparto.</w:t>
+        <w:t xml:space="preserve"> Elaboración propia. 26 días de apertura al mes. Los importes excluyen el IVA: lo que se consume en el local tributa al 10 % (artículo 91.Uno.2.2.º de la Ley 37/1992); en la comida para llevar y el reparto, la comida va al 10 % y las bebidas alcohólicas y los refrescos azucarados, al 21 %. Unos 540.000 euros al año si todos los meses fueran iguales; el apartado 4 estima el efecto de los meses flojos.</w:t>
       </w:r>
     </w:p>
     <w:p>
@@ -7622,7 +7739,7 @@
       </w:pPr>
       <w:r>
         <w:rPr/>
-        <w:t>Con esas ventas, la cuenta de resultados mensual estimada queda como muestra la tabla 10 y la figura 3. El resultado antes de impuestos ronda el 16 % de las ventas, un margen holgado para un local bien gestionado, pero que se evapora con dos meses flojos; la rentabilidad media del sector fue negativa en 2025 (Hosteltur, 2026). El tipo del impuesto sobre sociedades para microempresas en 2026 es del 19 % hasta 50.000 euros de base imponible y del 21 % para el resto (Ley 7/2024).</w:t>
+        <w:t>El ticket de sala, 19,50 euros sin IVA (21,45 euros con IVA), corresponde a la hamburguesa con patatas (10,45 euros sin IVA) más bebida y un entrante o un postre. Es algo más alto que el de Hundred Burgers y alto para un público que mira el precio, de modo que es uno de los supuestos optimistas del escenario. Con esas ventas, la cuenta de resultados mensual estimada queda como muestra la tabla 10 y la figura 3. El resultado bruto de explotación (EBITDA) es del 18 % de las ventas, por encima del 10-13 % de un restaurante eficiente (Tourinews, 2025): el escenario es optimista, sobre todo porque el alquiler (2 %) y los gastos generales quedan en la parte baja de las referencias. La cuenta incluye el impuesto sobre sociedades: para microempresas, en 2026 el tipo es del 19 % hasta 50.000 euros de base imponible y del 21 % para el resto (artículo 29.1 de la Ley 27/2014, del Impuesto sobre Sociedades, en la redacción de la Ley 7/2024).</w:t>
       </w:r>
     </w:p>
     <w:p>
@@ -8222,7 +8339,7 @@
                 <w:sz w:val="19"/>
                 <w:szCs w:val="19"/>
               </w:rPr>
-              <w:t>Suministros, consumibles, seguros, gestoría y mantenimiento</w:t>
+              <w:t>Suministros, consumibles, seguros, gestoría, mantenimiento y prevención</w:t>
             </w:r>
           </w:p>
         </w:tc>
@@ -8252,7 +8369,7 @@
                 <w:sz w:val="19"/>
                 <w:szCs w:val="19"/>
               </w:rPr>
-              <w:t>3.600 €</w:t>
+              <w:t>3.660 €</w:t>
             </w:r>
           </w:p>
         </w:tc>
@@ -8534,7 +8651,7 @@
                 <w:sz w:val="19"/>
                 <w:szCs w:val="19"/>
               </w:rPr>
-              <w:t>Amortización y financiación</w:t>
+              <w:t>Impuestos y tasas locales</w:t>
             </w:r>
           </w:p>
         </w:tc>
@@ -8564,7 +8681,7 @@
                 <w:sz w:val="19"/>
                 <w:szCs w:val="19"/>
               </w:rPr>
-              <w:t>900 €</w:t>
+              <w:t>400 €</w:t>
             </w:r>
           </w:p>
         </w:tc>
@@ -8587,7 +8704,7 @@
                 <w:sz w:val="19"/>
                 <w:szCs w:val="19"/>
               </w:rPr>
-              <w:t>2 %</w:t>
+              <w:t>1 %</w:t>
             </w:r>
           </w:p>
         </w:tc>
@@ -8610,7 +8727,7 @@
                 <w:sz w:val="19"/>
                 <w:szCs w:val="19"/>
               </w:rPr>
-              <w:t>4.1</w:t>
+              <w:t>4.4</w:t>
             </w:r>
           </w:p>
         </w:tc>
@@ -8638,7 +8755,7 @@
                 <w:sz w:val="19"/>
                 <w:szCs w:val="19"/>
               </w:rPr>
-              <w:t>Impuestos y tasas locales</w:t>
+              <w:t>Resultado bruto de explotación (EBITDA)</w:t>
             </w:r>
           </w:p>
         </w:tc>
@@ -8661,14 +8778,7 @@
                 <w:sz w:val="19"/>
                 <w:szCs w:val="19"/>
               </w:rPr>
-              <w:t>−</w:t>
-            </w:r>
-            <w:r>
-              <w:rPr>
-                <w:sz w:val="19"/>
-                <w:szCs w:val="19"/>
-              </w:rPr>
-              <w:t>400 €</w:t>
+              <w:t>8.190 €</w:t>
             </w:r>
           </w:p>
         </w:tc>
@@ -8691,7 +8801,7 @@
                 <w:sz w:val="19"/>
                 <w:szCs w:val="19"/>
               </w:rPr>
-              <w:t>1 %</w:t>
+              <w:t>18 %</w:t>
             </w:r>
           </w:p>
         </w:tc>
@@ -8710,11 +8820,7 @@
               <w:rPr/>
             </w:pPr>
             <w:r>
-              <w:rPr>
-                <w:sz w:val="19"/>
-                <w:szCs w:val="19"/>
-              </w:rPr>
-              <w:t>4.4</w:t>
+              <w:rPr/>
             </w:r>
           </w:p>
         </w:tc>
@@ -8727,6 +8833,411 @@
           <w:tcPr>
             <w:tcW w:w="3799" w:type="dxa"/>
             <w:tcBorders>
+              <w:bottom w:val="single" w:sz="2" w:space="0" w:color="DDDDDD"/>
+            </w:tcBorders>
+          </w:tcPr>
+          <w:p>
+            <w:pPr>
+              <w:pStyle w:val="Normal"/>
+              <w:spacing w:lineRule="auto" w:line="252" w:before="0" w:after="0"/>
+              <w:ind w:hanging="0"/>
+              <w:rPr/>
+            </w:pPr>
+            <w:r>
+              <w:rPr>
+                <w:sz w:val="19"/>
+                <w:szCs w:val="19"/>
+              </w:rPr>
+              <w:t>Amortización del inmovilizado</w:t>
+            </w:r>
+          </w:p>
+        </w:tc>
+        <w:tc>
+          <w:tcPr>
+            <w:tcW w:w="1800" w:type="dxa"/>
+            <w:tcBorders>
+              <w:bottom w:val="single" w:sz="2" w:space="0" w:color="DDDDDD"/>
+            </w:tcBorders>
+          </w:tcPr>
+          <w:p>
+            <w:pPr>
+              <w:pStyle w:val="Normal"/>
+              <w:spacing w:lineRule="auto" w:line="252" w:before="0" w:after="0"/>
+              <w:ind w:hanging="0"/>
+              <w:rPr/>
+            </w:pPr>
+            <w:r>
+              <w:rPr>
+                <w:sz w:val="19"/>
+                <w:szCs w:val="19"/>
+              </w:rPr>
+              <w:t>−</w:t>
+            </w:r>
+            <w:r>
+              <w:rPr>
+                <w:sz w:val="19"/>
+                <w:szCs w:val="19"/>
+              </w:rPr>
+              <w:t>410 €</w:t>
+            </w:r>
+          </w:p>
+        </w:tc>
+        <w:tc>
+          <w:tcPr>
+            <w:tcW w:w="1701" w:type="dxa"/>
+            <w:tcBorders>
+              <w:bottom w:val="single" w:sz="2" w:space="0" w:color="DDDDDD"/>
+            </w:tcBorders>
+          </w:tcPr>
+          <w:p>
+            <w:pPr>
+              <w:pStyle w:val="Normal"/>
+              <w:spacing w:lineRule="auto" w:line="252" w:before="0" w:after="0"/>
+              <w:ind w:hanging="0"/>
+              <w:rPr/>
+            </w:pPr>
+            <w:r>
+              <w:rPr>
+                <w:sz w:val="19"/>
+                <w:szCs w:val="19"/>
+              </w:rPr>
+              <w:t>1 %</w:t>
+            </w:r>
+          </w:p>
+        </w:tc>
+        <w:tc>
+          <w:tcPr>
+            <w:tcW w:w="1725" w:type="dxa"/>
+            <w:tcBorders>
+              <w:bottom w:val="single" w:sz="2" w:space="0" w:color="DDDDDD"/>
+            </w:tcBorders>
+          </w:tcPr>
+          <w:p>
+            <w:pPr>
+              <w:pStyle w:val="Normal"/>
+              <w:spacing w:lineRule="auto" w:line="252" w:before="0" w:after="0"/>
+              <w:ind w:hanging="0"/>
+              <w:rPr/>
+            </w:pPr>
+            <w:r>
+              <w:rPr>
+                <w:sz w:val="19"/>
+                <w:szCs w:val="19"/>
+              </w:rPr>
+              <w:t>4.1</w:t>
+            </w:r>
+          </w:p>
+        </w:tc>
+      </w:tr>
+      <w:tr>
+        <w:trPr>
+          <w:cantSplit w:val="true"/>
+        </w:trPr>
+        <w:tc>
+          <w:tcPr>
+            <w:tcW w:w="3799" w:type="dxa"/>
+            <w:tcBorders>
+              <w:bottom w:val="single" w:sz="2" w:space="0" w:color="DDDDDD"/>
+            </w:tcBorders>
+          </w:tcPr>
+          <w:p>
+            <w:pPr>
+              <w:pStyle w:val="Normal"/>
+              <w:spacing w:lineRule="auto" w:line="252" w:before="0" w:after="0"/>
+              <w:ind w:hanging="0"/>
+              <w:rPr/>
+            </w:pPr>
+            <w:r>
+              <w:rPr>
+                <w:sz w:val="19"/>
+                <w:szCs w:val="19"/>
+              </w:rPr>
+              <w:t>Gastos financieros (intereses del préstamo)</w:t>
+            </w:r>
+          </w:p>
+        </w:tc>
+        <w:tc>
+          <w:tcPr>
+            <w:tcW w:w="1800" w:type="dxa"/>
+            <w:tcBorders>
+              <w:bottom w:val="single" w:sz="2" w:space="0" w:color="DDDDDD"/>
+            </w:tcBorders>
+          </w:tcPr>
+          <w:p>
+            <w:pPr>
+              <w:pStyle w:val="Normal"/>
+              <w:spacing w:lineRule="auto" w:line="252" w:before="0" w:after="0"/>
+              <w:ind w:hanging="0"/>
+              <w:rPr/>
+            </w:pPr>
+            <w:r>
+              <w:rPr>
+                <w:sz w:val="19"/>
+                <w:szCs w:val="19"/>
+              </w:rPr>
+              <w:t>−</w:t>
+            </w:r>
+            <w:r>
+              <w:rPr>
+                <w:sz w:val="19"/>
+                <w:szCs w:val="19"/>
+              </w:rPr>
+              <w:t>20 €</w:t>
+            </w:r>
+          </w:p>
+        </w:tc>
+        <w:tc>
+          <w:tcPr>
+            <w:tcW w:w="1701" w:type="dxa"/>
+            <w:tcBorders>
+              <w:bottom w:val="single" w:sz="2" w:space="0" w:color="DDDDDD"/>
+            </w:tcBorders>
+          </w:tcPr>
+          <w:p>
+            <w:pPr>
+              <w:pStyle w:val="Normal"/>
+              <w:spacing w:lineRule="auto" w:line="252" w:before="0" w:after="0"/>
+              <w:ind w:hanging="0"/>
+              <w:rPr/>
+            </w:pPr>
+            <w:r>
+              <w:rPr>
+                <w:sz w:val="19"/>
+                <w:szCs w:val="19"/>
+              </w:rPr>
+              <w:t>0 %</w:t>
+            </w:r>
+          </w:p>
+        </w:tc>
+        <w:tc>
+          <w:tcPr>
+            <w:tcW w:w="1725" w:type="dxa"/>
+            <w:tcBorders>
+              <w:bottom w:val="single" w:sz="2" w:space="0" w:color="DDDDDD"/>
+            </w:tcBorders>
+          </w:tcPr>
+          <w:p>
+            <w:pPr>
+              <w:pStyle w:val="Normal"/>
+              <w:spacing w:lineRule="auto" w:line="252" w:before="0" w:after="0"/>
+              <w:ind w:hanging="0"/>
+              <w:rPr/>
+            </w:pPr>
+            <w:r>
+              <w:rPr>
+                <w:sz w:val="19"/>
+                <w:szCs w:val="19"/>
+              </w:rPr>
+              <w:t>4.1</w:t>
+            </w:r>
+          </w:p>
+        </w:tc>
+      </w:tr>
+      <w:tr>
+        <w:trPr>
+          <w:cantSplit w:val="true"/>
+        </w:trPr>
+        <w:tc>
+          <w:tcPr>
+            <w:tcW w:w="3799" w:type="dxa"/>
+            <w:tcBorders>
+              <w:bottom w:val="single" w:sz="2" w:space="0" w:color="DDDDDD"/>
+            </w:tcBorders>
+          </w:tcPr>
+          <w:p>
+            <w:pPr>
+              <w:pStyle w:val="Normal"/>
+              <w:spacing w:lineRule="auto" w:line="252" w:before="0" w:after="0"/>
+              <w:ind w:hanging="0"/>
+              <w:rPr/>
+            </w:pPr>
+            <w:r>
+              <w:rPr>
+                <w:sz w:val="19"/>
+                <w:szCs w:val="19"/>
+              </w:rPr>
+              <w:t>Resultado antes de impuestos</w:t>
+            </w:r>
+          </w:p>
+        </w:tc>
+        <w:tc>
+          <w:tcPr>
+            <w:tcW w:w="1800" w:type="dxa"/>
+            <w:tcBorders>
+              <w:bottom w:val="single" w:sz="2" w:space="0" w:color="DDDDDD"/>
+            </w:tcBorders>
+          </w:tcPr>
+          <w:p>
+            <w:pPr>
+              <w:pStyle w:val="Normal"/>
+              <w:spacing w:lineRule="auto" w:line="252" w:before="0" w:after="0"/>
+              <w:ind w:hanging="0"/>
+              <w:rPr/>
+            </w:pPr>
+            <w:r>
+              <w:rPr>
+                <w:sz w:val="19"/>
+                <w:szCs w:val="19"/>
+              </w:rPr>
+              <w:t>7.760 €</w:t>
+            </w:r>
+          </w:p>
+        </w:tc>
+        <w:tc>
+          <w:tcPr>
+            <w:tcW w:w="1701" w:type="dxa"/>
+            <w:tcBorders>
+              <w:bottom w:val="single" w:sz="2" w:space="0" w:color="DDDDDD"/>
+            </w:tcBorders>
+          </w:tcPr>
+          <w:p>
+            <w:pPr>
+              <w:pStyle w:val="Normal"/>
+              <w:spacing w:lineRule="auto" w:line="252" w:before="0" w:after="0"/>
+              <w:ind w:hanging="0"/>
+              <w:rPr/>
+            </w:pPr>
+            <w:r>
+              <w:rPr>
+                <w:sz w:val="19"/>
+                <w:szCs w:val="19"/>
+              </w:rPr>
+              <w:t>17 %</w:t>
+            </w:r>
+          </w:p>
+        </w:tc>
+        <w:tc>
+          <w:tcPr>
+            <w:tcW w:w="1725" w:type="dxa"/>
+            <w:tcBorders>
+              <w:bottom w:val="single" w:sz="2" w:space="0" w:color="DDDDDD"/>
+            </w:tcBorders>
+          </w:tcPr>
+          <w:p>
+            <w:pPr>
+              <w:pStyle w:val="Normal"/>
+              <w:spacing w:lineRule="auto" w:line="252" w:before="0" w:after="0"/>
+              <w:ind w:hanging="0"/>
+              <w:rPr/>
+            </w:pPr>
+            <w:r>
+              <w:rPr/>
+            </w:r>
+          </w:p>
+        </w:tc>
+      </w:tr>
+      <w:tr>
+        <w:trPr>
+          <w:cantSplit w:val="true"/>
+        </w:trPr>
+        <w:tc>
+          <w:tcPr>
+            <w:tcW w:w="3799" w:type="dxa"/>
+            <w:tcBorders>
+              <w:bottom w:val="single" w:sz="2" w:space="0" w:color="DDDDDD"/>
+            </w:tcBorders>
+          </w:tcPr>
+          <w:p>
+            <w:pPr>
+              <w:pStyle w:val="Normal"/>
+              <w:spacing w:lineRule="auto" w:line="252" w:before="0" w:after="0"/>
+              <w:ind w:hanging="0"/>
+              <w:rPr/>
+            </w:pPr>
+            <w:r>
+              <w:rPr>
+                <w:sz w:val="19"/>
+                <w:szCs w:val="19"/>
+              </w:rPr>
+              <w:t>Impuesto sobre sociedades (19 % y 21 %)</w:t>
+            </w:r>
+          </w:p>
+        </w:tc>
+        <w:tc>
+          <w:tcPr>
+            <w:tcW w:w="1800" w:type="dxa"/>
+            <w:tcBorders>
+              <w:bottom w:val="single" w:sz="2" w:space="0" w:color="DDDDDD"/>
+            </w:tcBorders>
+          </w:tcPr>
+          <w:p>
+            <w:pPr>
+              <w:pStyle w:val="Normal"/>
+              <w:spacing w:lineRule="auto" w:line="252" w:before="0" w:after="0"/>
+              <w:ind w:hanging="0"/>
+              <w:rPr/>
+            </w:pPr>
+            <w:r>
+              <w:rPr>
+                <w:sz w:val="19"/>
+                <w:szCs w:val="19"/>
+              </w:rPr>
+              <w:t>−</w:t>
+            </w:r>
+            <w:r>
+              <w:rPr>
+                <w:sz w:val="19"/>
+                <w:szCs w:val="19"/>
+              </w:rPr>
+              <w:t>1.546 €</w:t>
+            </w:r>
+          </w:p>
+        </w:tc>
+        <w:tc>
+          <w:tcPr>
+            <w:tcW w:w="1701" w:type="dxa"/>
+            <w:tcBorders>
+              <w:bottom w:val="single" w:sz="2" w:space="0" w:color="DDDDDD"/>
+            </w:tcBorders>
+          </w:tcPr>
+          <w:p>
+            <w:pPr>
+              <w:pStyle w:val="Normal"/>
+              <w:spacing w:lineRule="auto" w:line="252" w:before="0" w:after="0"/>
+              <w:ind w:hanging="0"/>
+              <w:rPr/>
+            </w:pPr>
+            <w:r>
+              <w:rPr>
+                <w:sz w:val="19"/>
+                <w:szCs w:val="19"/>
+              </w:rPr>
+              <w:t>3 %</w:t>
+            </w:r>
+          </w:p>
+        </w:tc>
+        <w:tc>
+          <w:tcPr>
+            <w:tcW w:w="1725" w:type="dxa"/>
+            <w:tcBorders>
+              <w:bottom w:val="single" w:sz="2" w:space="0" w:color="DDDDDD"/>
+            </w:tcBorders>
+          </w:tcPr>
+          <w:p>
+            <w:pPr>
+              <w:pStyle w:val="Normal"/>
+              <w:spacing w:lineRule="auto" w:line="252" w:before="0" w:after="0"/>
+              <w:ind w:hanging="0"/>
+              <w:rPr/>
+            </w:pPr>
+            <w:r>
+              <w:rPr>
+                <w:sz w:val="19"/>
+                <w:szCs w:val="19"/>
+              </w:rPr>
+              <w:t>4</w:t>
+            </w:r>
+          </w:p>
+        </w:tc>
+      </w:tr>
+      <w:tr>
+        <w:trPr>
+          <w:cantSplit w:val="true"/>
+        </w:trPr>
+        <w:tc>
+          <w:tcPr>
+            <w:tcW w:w="3799" w:type="dxa"/>
+            <w:tcBorders>
               <w:bottom w:val="single" w:sz="6" w:space="0" w:color="808080"/>
             </w:tcBorders>
           </w:tcPr>
@@ -8742,7 +9253,7 @@
                 <w:sz w:val="19"/>
                 <w:szCs w:val="19"/>
               </w:rPr>
-              <w:t>Resultado antes de impuestos</w:t>
+              <w:t>Resultado del ejercicio</w:t>
             </w:r>
           </w:p>
         </w:tc>
@@ -8765,7 +9276,7 @@
                 <w:sz w:val="19"/>
                 <w:szCs w:val="19"/>
               </w:rPr>
-              <w:t>7.350 €</w:t>
+              <w:t>6.214 €</w:t>
             </w:r>
           </w:p>
         </w:tc>
@@ -8788,7 +9299,7 @@
                 <w:sz w:val="19"/>
                 <w:szCs w:val="19"/>
               </w:rPr>
-              <w:t>16 %</w:t>
+              <w:t>14 %</w:t>
             </w:r>
           </w:p>
         </w:tc>
@@ -8834,7 +9345,7 @@
           <w:sz w:val="20"/>
           <w:szCs w:val="20"/>
         </w:rPr>
-        <w:t xml:space="preserve"> Elaboración propia. Cada partida se justifica en el apartado indicado.</w:t>
+        <w:t xml:space="preserve"> Elaboración propia. Cada partida se justifica en el apartado indicado. La devolución del principal del préstamo (unos 430 € al mes) no es gasto: reduce la deuda y solo afecta a la tesorería. El impuesto se calcula sobre el resultado anual antes de impuestos (93.120 €).</w:t>
       </w:r>
     </w:p>
     <w:p>
@@ -8946,10 +9457,20 @@
     </w:p>
     <w:p>
       <w:pPr>
+        <w:pStyle w:val="Normal"/>
+        <w:rPr/>
+      </w:pPr>
+      <w:r>
+        <w:rPr/>
+        <w:t>Para saber cuánto aguanta el negocio hay que separar los costes. Los variables, los que crecen con cada venta (materia prima, comisiones de las plataformas y envases), suman 17.270 euros, el 38 % de las ventas, así que cada euro vendido deja unos 62 céntimos de margen de contribución. Los fijos, que se pagan aunque no se venda (personal, alquiler, el resto de suministros, publicidad, tasas, amortización e intereses), suman unos 19.970 euros al mes. El punto muerto, la venta mensual con la que no se gana ni se pierde, es de unos 32.400 euros (19.970 / 0,616), de modo que las ventas pueden caer un 28 % antes de entrar en pérdidas: ese es el margen de seguridad. Cada 1.000 euros menos de ventas restan unos 616 euros de resultado. Un mes un 10 % más flojo deja unos 5.000 euros antes de impuestos en lugar de 7.760; una subida del 10 % de la materia prima los rebaja a unos 6.300, y una del 10 % de la electricidad, a unos 7.600. La estacionalidad pesa más: si julio y agosto, sin estudiantes, vendieran un 30 % menos, cada uno de esos meses perdería unos 560 euros, y el resultado anual antes de impuestos bajaría de unos 93.000 a unos 76.500 euros. Un año malo reduce mucho el beneficio, pero no lo hace desaparecer.</w:t>
+      </w:r>
+    </w:p>
+    <w:p>
+      <w:pPr>
         <w:pStyle w:val="Heading2"/>
         <w:rPr/>
       </w:pPr>
-      <w:bookmarkStart w:id="13" w:name="__RefHeading___Toc1984_3382994897"/>
+      <w:bookmarkStart w:id="13" w:name="__RefHeading___Toc2117_2846471793"/>
       <w:bookmarkEnd w:id="13"/>
       <w:r>
         <w:rPr/>
@@ -8963,7 +9484,7 @@
       </w:pPr>
       <w:r>
         <w:rPr/>
-        <w:t>Burglar King se constituyó en 2022 con 60.000 euros: 35.000 de capital aportado por el socio gerente y un familiar, y un préstamo bancario de 25.000 euros a cinco años que financió la obra, la salida de humos y la cocina. Hoy quedan unos 7.000 euros pendientes, con una cuota de unos 450 euros mensuales, y la empresa no tiene otra deuda. Lo que necesita financiar ahora es el proyecto tecnológico: red segmentada, servidor, puestos de sala y cocina, pantallas y SAI. Su presupuesto detallado queda fuera de este informe, pero una estimación de entre 5.000 y 8.000 euros permite valorar ya las fuentes disponibles (tabla 11).</w:t>
+        <w:t>Burglar King se constituyó en 2022 con 60.000 euros: 35.000 de capital aportado por el socio gerente y un familiar, y un préstamo bancario de 25.000 euros a cinco años. Se invirtieron en la obra de adecuación y la salida de humos (24.000 euros), la cocina y la maquinaria (16.000), el mobiliario (6.000), la fianza del local (2.000) y las existencias y la tesorería iniciales (12.000). La obra se amortiza en los diez años del contrato de alquiler, la maquinaria al 12 % anual y el mobiliario al 10 %: unos 410 euros al mes, que son la amortización de la tabla 10. Del préstamo quedan unos 7.000 euros, con una cuota de unos 450 euros mensuales; de ella solo los intereses, unos 20 euros, son gasto, y el resto es devolución de la deuda. La empresa no tiene otra deuda. Lo que necesita financiar ahora es el proyecto tecnológico: red segmentada, servidor, puestos de sala y cocina, pantallas y SAI. Su presupuesto detallado queda fuera de este informe, pero una estimación de entre 5.000 y 8.000 euros permite valorar ya las fuentes disponibles (tabla 11).</w:t>
       </w:r>
     </w:p>
     <w:p>
@@ -9445,7 +9966,7 @@
                 <w:sz w:val="19"/>
                 <w:szCs w:val="19"/>
               </w:rPr>
-              <w:t>Subvención a fondo perdido para la transformación digital de pymes valencianas, en torno al 30 %-40 % de la inversión, por convocatoria anual (idealista/news, 2026)</w:t>
+              <w:t>Subvención a fondo perdido para la digitalización de pymes valencianas, por convocatoria anual; la de 2026 cerró el 3 de marzo, se dirige sobre todo a sectores industriales y exige un presupuesto mínimo de unos 20.000 € (Digitaliza CV, 2026)</w:t>
             </w:r>
           </w:p>
         </w:tc>
@@ -9468,7 +9989,7 @@
                 <w:sz w:val="19"/>
                 <w:szCs w:val="19"/>
               </w:rPr>
-              <w:t>Se solicitará si hay convocatoria abierta al ejecutar el proyecto; el presupuesto no contará con ella</w:t>
+              <w:t>No encaja con el proyecto, que queda por debajo del presupuesto mínimo; habrá que revisar las bases de la próxima convocatoria</w:t>
             </w:r>
           </w:p>
         </w:tc>
@@ -9579,7 +10100,7 @@
       </w:pPr>
       <w:r>
         <w:rPr/>
-        <w:t>La decisión es financiar el proyecto con tesorería propia en dos fases y, si la segunda fase lo requiere, con un microcrédito de MicroBank de hasta 8.000 euros a tres años, cuya cuota rondaría los 250 euros mensuales. Esa cuota es inferior a lo que hoy cobran las plataformas en la nube por dos terminales y dos pantallas de cocina, de modo que el proyecto se paga solo con lo que evita gastar (Riches Manuel y Roca, 2026). Las ayudas públicas se buscarán, pero el presupuesto del proyecto se calculará sin ellas.</w:t>
+        <w:t>La decisión es financiar el proyecto con tesorería propia en dos fases. La primera, antes del 31 de diciembre de 2026, es el sistema de facturación adaptado a Verifactu, porque no tenerlo a tiempo se sanciona con 50.000 euros por ejercicio (artículo 201 bis de la Ley 58/2003, General Tributaria), más de seis meses de resultado; si el proyecto no llegara a tiempo, habría que contratar de forma provisional un software certificado. La segunda fase, en 2027, es el resto de la infraestructura. Con unos 6.200 euros de resultado neto al mes, la tesorería propia basta; el microcrédito de MicroBank (hasta 8.000 euros a tres años, con una cuota de unos 250 euros mensuales) solo sería un respaldo si la tesorería se necesitara para otra cosa. Como el TPV actual no puede adaptarse a Verifactu, la alternativa real al proyecto es una suscripción en la nube, que cobra cada mes por terminal y por pantalla de cocina (Riches Manuel y Roca, 2026); el proyecto evita esa cuota. Además, si el control de lo vendido redujera la merma a la mitad (del 4 % al 2 % de las compras, unos 290 euros al mes), ese ahorro por sí solo recuperaría 8.000 euros en unos 28 meses; es una hipótesis que el propio sistema permitirá comprobar. Las ayudas públicas se buscarán, pero el presupuesto del proyecto se calculará sin ellas.</w:t>
       </w:r>
     </w:p>
     <w:p>
@@ -9587,7 +10108,7 @@
         <w:pStyle w:val="Heading2"/>
         <w:rPr/>
       </w:pPr>
-      <w:bookmarkStart w:id="14" w:name="__RefHeading___Toc1986_3382994897"/>
+      <w:bookmarkStart w:id="14" w:name="__RefHeading___Toc2119_2846471793"/>
       <w:bookmarkEnd w:id="14"/>
       <w:r>
         <w:rPr/>
@@ -9601,7 +10122,7 @@
       </w:pPr>
       <w:r>
         <w:rPr/>
-        <w:t>Los salarios de la plantilla vienen fijados por el Convenio colectivo de hostelería de la provincia de Valencia, vigente de 2022 a 2025 y aplicable en 2026 en ultraactividad mientras se negocia el siguiente (Turnozo, 2026). Sus tablas para restaurantes, cafeterías y bares (tabla I) fijan el salario base mensual por niveles, con 15 pagas al año (tabla 12). El camarero se encuadra en el nivel III y el cocinero en el nivel II (Comisiones Obreras, 2025).</w:t>
+        <w:t>Los salarios de la plantilla vienen fijados por el Convenio colectivo de hostelería de la provincia de Valencia, vigente de 2022 a 2025 y aplicable en 2026 en ultraactividad mientras se negocia el siguiente (Turnozo, 2026). Sus tablas para restaurantes, cafeterías y bares (tabla I) fijan el salario base mensual por niveles, con 15 pagas al año (tabla 12). El camarero y el cocinero se encuadran en el nivel III, y el ayudante de cocina en el nivel IV (Comisiones Obreras, 2025).</w:t>
       </w:r>
     </w:p>
     <w:p>
@@ -9912,7 +10433,7 @@
                 <w:sz w:val="19"/>
                 <w:szCs w:val="19"/>
               </w:rPr>
-              <w:t>Cocinero/a, segundo jefe de sala</w:t>
+              <w:t>Segundo jefe de cocina, jefe de partida, segundo jefe de sala</w:t>
             </w:r>
           </w:p>
         </w:tc>
@@ -10009,7 +10530,7 @@
                 <w:sz w:val="19"/>
                 <w:szCs w:val="19"/>
               </w:rPr>
-              <w:t>Camarero/a, ayudante de cocina</w:t>
+              <w:t>Cocinero/a, camarero/a</w:t>
             </w:r>
           </w:p>
         </w:tc>
@@ -10106,7 +10627,7 @@
                 <w:sz w:val="19"/>
                 <w:szCs w:val="19"/>
               </w:rPr>
-              <w:t>Ayudante de camarero, personal de limpieza</w:t>
+              <w:t>Ayudante de cocina, ayudante de camarero</w:t>
             </w:r>
           </w:p>
         </w:tc>
@@ -10203,7 +10724,7 @@
                 <w:sz w:val="19"/>
                 <w:szCs w:val="19"/>
               </w:rPr>
-              <w:t>Auxiliares</w:t>
+              <w:t>Auxiliar de cocina, auxiliar de pisos y limpieza</w:t>
             </w:r>
           </w:p>
         </w:tc>
@@ -10286,7 +10807,7 @@
       </w:pPr>
       <w:r>
         <w:rPr/>
-        <w:t>Al salario bruto hay que sumar la cotización a cargo de la empresa. Para 2026, los tipos empresariales del régimen general son el 23,60 % por contingencias comunes, el 5,50 % por desempleo en contratos indefinidos, el 0,20 % del FOGASA, el 0,60 % de formación profesional y el 0,75 % del mecanismo de equidad intergeneracional, más la prima de accidentes de trabajo, que para los servicios de comidas y bebidas (CNAE 56) es del 1,50 % (Ibermutua, 2026). En total, un 32,15 % sobre el salario bruto. La tabla 13 aplica estos porcentajes a la plantilla de Burglar King, que paga por encima del convenio: el salario más bajo del local es de 2.000 euros brutos al mes en 15 pagas, y el resto se escala en la misma proporción que guardan entre sí los niveles del convenio.</w:t>
+        <w:t>Al salario bruto hay que sumar la cotización a cargo de la empresa. Para 2026, los tipos empresariales del régimen general son el 23,60 % por contingencias comunes, el 5,50 % por desempleo en contratos indefinidos, el 0,20 % del FOGASA, el 0,60 % de formación profesional y el 0,75 % del mecanismo de equidad intergeneracional, más la prima de accidentes de trabajo, que para los servicios de comidas y bebidas (CNAE 56) es del 1,50 % (Ibermutua, 2026). En total, un 32,15 % sobre el salario bruto. La tabla 13 aplica estos porcentajes a la plantilla de Burglar King, que paga un 15 % por encima del salario base del convenio en todos los puestos asalariados.</w:t>
       </w:r>
     </w:p>
     <w:p>
@@ -10528,7 +11049,7 @@
                 <w:sz w:val="19"/>
                 <w:szCs w:val="19"/>
               </w:rPr>
-              <w:t>Nivel III, indefinido a jornada completa; 2.000 € brutos al mes</w:t>
+              <w:t>Nivel III, indefinido a jornada completa; 1.397 € brutos al mes</w:t>
             </w:r>
           </w:p>
         </w:tc>
@@ -10551,7 +11072,7 @@
                 <w:sz w:val="19"/>
                 <w:szCs w:val="19"/>
               </w:rPr>
-              <w:t>30.000 €</w:t>
+              <w:t>20.956 €</w:t>
             </w:r>
           </w:p>
         </w:tc>
@@ -10574,7 +11095,7 @@
                 <w:sz w:val="19"/>
                 <w:szCs w:val="19"/>
               </w:rPr>
-              <w:t>39.645 €</w:t>
+              <w:t>27.693 €</w:t>
             </w:r>
           </w:p>
         </w:tc>
@@ -10597,7 +11118,7 @@
                 <w:sz w:val="19"/>
                 <w:szCs w:val="19"/>
               </w:rPr>
-              <w:t>3.304 €</w:t>
+              <w:t>2.308 €</w:t>
             </w:r>
           </w:p>
         </w:tc>
@@ -10648,7 +11169,7 @@
                 <w:sz w:val="19"/>
                 <w:szCs w:val="19"/>
               </w:rPr>
-              <w:t>Nivel III, indefinido a jornada completa; 2.000 € brutos al mes</w:t>
+              <w:t>Nivel III, indefinido a jornada completa; 1.397 € brutos al mes</w:t>
             </w:r>
           </w:p>
         </w:tc>
@@ -10671,7 +11192,7 @@
                 <w:sz w:val="19"/>
                 <w:szCs w:val="19"/>
               </w:rPr>
-              <w:t>30.000 €</w:t>
+              <w:t>20.956 €</w:t>
             </w:r>
           </w:p>
         </w:tc>
@@ -10694,7 +11215,7 @@
                 <w:sz w:val="19"/>
                 <w:szCs w:val="19"/>
               </w:rPr>
-              <w:t>39.645 €</w:t>
+              <w:t>27.693 €</w:t>
             </w:r>
           </w:p>
         </w:tc>
@@ -10717,7 +11238,7 @@
                 <w:sz w:val="19"/>
                 <w:szCs w:val="19"/>
               </w:rPr>
-              <w:t>3.304 €</w:t>
+              <w:t>2.308 €</w:t>
             </w:r>
           </w:p>
         </w:tc>
@@ -10768,7 +11289,7 @@
                 <w:sz w:val="19"/>
                 <w:szCs w:val="19"/>
               </w:rPr>
-              <w:t>Nivel II, indefinido a jornada completa; 2.122 € brutos al mes</w:t>
+              <w:t>Nivel III, indefinido a jornada completa; 1.397 € brutos al mes</w:t>
             </w:r>
           </w:p>
         </w:tc>
@@ -10791,7 +11312,7 @@
                 <w:sz w:val="19"/>
                 <w:szCs w:val="19"/>
               </w:rPr>
-              <w:t>31.830 €</w:t>
+              <w:t>20.956 €</w:t>
             </w:r>
           </w:p>
         </w:tc>
@@ -10814,7 +11335,7 @@
                 <w:sz w:val="19"/>
                 <w:szCs w:val="19"/>
               </w:rPr>
-              <w:t>42.063 €</w:t>
+              <w:t>27.693 €</w:t>
             </w:r>
           </w:p>
         </w:tc>
@@ -10837,7 +11358,7 @@
                 <w:sz w:val="19"/>
                 <w:szCs w:val="19"/>
               </w:rPr>
-              <w:t>3.505 €</w:t>
+              <w:t>2.308 €</w:t>
             </w:r>
           </w:p>
         </w:tc>
@@ -10865,7 +11386,7 @@
                 <w:sz w:val="19"/>
                 <w:szCs w:val="19"/>
               </w:rPr>
-              <w:t>Encargado</w:t>
+              <w:t>Ayudante de cocina</w:t>
             </w:r>
           </w:p>
         </w:tc>
@@ -10888,7 +11409,7 @@
                 <w:sz w:val="19"/>
                 <w:szCs w:val="19"/>
               </w:rPr>
-              <w:t>Socio gerente en el régimen de autónomos: sueldo de 3.950 € brutos y cuota de unos 530 € al mes</w:t>
+              <w:t>Nivel IV, indefinido a jornada completa; 1.340 € brutos al mes</w:t>
             </w:r>
           </w:p>
         </w:tc>
@@ -10911,7 +11432,7 @@
                 <w:sz w:val="19"/>
                 <w:szCs w:val="19"/>
               </w:rPr>
-              <w:t>47.400 €</w:t>
+              <w:t>20.107 €</w:t>
             </w:r>
           </w:p>
         </w:tc>
@@ -10934,7 +11455,7 @@
                 <w:sz w:val="19"/>
                 <w:szCs w:val="19"/>
               </w:rPr>
-              <w:t>53.760 €</w:t>
+              <w:t>26.571 €</w:t>
             </w:r>
           </w:p>
         </w:tc>
@@ -10957,7 +11478,7 @@
                 <w:sz w:val="19"/>
                 <w:szCs w:val="19"/>
               </w:rPr>
-              <w:t>4.480 €</w:t>
+              <w:t>2.214 €</w:t>
             </w:r>
           </w:p>
         </w:tc>
@@ -10970,6 +11491,246 @@
           <w:tcPr>
             <w:tcW w:w="1500" w:type="dxa"/>
             <w:tcBorders>
+              <w:bottom w:val="single" w:sz="2" w:space="0" w:color="DDDDDD"/>
+            </w:tcBorders>
+          </w:tcPr>
+          <w:p>
+            <w:pPr>
+              <w:pStyle w:val="Normal"/>
+              <w:spacing w:lineRule="auto" w:line="252" w:before="0" w:after="0"/>
+              <w:ind w:hanging="0"/>
+              <w:rPr/>
+            </w:pPr>
+            <w:r>
+              <w:rPr>
+                <w:sz w:val="19"/>
+                <w:szCs w:val="19"/>
+              </w:rPr>
+              <w:t>Extra de sala</w:t>
+            </w:r>
+          </w:p>
+        </w:tc>
+        <w:tc>
+          <w:tcPr>
+            <w:tcW w:w="3400" w:type="dxa"/>
+            <w:tcBorders>
+              <w:bottom w:val="single" w:sz="2" w:space="0" w:color="DDDDDD"/>
+            </w:tcBorders>
+          </w:tcPr>
+          <w:p>
+            <w:pPr>
+              <w:pStyle w:val="Normal"/>
+              <w:spacing w:lineRule="auto" w:line="252" w:before="0" w:after="0"/>
+              <w:ind w:hanging="0"/>
+              <w:rPr/>
+            </w:pPr>
+            <w:r>
+              <w:rPr>
+                <w:sz w:val="19"/>
+                <w:szCs w:val="19"/>
+              </w:rPr>
+              <w:t>Nivel III, indefinido a media jornada (viernes a domingo); 699 € brutos al mes</w:t>
+            </w:r>
+          </w:p>
+        </w:tc>
+        <w:tc>
+          <w:tcPr>
+            <w:tcW w:w="1500" w:type="dxa"/>
+            <w:tcBorders>
+              <w:bottom w:val="single" w:sz="2" w:space="0" w:color="DDDDDD"/>
+            </w:tcBorders>
+          </w:tcPr>
+          <w:p>
+            <w:pPr>
+              <w:pStyle w:val="Normal"/>
+              <w:spacing w:lineRule="auto" w:line="252" w:before="0" w:after="0"/>
+              <w:ind w:hanging="0"/>
+              <w:rPr/>
+            </w:pPr>
+            <w:r>
+              <w:rPr>
+                <w:sz w:val="19"/>
+                <w:szCs w:val="19"/>
+              </w:rPr>
+              <w:t>10.478 €</w:t>
+            </w:r>
+          </w:p>
+        </w:tc>
+        <w:tc>
+          <w:tcPr>
+            <w:tcW w:w="1499" w:type="dxa"/>
+            <w:tcBorders>
+              <w:bottom w:val="single" w:sz="2" w:space="0" w:color="DDDDDD"/>
+            </w:tcBorders>
+          </w:tcPr>
+          <w:p>
+            <w:pPr>
+              <w:pStyle w:val="Normal"/>
+              <w:spacing w:lineRule="auto" w:line="252" w:before="0" w:after="0"/>
+              <w:ind w:hanging="0"/>
+              <w:rPr/>
+            </w:pPr>
+            <w:r>
+              <w:rPr>
+                <w:sz w:val="19"/>
+                <w:szCs w:val="19"/>
+              </w:rPr>
+              <w:t>13.847 €</w:t>
+            </w:r>
+          </w:p>
+        </w:tc>
+        <w:tc>
+          <w:tcPr>
+            <w:tcW w:w="1127" w:type="dxa"/>
+            <w:tcBorders>
+              <w:bottom w:val="single" w:sz="2" w:space="0" w:color="DDDDDD"/>
+            </w:tcBorders>
+          </w:tcPr>
+          <w:p>
+            <w:pPr>
+              <w:pStyle w:val="Normal"/>
+              <w:spacing w:lineRule="auto" w:line="252" w:before="0" w:after="0"/>
+              <w:ind w:hanging="0"/>
+              <w:rPr/>
+            </w:pPr>
+            <w:r>
+              <w:rPr>
+                <w:sz w:val="19"/>
+                <w:szCs w:val="19"/>
+              </w:rPr>
+              <w:t>1.154 €</w:t>
+            </w:r>
+          </w:p>
+        </w:tc>
+      </w:tr>
+      <w:tr>
+        <w:trPr>
+          <w:cantSplit w:val="true"/>
+        </w:trPr>
+        <w:tc>
+          <w:tcPr>
+            <w:tcW w:w="1500" w:type="dxa"/>
+            <w:tcBorders>
+              <w:bottom w:val="single" w:sz="2" w:space="0" w:color="DDDDDD"/>
+            </w:tcBorders>
+          </w:tcPr>
+          <w:p>
+            <w:pPr>
+              <w:pStyle w:val="Normal"/>
+              <w:spacing w:lineRule="auto" w:line="252" w:before="0" w:after="0"/>
+              <w:ind w:hanging="0"/>
+              <w:rPr/>
+            </w:pPr>
+            <w:r>
+              <w:rPr>
+                <w:sz w:val="19"/>
+                <w:szCs w:val="19"/>
+              </w:rPr>
+              <w:t>Encargado</w:t>
+            </w:r>
+          </w:p>
+        </w:tc>
+        <w:tc>
+          <w:tcPr>
+            <w:tcW w:w="3400" w:type="dxa"/>
+            <w:tcBorders>
+              <w:bottom w:val="single" w:sz="2" w:space="0" w:color="DDDDDD"/>
+            </w:tcBorders>
+          </w:tcPr>
+          <w:p>
+            <w:pPr>
+              <w:pStyle w:val="Normal"/>
+              <w:spacing w:lineRule="auto" w:line="252" w:before="0" w:after="0"/>
+              <w:ind w:hanging="0"/>
+              <w:rPr/>
+            </w:pPr>
+            <w:r>
+              <w:rPr>
+                <w:sz w:val="19"/>
+                <w:szCs w:val="19"/>
+              </w:rPr>
+              <w:t>Socio gerente en el régimen de autónomos: sueldo de 3.950 € brutos y cuota de unos 530 € al mes</w:t>
+            </w:r>
+          </w:p>
+        </w:tc>
+        <w:tc>
+          <w:tcPr>
+            <w:tcW w:w="1500" w:type="dxa"/>
+            <w:tcBorders>
+              <w:bottom w:val="single" w:sz="2" w:space="0" w:color="DDDDDD"/>
+            </w:tcBorders>
+          </w:tcPr>
+          <w:p>
+            <w:pPr>
+              <w:pStyle w:val="Normal"/>
+              <w:spacing w:lineRule="auto" w:line="252" w:before="0" w:after="0"/>
+              <w:ind w:hanging="0"/>
+              <w:rPr/>
+            </w:pPr>
+            <w:r>
+              <w:rPr>
+                <w:sz w:val="19"/>
+                <w:szCs w:val="19"/>
+              </w:rPr>
+              <w:t>47.400 €</w:t>
+            </w:r>
+          </w:p>
+        </w:tc>
+        <w:tc>
+          <w:tcPr>
+            <w:tcW w:w="1499" w:type="dxa"/>
+            <w:tcBorders>
+              <w:bottom w:val="single" w:sz="2" w:space="0" w:color="DDDDDD"/>
+            </w:tcBorders>
+          </w:tcPr>
+          <w:p>
+            <w:pPr>
+              <w:pStyle w:val="Normal"/>
+              <w:spacing w:lineRule="auto" w:line="252" w:before="0" w:after="0"/>
+              <w:ind w:hanging="0"/>
+              <w:rPr/>
+            </w:pPr>
+            <w:r>
+              <w:rPr>
+                <w:sz w:val="19"/>
+                <w:szCs w:val="19"/>
+              </w:rPr>
+              <w:t>53.760 €</w:t>
+            </w:r>
+          </w:p>
+        </w:tc>
+        <w:tc>
+          <w:tcPr>
+            <w:tcW w:w="1127" w:type="dxa"/>
+            <w:tcBorders>
+              <w:bottom w:val="single" w:sz="2" w:space="0" w:color="DDDDDD"/>
+            </w:tcBorders>
+          </w:tcPr>
+          <w:p>
+            <w:pPr>
+              <w:pStyle w:val="Normal"/>
+              <w:spacing w:lineRule="auto" w:line="252" w:before="0" w:after="0"/>
+              <w:ind w:hanging="0"/>
+              <w:rPr/>
+            </w:pPr>
+            <w:r>
+              <w:rPr>
+                <w:sz w:val="19"/>
+                <w:szCs w:val="19"/>
+              </w:rPr>
+              <w:t>4.480 €</w:t>
+            </w:r>
+          </w:p>
+        </w:tc>
+      </w:tr>
+      <w:tr>
+        <w:trPr>
+          <w:cantSplit w:val="true"/>
+        </w:trPr>
+        <w:tc>
+          <w:tcPr>
+            <w:tcW w:w="1500" w:type="dxa"/>
+            <w:tcBorders>
               <w:bottom w:val="single" w:sz="6" w:space="0" w:color="808080"/>
             </w:tcBorders>
           </w:tcPr>
@@ -11027,7 +11788,7 @@
                 <w:sz w:val="19"/>
                 <w:szCs w:val="19"/>
               </w:rPr>
-              <w:t>139.230 €</w:t>
+              <w:t>140.853 €</w:t>
             </w:r>
           </w:p>
         </w:tc>
@@ -11050,7 +11811,7 @@
                 <w:sz w:val="19"/>
                 <w:szCs w:val="19"/>
               </w:rPr>
-              <w:t>175.113 €</w:t>
+              <w:t>177.257 €</w:t>
             </w:r>
           </w:p>
         </w:tc>
@@ -11073,7 +11834,7 @@
                 <w:sz w:val="19"/>
                 <w:szCs w:val="19"/>
               </w:rPr>
-              <w:t>14.593 €</w:t>
+              <w:t>14.771 €</w:t>
             </w:r>
           </w:p>
         </w:tc>
@@ -11110,7 +11871,7 @@
       </w:pPr>
       <w:r>
         <w:rPr/>
-        <w:t>El coste de personal, unos 14.800 euros al mes, supone el 33 % de las ventas, en la banda del 30 %-35 % que se considera normal en el servicio en mesa (Tourinews, 2025). Pagar por encima del convenio es una decisión del negocio: en un sector con mucha rotación, conservar a un equipo de cuatro personas que conoce el local vale más que lo que se ahorraría pagando el mínimo. Es la partida más rígida de la empresa: los salarios de convenio y el SMI suben cada año aunque las ventas no lo hagan. Por eso el proyecto tecnológico no busca reducir plantilla, que ya es mínima, sino que las cuatro personas puedan sacar un servicio más grande sin errores: que el camarero no tenga que volver a la caja a teclear, que el cocinero no tenga que descifrar un papel y que el encargado no tenga que copiar los pedidos de la tableta.</w:t>
+        <w:t>El coste de personal, unos 14.800 euros al mes, supone el 33 % de las ventas, en la banda del 30 %-35 % que se considera normal en el servicio en mesa (Tourinews, 2025). La plantilla está pensada para cubrir el horario respetando la jornada máxima de 40 horas semanales, el descanso semanal y las vacaciones (artículos 34, 37 y 38 del Estatuto de los Trabajadores). El local abre seis días con dos servicios, unas 8 horas diarias de cocina contando la preparación y la limpieza. El cocinero trabaja de martes a sábado y el ayudante de miércoles a domingo, de modo que cada uno cubre el día libre del otro y de miércoles a sábado, los días fuertes, la cocina tiene a dos personas; en sala, los dos camareros se turnan igual y el extra refuerza de viernes a domingo, con el encargado en la caja. Las vacaciones se escalonan en julio y agosto, cuando baja la actividad. Pagar un 15 % por encima del convenio es una decisión del negocio, la idea del salario de eficiencia: en un sector con mucha rotación, conservar a un equipo que conoce el local vale más de lo que cuesta. Esa prima cuesta unos 1.340 euros al mes con cotizaciones, el 3 % de las ventas. Es la partida más rígida de la empresa: los salarios de convenio y el SMI suben cada año aunque las ventas no lo hagan. Por eso el proyecto tecnológico no busca reducir plantilla, sino que el equipo pueda sacar un servicio más grande sin errores: que el camarero no tenga que volver a la caja a teclear, que el cocinero no tenga que descifrar un papel y que el encargado no tenga que copiar los pedidos de la tableta.</w:t>
       </w:r>
     </w:p>
     <w:p>
@@ -11118,7 +11879,7 @@
         <w:pStyle w:val="Heading2"/>
         <w:rPr/>
       </w:pPr>
-      <w:bookmarkStart w:id="15" w:name="__RefHeading___Toc1988_3382994897"/>
+      <w:bookmarkStart w:id="15" w:name="__RefHeading___Toc2121_2846471793"/>
       <w:bookmarkEnd w:id="15"/>
       <w:r>
         <w:rPr/>
@@ -11739,7 +12500,7 @@
                 <w:sz w:val="19"/>
                 <w:szCs w:val="19"/>
               </w:rPr>
-              <w:t>Envase y servilletas (para llevar)</w:t>
+              <w:t>Coste total</w:t>
             </w:r>
           </w:p>
         </w:tc>
@@ -11758,11 +12519,7 @@
               <w:rPr/>
             </w:pPr>
             <w:r>
-              <w:rPr>
-                <w:sz w:val="19"/>
-                <w:szCs w:val="19"/>
-              </w:rPr>
-              <w:t>1 juego</w:t>
+              <w:rPr/>
             </w:r>
           </w:p>
         </w:tc>
@@ -11785,7 +12542,7 @@
                 <w:sz w:val="19"/>
                 <w:szCs w:val="19"/>
               </w:rPr>
-              <w:t>0,25 €</w:t>
+              <w:t>2,99 €</w:t>
             </w:r>
           </w:p>
         </w:tc>
@@ -11798,22 +12555,22 @@
           <w:tcPr>
             <w:tcW w:w="4199" w:type="dxa"/>
             <w:tcBorders>
-              <w:bottom w:val="single" w:sz="2" w:space="0" w:color="DDDDDD"/>
-            </w:tcBorders>
-          </w:tcPr>
-          <w:p>
-            <w:pPr>
-              <w:pStyle w:val="Normal"/>
-              <w:spacing w:lineRule="auto" w:line="252" w:before="0" w:after="0"/>
-              <w:ind w:hanging="0"/>
-              <w:rPr/>
-            </w:pPr>
-            <w:r>
-              <w:rPr>
-                <w:sz w:val="19"/>
-                <w:szCs w:val="19"/>
-              </w:rPr>
-              <w:t>Coste total</w:t>
+              <w:bottom w:val="single" w:sz="6" w:space="0" w:color="808080"/>
+            </w:tcBorders>
+          </w:tcPr>
+          <w:p>
+            <w:pPr>
+              <w:pStyle w:val="Normal"/>
+              <w:spacing w:lineRule="auto" w:line="252" w:before="0" w:after="0"/>
+              <w:ind w:hanging="0"/>
+              <w:rPr/>
+            </w:pPr>
+            <w:r>
+              <w:rPr>
+                <w:sz w:val="19"/>
+                <w:szCs w:val="19"/>
+              </w:rPr>
+              <w:t>Precio de venta (sin IVA)</w:t>
             </w:r>
           </w:p>
         </w:tc>
@@ -11821,18 +12578,22 @@
           <w:tcPr>
             <w:tcW w:w="2601" w:type="dxa"/>
             <w:tcBorders>
-              <w:bottom w:val="single" w:sz="2" w:space="0" w:color="DDDDDD"/>
-            </w:tcBorders>
-          </w:tcPr>
-          <w:p>
-            <w:pPr>
-              <w:pStyle w:val="Normal"/>
-              <w:spacing w:lineRule="auto" w:line="252" w:before="0" w:after="0"/>
-              <w:ind w:hanging="0"/>
-              <w:rPr/>
-            </w:pPr>
-            <w:r>
-              <w:rPr/>
+              <w:bottom w:val="single" w:sz="6" w:space="0" w:color="808080"/>
+            </w:tcBorders>
+          </w:tcPr>
+          <w:p>
+            <w:pPr>
+              <w:pStyle w:val="Normal"/>
+              <w:spacing w:lineRule="auto" w:line="252" w:before="0" w:after="0"/>
+              <w:ind w:hanging="0"/>
+              <w:rPr/>
+            </w:pPr>
+            <w:r>
+              <w:rPr>
+                <w:sz w:val="19"/>
+                <w:szCs w:val="19"/>
+              </w:rPr>
+              <w:t>10,45 € (11,50 € con IVA)</w:t>
             </w:r>
           </w:p>
         </w:tc>
@@ -11840,34 +12601,6 @@
           <w:tcPr>
             <w:tcW w:w="2226" w:type="dxa"/>
             <w:tcBorders>
-              <w:bottom w:val="single" w:sz="2" w:space="0" w:color="DDDDDD"/>
-            </w:tcBorders>
-          </w:tcPr>
-          <w:p>
-            <w:pPr>
-              <w:pStyle w:val="Normal"/>
-              <w:spacing w:lineRule="auto" w:line="252" w:before="0" w:after="0"/>
-              <w:ind w:hanging="0"/>
-              <w:rPr/>
-            </w:pPr>
-            <w:r>
-              <w:rPr>
-                <w:sz w:val="19"/>
-                <w:szCs w:val="19"/>
-              </w:rPr>
-              <w:t>3,24 €</w:t>
-            </w:r>
-          </w:p>
-        </w:tc>
-      </w:tr>
-      <w:tr>
-        <w:trPr>
-          <w:cantSplit w:val="true"/>
-        </w:trPr>
-        <w:tc>
-          <w:tcPr>
-            <w:tcW w:w="4199" w:type="dxa"/>
-            <w:tcBorders>
               <w:bottom w:val="single" w:sz="6" w:space="0" w:color="808080"/>
             </w:tcBorders>
           </w:tcPr>
@@ -11883,53 +12616,7 @@
                 <w:sz w:val="19"/>
                 <w:szCs w:val="19"/>
               </w:rPr>
-              <w:t>Precio de venta (sin IVA)</w:t>
-            </w:r>
-          </w:p>
-        </w:tc>
-        <w:tc>
-          <w:tcPr>
-            <w:tcW w:w="2601" w:type="dxa"/>
-            <w:tcBorders>
-              <w:bottom w:val="single" w:sz="6" w:space="0" w:color="808080"/>
-            </w:tcBorders>
-          </w:tcPr>
-          <w:p>
-            <w:pPr>
-              <w:pStyle w:val="Normal"/>
-              <w:spacing w:lineRule="auto" w:line="252" w:before="0" w:after="0"/>
-              <w:ind w:hanging="0"/>
-              <w:rPr/>
-            </w:pPr>
-            <w:r>
-              <w:rPr>
-                <w:sz w:val="19"/>
-                <w:szCs w:val="19"/>
-              </w:rPr>
-              <w:t>10,45 € (11,50 € con IVA)</w:t>
-            </w:r>
-          </w:p>
-        </w:tc>
-        <w:tc>
-          <w:tcPr>
-            <w:tcW w:w="2226" w:type="dxa"/>
-            <w:tcBorders>
-              <w:bottom w:val="single" w:sz="6" w:space="0" w:color="808080"/>
-            </w:tcBorders>
-          </w:tcPr>
-          <w:p>
-            <w:pPr>
-              <w:pStyle w:val="Normal"/>
-              <w:spacing w:lineRule="auto" w:line="252" w:before="0" w:after="0"/>
-              <w:ind w:hanging="0"/>
-              <w:rPr/>
-            </w:pPr>
-            <w:r>
-              <w:rPr>
-                <w:sz w:val="19"/>
-                <w:szCs w:val="19"/>
-              </w:rPr>
-              <w:t>Coste del 31 %</w:t>
+              <w:t>Coste del 29 %</w:t>
             </w:r>
           </w:p>
         </w:tc>
@@ -11956,7 +12643,7 @@
           <w:sz w:val="20"/>
           <w:szCs w:val="20"/>
         </w:rPr>
-        <w:t xml:space="preserve"> Elaboración propia con precios de mayorista del escenario (Makro España, 2026). El objetivo de la carta es un coste de producto medio entre el 28 % y el 33 %.</w:t>
+        <w:t xml:space="preserve"> Elaboración propia. Precios del escenario, orientados con tarifas públicas de mayorista (Makro España, 2026). El envase de los pedidos para llevar y de reparto (0,25 €) no entra aquí: se cuenta en la tabla 15.</w:t>
       </w:r>
     </w:p>
     <w:p>
@@ -11966,7 +12653,7 @@
       </w:pPr>
       <w:r>
         <w:rPr/>
-        <w:t xml:space="preserve">Aplicado a toda la carta, el coste de producto ronda el 32 % de las ventas, unos 14.400 euros al mes; los consumibles (papel térmico, envases, productos de limpieza) se cuentan aparte, en la tabla 15. Las compras se hacen dos veces por semana en el </w:t>
+        <w:t xml:space="preserve">Aplicado a toda la carta, el coste de producto ronda el 32 % de las ventas, unos 14.400 euros al mes: la comida, en torno al 29 % según el escandallo, supone unas tres cuartas partes de las ventas; la bebida, cuyo coste ronda el 34,5 % (Tourinews, 2025), el resto, y a eso se suma la merma. Los consumibles (papel térmico, envases, productos de limpieza) se cuentan aparte, en la tabla 15. Las compras se hacen dos veces por semana en el </w:t>
       </w:r>
       <w:r>
         <w:rPr>
@@ -12852,7 +13539,7 @@
                 <w:sz w:val="19"/>
                 <w:szCs w:val="19"/>
               </w:rPr>
-              <w:t>Cartón y papel; sin plástico de un solo uso (Ley 7/2022)</w:t>
+              <w:t>Cartón sin plástico, que evita el coste repercutido del impuesto y el cobro aparte al cliente (Ley 7/2022)</w:t>
             </w:r>
           </w:p>
         </w:tc>
@@ -12865,6 +13552,80 @@
           <w:tcPr>
             <w:tcW w:w="2400" w:type="dxa"/>
             <w:tcBorders>
+              <w:bottom w:val="single" w:sz="2" w:space="0" w:color="DDDDDD"/>
+            </w:tcBorders>
+          </w:tcPr>
+          <w:p>
+            <w:pPr>
+              <w:pStyle w:val="Normal"/>
+              <w:spacing w:lineRule="auto" w:line="252" w:before="0" w:after="0"/>
+              <w:ind w:hanging="0"/>
+              <w:rPr/>
+            </w:pPr>
+            <w:r>
+              <w:rPr>
+                <w:sz w:val="19"/>
+                <w:szCs w:val="19"/>
+              </w:rPr>
+              <w:t>Prevención de riesgos y APPCC</w:t>
+            </w:r>
+          </w:p>
+        </w:tc>
+        <w:tc>
+          <w:tcPr>
+            <w:tcW w:w="1699" w:type="dxa"/>
+            <w:tcBorders>
+              <w:bottom w:val="single" w:sz="2" w:space="0" w:color="DDDDDD"/>
+            </w:tcBorders>
+          </w:tcPr>
+          <w:p>
+            <w:pPr>
+              <w:pStyle w:val="Normal"/>
+              <w:spacing w:lineRule="auto" w:line="252" w:before="0" w:after="0"/>
+              <w:ind w:hanging="0"/>
+              <w:rPr/>
+            </w:pPr>
+            <w:r>
+              <w:rPr>
+                <w:sz w:val="19"/>
+                <w:szCs w:val="19"/>
+              </w:rPr>
+              <w:t>60 €</w:t>
+            </w:r>
+          </w:p>
+        </w:tc>
+        <w:tc>
+          <w:tcPr>
+            <w:tcW w:w="4927" w:type="dxa"/>
+            <w:tcBorders>
+              <w:bottom w:val="single" w:sz="2" w:space="0" w:color="DDDDDD"/>
+            </w:tcBorders>
+          </w:tcPr>
+          <w:p>
+            <w:pPr>
+              <w:pStyle w:val="Normal"/>
+              <w:spacing w:lineRule="auto" w:line="252" w:before="0" w:after="0"/>
+              <w:ind w:hanging="0"/>
+              <w:rPr/>
+            </w:pPr>
+            <w:r>
+              <w:rPr>
+                <w:sz w:val="19"/>
+                <w:szCs w:val="19"/>
+              </w:rPr>
+              <w:t>Servicio de prevención ajeno, reconocimientos médicos, plan de autocontrol y formación de manipuladores</w:t>
+            </w:r>
+          </w:p>
+        </w:tc>
+      </w:tr>
+      <w:tr>
+        <w:trPr>
+          <w:cantSplit w:val="true"/>
+        </w:trPr>
+        <w:tc>
+          <w:tcPr>
+            <w:tcW w:w="2400" w:type="dxa"/>
+            <w:tcBorders>
               <w:bottom w:val="single" w:sz="6" w:space="0" w:color="808080"/>
             </w:tcBorders>
           </w:tcPr>
@@ -12903,7 +13664,7 @@
                 <w:sz w:val="19"/>
                 <w:szCs w:val="19"/>
               </w:rPr>
-              <w:t>3.600 €</w:t>
+              <w:t>3.660 €</w:t>
             </w:r>
           </w:p>
         </w:tc>
@@ -12961,7 +13722,7 @@
         <w:pStyle w:val="Heading2"/>
         <w:rPr/>
       </w:pPr>
-      <w:bookmarkStart w:id="16" w:name="__RefHeading___Toc1990_3382994897"/>
+      <w:bookmarkStart w:id="16" w:name="__RefHeading___Toc2123_2846471793"/>
       <w:bookmarkEnd w:id="16"/>
       <w:r>
         <w:rPr/>
@@ -12975,7 +13736,7 @@
       </w:pPr>
       <w:r>
         <w:rPr/>
-        <w:t>Burglar King no es propietaria de su local: lo alquila. El mercado de locales comerciales de Burjassot es asequible en comparación con València ciudad. Fotocasa publica 35 locales en alquiler en el municipio (Fotocasa, 2026) y los anuncios sitúan el alquiler entre 3 y 14 euros por metro cuadrado al mes, con una media de 7,05 euros en idealista (idealista, 2026): los locales pequeños en las zonas más comerciales (Concòrdia, L'Eixereta, el entorno de la estación de metro) están entre 9 y 13 euros por metro cuadrado, y los grandes, de más de 200 metros, bajan a 3-6 euros (tabla 16). Son precios de oferta, no de cierre, y conviene tomarlos como orientación.</w:t>
+        <w:t>Burglar King no es propietaria de su local: lo alquila. El mercado de locales comerciales de Burjassot es asequible en comparación con València ciudad. Fotocasa publica 35 locales en alquiler en el municipio (Fotocasa, 2026) y los anuncios de la tabla 16 sitúan el alquiler entre 4 y 14 euros por metro cuadrado al mes, con una media de 7,05 euros en idealista (idealista, 2026): los locales pequeños junto al campus y en L'Eixereta superan los 13 euros por metro cuadrado, los de 65 a 150 metros se mueven entre 6,85 y 8,02 euros, y el único de más de 200 metros se anuncia a 4,46 euros. Son precios de oferta, no de cierre, y conviene tomarlos como orientación.</w:t>
       </w:r>
     </w:p>
     <w:p>
@@ -13609,7 +14370,7 @@
                 <w:sz w:val="19"/>
                 <w:szCs w:val="19"/>
               </w:rPr>
-              <w:t>500 €</w:t>
+              <w:t>1.950 €</w:t>
             </w:r>
           </w:p>
         </w:tc>
@@ -13632,7 +14393,7 @@
                 <w:sz w:val="19"/>
                 <w:szCs w:val="19"/>
               </w:rPr>
-              <w:t>2,78 €</w:t>
+              <w:t>10,83 €</w:t>
             </w:r>
           </w:p>
         </w:tc>
@@ -14282,7 +15043,7 @@
           <w:sz w:val="20"/>
           <w:szCs w:val="20"/>
         </w:rPr>
-        <w:t xml:space="preserve"> Anuncios consultados el 15 de octubre de 2026 en los portales citados; el alquiler mensual de los dos primeros se ha calculado a partir del precio unitario publicado, y el precio por metro de los de Fotocasa a partir del alquiler publicado.</w:t>
+        <w:t xml:space="preserve"> Anuncios consultados el 15 de octubre de 2026 en los portales citados; el alquiler mensual de los dos primeros se ha calculado a partir del precio unitario publicado, y el precio por metro de los de Fotocasa a partir del alquiler publicado. El anuncio de 180 m² de L'Eixereta se revisó el 22 de octubre de 2026.</w:t>
       </w:r>
     </w:p>
     <w:p>
@@ -14292,7 +15053,7 @@
       </w:pPr>
       <w:r>
         <w:rPr/>
-        <w:t>El local de Burglar King, de 120 metros cuadrados en planta baja con salida de humos ya instalada, se alquila por 1.000 euros mensuales más IVA, unos 8,30 euros por metro cuadrado, en la media de la zona. Supone el 2 % de las ventas, muy por debajo del 10 % que las guías del sector consideran el límite (Hostelería Madrid, s.f.). El contrato es de arrendamiento para uso distinto de vivienda, regulado por la Ley 29/1994 de Arrendamientos Urbanos, con una duración pactada de diez años, actualización anual con el IPC y una fianza de dos mensualidades, como exige su artículo 36. A ello se suman las obligaciones municipales: la licencia de actividad y apertura, la tasa de ocupación de la vía pública por las cuatro mesas de terraza y el impuesto de bienes inmuebles, que el contrato repercute al inquilino; en conjunto, unos 400 euros al mes.</w:t>
+        <w:t>El local de Burglar King, de 120 metros cuadrados en planta baja con salida de humos ya instalada, se alquila por 1.000 euros mensuales más IVA, unos 8,33 euros por metro cuadrado: algo por encima de la media de idealista (7,05 euros) y de la mediana de la muestra (7,78 euros), lo que se explica por la salida de humos ya instalada. Supone el 2 % de las ventas, por debajo del 5 % que una guía considera ideal (Tourinews, 2025) y del 10 % que otra fija como límite (Hostelería Madrid, s.f.). El contrato es de arrendamiento para uso distinto de vivienda, regulado por la Ley 29/1994 de Arrendamientos Urbanos, con una duración pactada de diez años, actualización anual con el IPC y una fianza de dos mensualidades, como exige su artículo 36. A ello se suman las obligaciones municipales: la licencia de actividad y apertura, la tasa de ocupación de la vía pública por las cuatro mesas de terraza el impuesto de bienes inmuebles, que el contrato repercute al inquilino, y la tasa municipal de residuos; en conjunto, unos 400 euros al mes.</w:t>
       </w:r>
     </w:p>
     <w:p>
@@ -14313,7 +15074,7 @@
         <w:pStyle w:val="Heading1"/>
         <w:rPr/>
       </w:pPr>
-      <w:bookmarkStart w:id="17" w:name="__RefHeading___Toc1992_3382994897"/>
+      <w:bookmarkStart w:id="17" w:name="__RefHeading___Toc2125_2846471793"/>
       <w:bookmarkEnd w:id="17"/>
       <w:r>
         <w:rPr/>
@@ -15517,7 +16278,7 @@
       </w:pPr>
       <w:r>
         <w:rPr/>
-        <w:t>Las plataformas de reparto merecen un comentario aparte, porque son a la vez un canal de venta y un coste. Cobran entre el 15 % y el 30 % del importe de cada pedido, a veces con cuotas fijas, y el mercado está concentrado en Glovo, Uber Eats y Just Eat (Qamarero, 2025). Con 8.250 euros de ventas mensuales por reparto, Burglar King paga unos 2.100 euros de comisiones, el doble que el alquiler del local. Es una de las razones para potenciar el pedido para llevar directo, sin intermediario, que el proyecto facilitará con la carta del cliente en su propio teléfono.</w:t>
+        <w:t>Las plataformas de reparto merecen un comentario aparte, porque son a la vez un canal de venta y un coste. Cobran entre el 15 % y el 35 % del importe de cada pedido, más IVA y a veces con cuotas fijas, y del 25 % al 35 % cuando el reparto corre a cargo de la plataforma; el mercado está concentrado en Glovo, Uber Eats y Just Eat (Qamarero, 2025). Con 8.250 euros de ventas mensuales por reparto y una comisión del 25 %, Burglar King paga unos 2.100 euros, el doble que el alquiler del local; al 30 % serían unos 2.475 euros y al 35 %, unos 2.890. Después de la materia prima, la comisión y los envases, el reparto deja cada mes unos 3.000 euros de margen, el 36 % de sus ventas, frente a más del 60 % del consumo en el local. Por eso conviene potenciar el pedido para llevar directo, sin intermediario, que el proyecto facilitará con la carta del cliente en su propio teléfono, aunque sin dar por hecho que todo el pedido a domicilio pasaría a recogida: parte de esa demanda existe porque la plataforma lleva la comida a casa. Al vender por el móvil, el local pasa a ser prestador de servicios de la sociedad de la información: la carta digital necesitará aviso legal (artículo 10 de la Ley 34/2002), política de privacidad, cookies solo técnicas o con consentimiento (artículo 22.2) y el precio final con IVA antes de confirmar el pedido.</w:t>
       </w:r>
       <w:r>
         <w:br w:type="page"/>
@@ -15528,7 +16289,7 @@
         <w:pStyle w:val="Heading1"/>
         <w:rPr/>
       </w:pPr>
-      <w:bookmarkStart w:id="18" w:name="__RefHeading___Toc1994_3382994897"/>
+      <w:bookmarkStart w:id="18" w:name="__RefHeading___Toc2127_2846471793"/>
       <w:bookmarkEnd w:id="18"/>
       <w:r>
         <w:rPr/>
@@ -15542,7 +16303,7 @@
       </w:pPr>
       <w:r>
         <w:rPr/>
-        <w:t>Con un presupuesto de unos 450 euros al mes, el 1 % de las ventas, Burglar King no puede hacer publicidad tradicional. Su marketing se apoya en lo que decide de verdad al cliente joven: la reputación en línea y el boca a boca. Según el estudio de TheFork de julio de 2026, el 62 % de los españoles descarta un restaurante por una mala reseña, el 73 % lee las opiniones de otros comensales y el 75 % mira la carta antes de ir, mientras que las redes sociales y la web del local solo influyen en el 17 % (L'Express Franchise, 2026). La prioridad, por tanto, es el perfil de Google y la carta, y después las redes.</w:t>
+        <w:t>Con un presupuesto de unos 450 euros al mes, el 1 % de las ventas, Burglar King no puede hacer publicidad tradicional. Su marketing se apoya en lo que decide de verdad al cliente joven: la reputación en línea y el boca a boca. Según el estudio de TheFork de julio de 2026, el 62 % de los españoles descarta un restaurante por una mala reseña, el 73 % lee las opiniones de otros comensales y el 75 % mira la carta antes de ir, mientras que las redes sociales y la web del local solo influyen en el 17 % (L'Express Franchise, 2026a). La prioridad, por tanto, es el perfil de Google y la carta, y después las redes. El público principal son los estudiantes del campus (el 45 % de las ventas, tabla 7) y el secundario, las familias del barrio; frente a las cadenas de los centros comerciales, Burglar King se presenta como la hamburguesería de barrio con producto cuidado a precio de estudiante, con un menú de mediodía a precio cerrado y descuento con el carné.</w:t>
       </w:r>
     </w:p>
     <w:p>
@@ -16264,7 +17025,7 @@
                 <w:sz w:val="19"/>
                 <w:szCs w:val="19"/>
               </w:rPr>
-              <w:t>Incluido en descuentos</w:t>
+              <w:t>Dentro de los 150 € de descuentos (unos 20 canjes al mes)</w:t>
             </w:r>
           </w:p>
         </w:tc>
@@ -16361,7 +17122,7 @@
                 <w:sz w:val="19"/>
                 <w:szCs w:val="19"/>
               </w:rPr>
-              <w:t>Variable</w:t>
+              <w:t>0 € (pizarra y cartel propios; colaboración en especie)</w:t>
             </w:r>
           </w:p>
         </w:tc>
@@ -16411,7 +17172,7 @@
           <w:sz w:val="20"/>
           <w:szCs w:val="20"/>
         </w:rPr>
-        <w:t xml:space="preserve"> Elaboración propia.</w:t>
+        <w:t xml:space="preserve"> Elaboración propia. Los descuentos (menú universitario y fidelización, 150 € en total) reducen ingresos; se cuentan aquí para ver el coste completo del plan. Cada indicador se revisa cada seis meses; los de pedidos directos y fidelización solo podrán medirse cuando el nuevo TPV esté en marcha.</w:t>
       </w:r>
     </w:p>
     <w:p>
@@ -16432,7 +17193,7 @@
         <w:pStyle w:val="Heading1"/>
         <w:rPr/>
       </w:pPr>
-      <w:bookmarkStart w:id="19" w:name="__RefHeading___Toc1996_3382994897"/>
+      <w:bookmarkStart w:id="19" w:name="__RefHeading___Toc2129_2846471793"/>
       <w:bookmarkEnd w:id="19"/>
       <w:r>
         <w:rPr/>
@@ -16446,7 +17207,7 @@
       </w:pPr>
       <w:r>
         <w:rPr/>
-        <w:t>Burglar King es una hamburguesería de barrio en Burjassot, con trece mesas, cuatro personas y unas ventas de unos 45.000 euros mensuales sin IVA. Pertenece a la restauración independiente, que agrupa al 93 % de los locales del país, y opera en el sector que más empleo crea en España y uno de los que menos margen deja: la rentabilidad de la restauración fue negativa en 2025. Su empresa de referencia, Hundred Burgers, muestra que una hamburguesería valenciana puede crecer con carta corta, buen producto y un flujo de pedido digital; el caso de Goiko muestra lo rápido que se deshace un negocio de hamburguesas cuando el consumo cae y los costes no.</w:t>
+        <w:t>Burglar King es una hamburguesería de barrio en Burjassot, con trece mesas, seis personas y unas ventas de unos 45.000 euros mensuales sin IVA. Pertenece a la restauración independiente, que agrupa en torno al 93 % de los locales del país, y opera en un sector que da empleo a 1,89 millones de personas, el 8,6 % del total, y cuya rentabilidad en la restauración cayó en 2025, mientras la inflación repuntaba en 2026. Su empresa de referencia, Hundred Burgers, muestra que una hamburguesería valenciana puede crecer con carta corta, buen producto y una expansión selectiva; el caso de Goiko, el riesgo de crecer deprisa con costes altos cuando bajan las ventas.</w:t>
       </w:r>
     </w:p>
     <w:p>
@@ -16456,7 +17217,7 @@
       </w:pPr>
       <w:r>
         <w:rPr/>
-        <w:t>Las cifras del modelo de negocio son coherentes con los ratios del sector: la materia prima supone el 32 % de las ventas, el personal el 33 %, el alquiler el 2 % y los suministros el 8 %, lo que deja un resultado antes de impuestos del 16 %. Los salarios parten del convenio provincial de hostelería, en ultraactividad desde enero de 2026, pero el local paga por encima de él (2.000 euros brutos el que menos cobra), y la cotización empresarial añade un 32 % al bruto; el alquiler, de 1.000 euros por 120 metros cuadrados, está en la media del mercado de Burjassot. Las comisiones de las plataformas de reparto, unos 2.100 euros al mes, son el coste que más margen tiene de reducirse. La financiación del proyecto tecnológico, de entre 5.000 y 8.000 euros, puede cubrirse con tesorería propia y, si hace falta, con un microcrédito de MicroBank; el Kit Digital ya no existe y las ayudas autonómicas no se darán por hechas.</w:t>
+        <w:t>Las cifras del modelo de negocio están construidas con las referencias del sector, pero son optimistas: la materia prima supone el 32 % de las ventas y el personal el 33 %, dentro de lo habitual, mientras que el alquiler (2 %) y los gastos generales quedan en la parte baja, de modo que el EBITDA (18 %) supera el 10-13 % de un restaurante eficiente y las ventas por persona superan las de Goiko. Aun así, el punto muerto, unos 32.400 euros al mes, deja un margen de seguridad del 28 %. Los salarios parten del convenio provincial de hostelería, en ultraactividad desde enero de 2026, y el local paga un 15 % por encima; la cotización empresarial añade un 32 % al bruto. El alquiler, de 1.000 euros por 120 metros cuadrados, está algo por encima de la media de Burjassot. Las comisiones de las plataformas de reparto, unos 2.100 euros al mes, son el coste con más margen de mejora, siempre que el pedido directo conserve la demanda. La financiación del proyecto tecnológico, de entre 5.000 y 8.000 euros, puede cubrirse con tesorería propia, empezando por la facturación adaptada a Verifactu antes de que acabe 2026; el Kit Digital ya no existe y la Digitaliza-CV no encaja con el proyecto.</w:t>
       </w:r>
     </w:p>
     <w:p>
@@ -16466,7 +17227,7 @@
       </w:pPr>
       <w:r>
         <w:rPr/>
-        <w:t>El entorno añade urgencia y oportunidad. Verifactu fija una fecha, el 1 de enero de 2027, a partir de la cual el sistema de facturación actual dejará de ser legal para una sociedad. El fin del soporte de Windows 10 obliga a renovar el puesto de caja en cualquier caso. Y el cliente decide dónde comer mirando las reseñas y la carta en el teléfono, de modo que la reputación en línea es parte del producto. Lo que le falta a la empresa no es dinero, sino alguien que diseñe su infraestructura y la deje funcionando sola: una red separada de la de los clientes, un servidor con copias, cuentas individuales y, sobre todo, que la comanda llegue a la cocina en pantalla y el pedido de reparto no se copie a mano. Ese es el proyecto que este informe deja planteado.</w:t>
+        <w:t>El entorno añade urgencia y oportunidad. Verifactu fija una fecha, el 1 de enero de 2027, a partir de la cual el sistema de facturación actual dejará de ser legal para una sociedad. El fin del soporte de Windows 10 obliga a renovar el puesto de caja en cualquier caso. Y el cliente decide dónde comer mirando las reseñas y la carta en el teléfono, de modo que la reputación en línea es parte del producto. Además, la empresa tiene tareas legales pendientes que no dependen del proyecto: el cartel y la seguridad de la videovigilancia, el registro de las actividades de tratamiento de datos, el plan de autocontrol alimentario y la prevención de riesgos laborales. Lo que le falta a la empresa no es dinero, sino alguien que diseñe su infraestructura y la deje funcionando sola: una red separada de la de los clientes, un servidor con copias, cuentas individuales y, sobre todo, que la comanda llegue a la cocina en pantalla y el pedido de reparto no se copie a mano. Ese es el proyecto que este informe deja planteado.</w:t>
       </w:r>
       <w:r>
         <w:br w:type="page"/>
@@ -16477,7 +17238,7 @@
         <w:pStyle w:val="Heading1"/>
         <w:rPr/>
       </w:pPr>
-      <w:bookmarkStart w:id="20" w:name="__RefHeading___Toc1998_3382994897"/>
+      <w:bookmarkStart w:id="20" w:name="__RefHeading___Toc2131_2846471793"/>
       <w:bookmarkEnd w:id="20"/>
       <w:r>
         <w:rPr/>
@@ -16558,6 +17319,28 @@
       </w:pPr>
       <w:r>
         <w:rPr/>
+        <w:t xml:space="preserve">Digitaliza CV. (2026). </w:t>
+      </w:r>
+      <w:r>
+        <w:rPr>
+          <w:i/>
+          <w:iCs/>
+        </w:rPr>
+        <w:t>Convocatoria Digitaliza CV 2026</w:t>
+      </w:r>
+      <w:r>
+        <w:rPr/>
+        <w:t>. https://digitalizacv.es/convocatoria-digitaliza-cv-2026/</w:t>
+      </w:r>
+    </w:p>
+    <w:p>
+      <w:pPr>
+        <w:pStyle w:val="Normal"/>
+        <w:ind w:hanging="720" w:left="720"/>
+        <w:rPr/>
+      </w:pPr>
+      <w:r>
+        <w:rPr/>
         <w:t xml:space="preserve">Economía 3. (2024, 3 de diciembre). </w:t>
       </w:r>
       <w:r>
@@ -16954,7 +17737,7 @@
       </w:pPr>
       <w:r>
         <w:rPr/>
-        <w:t xml:space="preserve">Instituto Nacional de Estadística. (2025b). </w:t>
+        <w:t xml:space="preserve">Instituto Nacional de Estadística. (2025b, 22 de octubre). </w:t>
       </w:r>
       <w:r>
         <w:rPr>
@@ -16976,7 +17759,29 @@
       </w:pPr>
       <w:r>
         <w:rPr/>
-        <w:t xml:space="preserve">L'Express Franchise. (2026, 15 de julio). </w:t>
+        <w:t xml:space="preserve">Instituto Nacional de Estadística. (2026, 14 de octubre). </w:t>
+      </w:r>
+      <w:r>
+        <w:rPr>
+          <w:i/>
+          <w:iCs/>
+        </w:rPr>
+        <w:t>Índice de Precios de Consumo (IPC). Septiembre de 2026</w:t>
+      </w:r>
+      <w:r>
+        <w:rPr/>
+        <w:t xml:space="preserve"> [Nota de prensa]. https://www.ine.es/dyngs/Prensa/IPC0926.htm</w:t>
+      </w:r>
+    </w:p>
+    <w:p>
+      <w:pPr>
+        <w:pStyle w:val="Normal"/>
+        <w:ind w:hanging="720" w:left="720"/>
+        <w:rPr/>
+      </w:pPr>
+      <w:r>
+        <w:rPr/>
+        <w:t xml:space="preserve">L'Express Franchise. (2026a, 15 de julio). </w:t>
       </w:r>
       <w:r>
         <w:rPr>
@@ -16998,7 +17803,29 @@
       </w:pPr>
       <w:r>
         <w:rPr/>
-        <w:t xml:space="preserve">Ley 11/2021, de 9 de julio, de medidas de prevención y lucha contra el fraude fiscal. </w:t>
+        <w:t xml:space="preserve">L'Express Franchise. (2026b, 2 de septiembre). </w:t>
+      </w:r>
+      <w:r>
+        <w:rPr>
+          <w:i/>
+          <w:iCs/>
+        </w:rPr>
+        <w:t>Goiko aumenta sus pérdidas hasta los 36,4 millones de euros</w:t>
+      </w:r>
+      <w:r>
+        <w:rPr/>
+        <w:t>. https://lexpress-franchise.com/es/ultimas-noticias/goiko-dispara-perdidas-36-millones/</w:t>
+      </w:r>
+    </w:p>
+    <w:p>
+      <w:pPr>
+        <w:pStyle w:val="Normal"/>
+        <w:ind w:hanging="720" w:left="720"/>
+        <w:rPr/>
+      </w:pPr>
+      <w:r>
+        <w:rPr/>
+        <w:t xml:space="preserve">Ley 1/2025, de 1 de abril, de prevención de las pérdidas y el desperdicio alimentario. </w:t>
       </w:r>
       <w:r>
         <w:rPr>
@@ -17009,7 +17836,7 @@
       </w:r>
       <w:r>
         <w:rPr/>
-        <w:t>, 164. https://www.boe.es/buscar/act.php?id=BOE-A-2021-11473</w:t>
+        <w:t>, 2 de abril de 2025.</w:t>
       </w:r>
     </w:p>
     <w:p>
@@ -17020,7 +17847,7 @@
       </w:pPr>
       <w:r>
         <w:rPr/>
-        <w:t xml:space="preserve">Ley 29/1994, de 24 de noviembre, de Arrendamientos Urbanos. </w:t>
+        <w:t xml:space="preserve">Ley 11/2021, de 9 de julio, de medidas de prevención y lucha contra el fraude fiscal. </w:t>
       </w:r>
       <w:r>
         <w:rPr>
@@ -17031,7 +17858,7 @@
       </w:r>
       <w:r>
         <w:rPr/>
-        <w:t>, 282. https://www.boe.es/buscar/act.php?id=BOE-A-1994-26003</w:t>
+        <w:t>, 164. https://www.boe.es/buscar/act.php?id=BOE-A-2021-11473</w:t>
       </w:r>
     </w:p>
     <w:p>
@@ -17042,7 +17869,7 @@
       </w:pPr>
       <w:r>
         <w:rPr/>
-        <w:t xml:space="preserve">Ley 37/1992, de 28 de diciembre, del Impuesto sobre el Valor Añadido. </w:t>
+        <w:t xml:space="preserve">Ley 27/2014, de 27 de noviembre, del Impuesto sobre Sociedades. </w:t>
       </w:r>
       <w:r>
         <w:rPr>
@@ -17053,7 +17880,7 @@
       </w:r>
       <w:r>
         <w:rPr/>
-        <w:t>, 312. https://www.boe.es/buscar/act.php?id=BOE-A-1992-28740</w:t>
+        <w:t>, 288. https://www.boe.es/buscar/act.php?id=BOE-A-2014-12328</w:t>
       </w:r>
     </w:p>
     <w:p>
@@ -17064,7 +17891,7 @@
       </w:pPr>
       <w:r>
         <w:rPr/>
-        <w:t xml:space="preserve">Ley 7/2022, de 8 de abril, de residuos y suelos contaminados para una economía circular. </w:t>
+        <w:t xml:space="preserve">Ley 28/2005, de 26 de diciembre, de medidas sanitarias frente al tabaquismo y reguladora de la venta, el suministro, el consumo y la publicidad de los productos del tabaco. </w:t>
       </w:r>
       <w:r>
         <w:rPr>
@@ -17075,7 +17902,7 @@
       </w:r>
       <w:r>
         <w:rPr/>
-        <w:t>, 85. https://www.boe.es/buscar/act.php?id=BOE-A-2022-5809</w:t>
+        <w:t>, 309. https://www.boe.es/buscar/act.php?id=BOE-A-2005-21261</w:t>
       </w:r>
     </w:p>
     <w:p>
@@ -17086,7 +17913,7 @@
       </w:pPr>
       <w:r>
         <w:rPr/>
-        <w:t xml:space="preserve">Ley 7/2024, de 20 de diciembre, por la que se establecen un Impuesto Complementario y otras medidas tributarias, entre ellas el tipo reducido del Impuesto sobre Sociedades para microempresas. </w:t>
+        <w:t xml:space="preserve">Ley 29/1994, de 24 de noviembre, de Arrendamientos Urbanos. </w:t>
       </w:r>
       <w:r>
         <w:rPr>
@@ -17097,7 +17924,7 @@
       </w:r>
       <w:r>
         <w:rPr/>
-        <w:t>, 307. https://www.boe.es/buscar/act.php?id=BOE-A-2024-26694</w:t>
+        <w:t>, 282. https://www.boe.es/buscar/act.php?id=BOE-A-1994-26003</w:t>
       </w:r>
     </w:p>
     <w:p>
@@ -17108,7 +17935,7 @@
       </w:pPr>
       <w:r>
         <w:rPr/>
-        <w:t xml:space="preserve">Ley Orgánica 3/2018, de 5 de diciembre, de Protección de Datos Personales y garantía de los derechos digitales. </w:t>
+        <w:t xml:space="preserve">Ley 31/1995, de 8 de noviembre, de prevención de Riesgos Laborales. </w:t>
       </w:r>
       <w:r>
         <w:rPr>
@@ -17119,6 +17946,138 @@
       </w:r>
       <w:r>
         <w:rPr/>
+        <w:t>, 269. https://www.boe.es/buscar/act.php?id=BOE-A-1995-24292</w:t>
+      </w:r>
+    </w:p>
+    <w:p>
+      <w:pPr>
+        <w:pStyle w:val="Normal"/>
+        <w:ind w:hanging="720" w:left="720"/>
+        <w:rPr/>
+      </w:pPr>
+      <w:r>
+        <w:rPr/>
+        <w:t xml:space="preserve">Ley 34/2002, de 11 de julio, de servicios de la sociedad de la información y de comercio electrónico. </w:t>
+      </w:r>
+      <w:r>
+        <w:rPr>
+          <w:i/>
+          <w:iCs/>
+        </w:rPr>
+        <w:t>BOE</w:t>
+      </w:r>
+      <w:r>
+        <w:rPr/>
+        <w:t>, 166. https://www.boe.es/buscar/act.php?id=BOE-A-2002-13758</w:t>
+      </w:r>
+    </w:p>
+    <w:p>
+      <w:pPr>
+        <w:pStyle w:val="Normal"/>
+        <w:ind w:hanging="720" w:left="720"/>
+        <w:rPr/>
+      </w:pPr>
+      <w:r>
+        <w:rPr/>
+        <w:t xml:space="preserve">Ley 37/1992, de 28 de diciembre, del Impuesto sobre el Valor Añadido. </w:t>
+      </w:r>
+      <w:r>
+        <w:rPr>
+          <w:i/>
+          <w:iCs/>
+        </w:rPr>
+        <w:t>BOE</w:t>
+      </w:r>
+      <w:r>
+        <w:rPr/>
+        <w:t>, 312. https://www.boe.es/buscar/act.php?id=BOE-A-1992-28740</w:t>
+      </w:r>
+    </w:p>
+    <w:p>
+      <w:pPr>
+        <w:pStyle w:val="Normal"/>
+        <w:ind w:hanging="720" w:left="720"/>
+        <w:rPr/>
+      </w:pPr>
+      <w:r>
+        <w:rPr/>
+        <w:t xml:space="preserve">Ley 58/2003, de 17 de diciembre, General Tributaria. </w:t>
+      </w:r>
+      <w:r>
+        <w:rPr>
+          <w:i/>
+          <w:iCs/>
+        </w:rPr>
+        <w:t>BOE</w:t>
+      </w:r>
+      <w:r>
+        <w:rPr/>
+        <w:t>, 302. https://www.boe.es/buscar/act.php?id=BOE-A-2003-23186</w:t>
+      </w:r>
+    </w:p>
+    <w:p>
+      <w:pPr>
+        <w:pStyle w:val="Normal"/>
+        <w:ind w:hanging="720" w:left="720"/>
+        <w:rPr/>
+      </w:pPr>
+      <w:r>
+        <w:rPr/>
+        <w:t xml:space="preserve">Ley 7/2022, de 8 de abril, de residuos y suelos contaminados para una economía circular. </w:t>
+      </w:r>
+      <w:r>
+        <w:rPr>
+          <w:i/>
+          <w:iCs/>
+        </w:rPr>
+        <w:t>BOE</w:t>
+      </w:r>
+      <w:r>
+        <w:rPr/>
+        <w:t>, 85. https://www.boe.es/buscar/act.php?id=BOE-A-2022-5809</w:t>
+      </w:r>
+    </w:p>
+    <w:p>
+      <w:pPr>
+        <w:pStyle w:val="Normal"/>
+        <w:ind w:hanging="720" w:left="720"/>
+        <w:rPr/>
+      </w:pPr>
+      <w:r>
+        <w:rPr/>
+        <w:t xml:space="preserve">Ley 7/2024, de 20 de diciembre, por la que se establecen un Impuesto Complementario para garantizar un nivel mínimo global de imposición para los grupos multinacionales y los grupos nacionales de gran magnitud, un Impuesto sobre el margen de intereses y comisiones de determinadas entidades financieras y un Impuesto sobre los líquidos para cigarrillos electrónicos y otros productos relacionados con el tabaco, y se modifican otras normas tributarias. </w:t>
+      </w:r>
+      <w:r>
+        <w:rPr>
+          <w:i/>
+          <w:iCs/>
+        </w:rPr>
+        <w:t>BOE</w:t>
+      </w:r>
+      <w:r>
+        <w:rPr/>
+        <w:t>, 307. https://www.boe.es/buscar/act.php?id=BOE-A-2024-26694</w:t>
+      </w:r>
+    </w:p>
+    <w:p>
+      <w:pPr>
+        <w:pStyle w:val="Normal"/>
+        <w:ind w:hanging="720" w:left="720"/>
+        <w:rPr/>
+      </w:pPr>
+      <w:r>
+        <w:rPr/>
+        <w:t xml:space="preserve">Ley Orgánica 3/2018, de 5 de diciembre, de Protección de Datos Personales y garantía de los derechos digitales. </w:t>
+      </w:r>
+      <w:r>
+        <w:rPr>
+          <w:i/>
+          <w:iCs/>
+        </w:rPr>
+        <w:t>BOE</w:t>
+      </w:r>
+      <w:r>
+        <w:rPr/>
         <w:t>, 294. https://www.boe.es/buscar/act.php?id=BOE-A-2018-16673</w:t>
       </w:r>
     </w:p>
@@ -17328,7 +18287,7 @@
       </w:pPr>
       <w:r>
         <w:rPr/>
-        <w:t xml:space="preserve">Real Decreto Legislativo 2/2015, de 23 de octubre, por el que se aprueba el texto refundido de la Ley del Estatuto de los Trabajadores. </w:t>
+        <w:t xml:space="preserve">Real Decreto 1619/2012, de 30 de noviembre, por el que se aprueba el Reglamento por el que se regulan las obligaciones de facturación. </w:t>
       </w:r>
       <w:r>
         <w:rPr>
@@ -17339,7 +18298,7 @@
       </w:r>
       <w:r>
         <w:rPr/>
-        <w:t>, 255. https://www.boe.es/buscar/act.php?id=BOE-A-2015-11430</w:t>
+        <w:t>, 289. https://www.boe.es/buscar/act.php?id=BOE-A-2012-14696</w:t>
       </w:r>
     </w:p>
     <w:p>
@@ -17350,7 +18309,7 @@
       </w:pPr>
       <w:r>
         <w:rPr/>
-        <w:t xml:space="preserve">Real Decreto-ley 15/2025, de 2 de diciembre, por el que se aplaza la entrada en vigor de los requisitos de los sistemas informáticos de facturación. </w:t>
+        <w:t xml:space="preserve">Real Decreto Legislativo 1/2007, de 16 de noviembre, por el que se aprueba el texto refundido de la Ley General para la Defensa de los Consumidores y Usuarios y otras leyes complementarias. </w:t>
       </w:r>
       <w:r>
         <w:rPr>
@@ -17361,7 +18320,7 @@
       </w:r>
       <w:r>
         <w:rPr/>
-        <w:t>, 3 de diciembre de 2025.</w:t>
+        <w:t>, 287. https://www.boe.es/buscar/act.php?id=BOE-A-2007-20555</w:t>
       </w:r>
     </w:p>
     <w:p>
@@ -17372,7 +18331,51 @@
       </w:pPr>
       <w:r>
         <w:rPr/>
-        <w:t xml:space="preserve">Reglamento (UE) 2016/2235 de la Comisión, de 12 de diciembre de 2016, que modifica el anexo XVII del Reglamento (CE) n.º 1907/2006 en lo que respecta al bisfenol A. </w:t>
+        <w:t xml:space="preserve">Real Decreto Legislativo 2/2015, de 23 de octubre, por el que se aprueba el texto refundido de la Ley del Estatuto de los Trabajadores. </w:t>
+      </w:r>
+      <w:r>
+        <w:rPr>
+          <w:i/>
+          <w:iCs/>
+        </w:rPr>
+        <w:t>BOE</w:t>
+      </w:r>
+      <w:r>
+        <w:rPr/>
+        <w:t>, 255. https://www.boe.es/buscar/act.php?id=BOE-A-2015-11430</w:t>
+      </w:r>
+    </w:p>
+    <w:p>
+      <w:pPr>
+        <w:pStyle w:val="Normal"/>
+        <w:ind w:hanging="720" w:left="720"/>
+        <w:rPr/>
+      </w:pPr>
+      <w:r>
+        <w:rPr/>
+        <w:t xml:space="preserve">Real Decreto-ley 15/2025, de 2 de diciembre, por el que se adoptan medidas urgentes para favorecer la actividad inversora de las entidades locales y de las comunidades autónomas, y por el que se modifica el Real Decreto 1007/2023, de 5 de diciembre, por el que se aprueba el Reglamento que establece los requisitos que deben adoptar los sistemas y programas informáticos o electrónicos que soporten los procesos de facturación de empresarios y profesionales, y la estandarización de formatos de los registros de facturación. </w:t>
+      </w:r>
+      <w:r>
+        <w:rPr>
+          <w:i/>
+          <w:iCs/>
+        </w:rPr>
+        <w:t>BOE</w:t>
+      </w:r>
+      <w:r>
+        <w:rPr/>
+        <w:t>, 290. https://www.boe.es/buscar/act.php?id=BOE-A-2025-24446</w:t>
+      </w:r>
+    </w:p>
+    <w:p>
+      <w:pPr>
+        <w:pStyle w:val="Normal"/>
+        <w:ind w:hanging="720" w:left="720"/>
+        <w:rPr/>
+      </w:pPr>
+      <w:r>
+        <w:rPr/>
+        <w:t xml:space="preserve">Reglamento (CE) n.º 178/2002 del Parlamento Europeo y del Consejo, de 28 de enero de 2002, por el que se establecen los principios y los requisitos generales de la legislación alimentaria, se crea la Autoridad Europea de Seguridad Alimentaria y se fijan procedimientos relativos a la seguridad alimentaria. </w:t>
       </w:r>
       <w:r>
         <w:rPr>
@@ -17383,7 +18386,7 @@
       </w:r>
       <w:r>
         <w:rPr/>
-        <w:t>, L 337. https://eur-lex.europa.eu/legal-content/ES/TXT/?uri=CELEX%3A32016R2235</w:t>
+        <w:t>, L 31. https://eur-lex.europa.eu/legal-content/ES/TXT/?uri=CELEX%3A32002R0178</w:t>
       </w:r>
     </w:p>
     <w:p>
@@ -17394,7 +18397,7 @@
       </w:pPr>
       <w:r>
         <w:rPr/>
-        <w:t xml:space="preserve">Reglamento (UE) 2016/679 del Parlamento Europeo y del Consejo, de 27 de abril de 2016, relativo a la protección de las personas físicas en lo que respecta al tratamiento de datos personales (RGPD). </w:t>
+        <w:t xml:space="preserve">Reglamento (CE) n.º 852/2004 del Parlamento Europeo y del Consejo, de 29 de abril de 2004, relativo a la higiene de los productos alimenticios. </w:t>
       </w:r>
       <w:r>
         <w:rPr>
@@ -17405,7 +18408,73 @@
       </w:r>
       <w:r>
         <w:rPr/>
+        <w:t>, L 139. https://eur-lex.europa.eu/legal-content/ES/TXT/?uri=CELEX%3A32004R0852</w:t>
+      </w:r>
+    </w:p>
+    <w:p>
+      <w:pPr>
+        <w:pStyle w:val="Normal"/>
+        <w:ind w:hanging="720" w:left="720"/>
+        <w:rPr/>
+      </w:pPr>
+      <w:r>
+        <w:rPr/>
+        <w:t xml:space="preserve">Reglamento (UE) 2016/2235 de la Comisión, de 12 de diciembre de 2016, que modifica el anexo XVII del Reglamento (CE) n.º 1907/2006 en lo que respecta al bisfenol A. </w:t>
+      </w:r>
+      <w:r>
+        <w:rPr>
+          <w:i/>
+          <w:iCs/>
+        </w:rPr>
+        <w:t>DOUE</w:t>
+      </w:r>
+      <w:r>
+        <w:rPr/>
+        <w:t>, L 337. https://eur-lex.europa.eu/legal-content/ES/TXT/?uri=CELEX%3A32016R2235</w:t>
+      </w:r>
+    </w:p>
+    <w:p>
+      <w:pPr>
+        <w:pStyle w:val="Normal"/>
+        <w:ind w:hanging="720" w:left="720"/>
+        <w:rPr/>
+      </w:pPr>
+      <w:r>
+        <w:rPr/>
+        <w:t xml:space="preserve">Reglamento (UE) 2016/679 del Parlamento Europeo y del Consejo, de 27 de abril de 2016, relativo a la protección de las personas físicas en lo que respecta al tratamiento de datos personales (RGPD). </w:t>
+      </w:r>
+      <w:r>
+        <w:rPr>
+          <w:i/>
+          <w:iCs/>
+        </w:rPr>
+        <w:t>DOUE</w:t>
+      </w:r>
+      <w:r>
+        <w:rPr/>
         <w:t>, L 119. https://eur-lex.europa.eu/legal-content/ES/TXT/?uri=CELEX%3A32016R0679</w:t>
+      </w:r>
+    </w:p>
+    <w:p>
+      <w:pPr>
+        <w:pStyle w:val="Normal"/>
+        <w:ind w:hanging="720" w:left="720"/>
+        <w:rPr/>
+      </w:pPr>
+      <w:r>
+        <w:rPr/>
+        <w:t xml:space="preserve">Reglamento (UE) 2025/40 del Parlamento Europeo y del Consejo, de 19 de diciembre de 2024, relativo a los envases y residuos de envases. </w:t>
+      </w:r>
+      <w:r>
+        <w:rPr>
+          <w:i/>
+          <w:iCs/>
+        </w:rPr>
+        <w:t>DOUE</w:t>
+      </w:r>
+      <w:r>
+        <w:rPr/>
+        <w:t>, serie L, 22 de enero de 2025. https://eur-lex.europa.eu/legal-content/ES/TXT/?uri=CELEX%3A32025R0040</w:t>
       </w:r>
     </w:p>
     <w:p>
@@ -17567,7 +18636,7 @@
     </w:r>
     <w:r>
       <w:rPr/>
-      <w:t>35</w:t>
+      <w:t>42</w:t>
     </w:r>
     <w:r>
       <w:rPr/>
@@ -17591,7 +18660,7 @@
     </w:r>
     <w:r>
       <w:rPr/>
-      <w:t>35</w:t>
+      <w:t>42</w:t>
     </w:r>
     <w:r>
       <w:rPr/>

</xml_diff>